<commit_message>
Update manuscript and appendix files
Apply updates and reorganize manuscript assets: update Manuscript_Brexit_elasticity.docx; rename Online_appendix.docx to Online_appendix_APA.docx; add Online_appendix_corrected.docx and corrections.docx; rename Sa (2019).pdf to Sa (2014).pdf; add manuscript_final_pass.docx and Word temp file (~$nuscript_final_pass.docx). Changes prepare final/APA-formatted manuscript and appendices.
</commit_message>
<xml_diff>
--- a/Manuscript/Manuscript_Brexit_elasticity.docx
+++ b/Manuscript/Manuscript_Brexit_elasticity.docx
@@ -141,29 +141,15 @@
     <w:p>
       <w:pPr>
         <w:spacing w:line="360" w:lineRule="auto"/>
-        <w:outlineLvl w:val="1"/>
-        <w:rPr>
-          <w:rFonts w:ascii="Times New Roman" w:hAnsi="Times New Roman" w:cs="Times New Roman"/>
-        </w:rPr>
-      </w:pPr>
-      <w:r>
-        <w:rPr>
-          <w:rFonts w:ascii="Times New Roman" w:hAnsi="Times New Roman" w:cs="Times New Roman"/>
-        </w:rPr>
-        <w:t>This paper estimates the price elasticity of EU demand for UK higher education using the Brexit-induced loss of Home Fee status and student-loan access as a quasi-experimental tuition shock. Unlike standard higher-education demand studies that rely on enrolment outcomes, the analysis uses UCAS application data, allowing demand to be observed before admissions rationing by universities. Dynamic difference-in-differences estimates show a large and persistent decline in EU applications after 2021, with no strong evidence of differential pre-trends or anticipation effects. The average post-Brexit treatment effect implies an application decline of roughly 70 percent, with country-specific elasticities varying substantially across the EU. Initial estimates suggest that applicants from lower-income member states were more price elastic, while wealthier countries experienced smaller demand contractions. However, once elasticities are rescaled using country-specific effective price shocks that account for the removal of income-contingent loans, the income gradient collapses and becomes statistically indistinguishable from zero. This indicates that much of the apparent cross-country heterogeneity reflects heterogeneous treatment intensity rather than stable differences in underlying preferences. The findings suggest that the UK student-loan system functioned as an important equalizing institution for European educational mobility, and that its removal transformed a nominally uniform tuition reform into a highly uneven economic shock across EU origin countries.</w:t>
-      </w:r>
-      <w:r>
-        <w:rPr>
-          <w:rFonts w:ascii="Times New Roman" w:hAnsi="Times New Roman" w:cs="Times New Roman"/>
-          <w:lang w:val="bg-BG"/>
-        </w:rPr>
-        <w:t xml:space="preserve"> </w:t>
-      </w:r>
-      <w:r>
-        <w:rPr>
-          <w:rFonts w:ascii="Times New Roman" w:hAnsi="Times New Roman" w:cs="Times New Roman"/>
-        </w:rPr>
-        <w:t xml:space="preserve">The loan-adjusted elasticities are strongly correlated with the percentage of GDP allocated for educational investment. </w:t>
+        <w:rPr>
+          <w:rFonts w:ascii="Times New Roman" w:hAnsi="Times New Roman" w:cs="Times New Roman"/>
+        </w:rPr>
+      </w:pPr>
+      <w:r>
+        <w:rPr>
+          <w:rFonts w:ascii="Times New Roman" w:hAnsi="Times New Roman" w:cs="Times New Roman"/>
+        </w:rPr>
+        <w:t xml:space="preserve">This paper estimates the price elasticity of EU demand for UK higher education using the Brexit-induced loss of Home Fee status and student-loan access as a quasi-experimental tuition shock. Unlike standard higher-education demand studies that rely on enrolment outcomes, the analysis uses UCAS application data, allowing demand to be observed before universities ration admissions.  The average post-Brexit treatment effect implies a decline in applications of roughly 70 percent, with country-specific elasticities varying substantially across the EU. Initial estimates suggest that applicants from lower-income member states were more price elastic, while wealthier countries experienced smaller demand contractions. However, once elasticities are rescaled using country-specific effective price shocks that account for the removal of income-contingent loans, the income gradient collapses and becomes statistically indistinguishable from zero. This indicates that much of the apparent cross-country heterogeneity reflects heterogeneous treatment intensity rather than stable differences in underlying preferences. The findings suggest that the UK student-loan system functioned as an important equalizing institution for European educational mobility, and that its removal transformed a nominally uniform tuition reform into a highly uneven economic shock across EU origin countries. The loan-adjusted elasticities are strongly correlated with the percentage of GDP allocated for educational investment. </w:t>
       </w:r>
     </w:p>
     <w:p>
@@ -236,6 +222,24 @@
         </w:rPr>
         <w:t>Brexit; international student mobility; higher education demand; tuition fees; price elasticity; EU students; UCAS applications; difference-in-differences; synthetic control; income-contingent loans; educational mobility; heterogeneous treatment effects.</w:t>
       </w:r>
+    </w:p>
+    <w:p>
+      <w:pPr>
+        <w:spacing w:line="360" w:lineRule="auto"/>
+        <w:outlineLvl w:val="1"/>
+        <w:rPr>
+          <w:rFonts w:ascii="Times New Roman" w:hAnsi="Times New Roman" w:cs="Times New Roman"/>
+        </w:rPr>
+      </w:pPr>
+    </w:p>
+    <w:p>
+      <w:pPr>
+        <w:spacing w:line="360" w:lineRule="auto"/>
+        <w:outlineLvl w:val="1"/>
+        <w:rPr>
+          <w:rFonts w:ascii="Times New Roman" w:hAnsi="Times New Roman" w:cs="Times New Roman"/>
+        </w:rPr>
+      </w:pPr>
     </w:p>
     <w:p>
       <w:pPr>
@@ -271,6 +275,7 @@
     <w:p>
       <w:pPr>
         <w:spacing w:line="360" w:lineRule="auto"/>
+        <w:ind w:firstLine="360"/>
         <w:outlineLvl w:val="1"/>
         <w:rPr>
           <w:rFonts w:ascii="Times New Roman" w:hAnsi="Times New Roman" w:cs="Times New Roman"/>
@@ -282,137 +287,23 @@
           <w:rFonts w:ascii="Times New Roman" w:hAnsi="Times New Roman" w:cs="Times New Roman"/>
           <w:bCs/>
         </w:rPr>
-        <w:t>International higher-education demand studies often struggle to isolate own-price elasticity because enrollment is an equilibrium outcome, jointly determined by student preferences and capacity-constrained admission decisions (Hoxby, 1997; Bound et al., 2010). Standard demand models using enrollment data conflate the desire to attend with the university's decision to admit. To separate these mechanisms, one requires detailed data on applicant preferences, institutional capacities, and admission rules</w:t>
-      </w:r>
+        <w:t>International higher-education demand studies often struggle to isolate own-price elasticity because elasticity calculations usually rely on enrollment changes in response to price shifts. This approach is problematic because enrollment is an equilibrium outcome, shaped by both student preferences and capacity-constrained admission decisions (</w:t>
+      </w:r>
+      <w:proofErr w:type="spellStart"/>
       <w:r>
         <w:rPr>
           <w:rFonts w:ascii="Times New Roman" w:hAnsi="Times New Roman" w:cs="Times New Roman"/>
           <w:bCs/>
         </w:rPr>
-        <w:t>-</w:t>
-      </w:r>
+        <w:t>Hoxby</w:t>
+      </w:r>
+      <w:proofErr w:type="spellEnd"/>
       <w:r>
         <w:rPr>
           <w:rFonts w:ascii="Times New Roman" w:hAnsi="Times New Roman" w:cs="Times New Roman"/>
           <w:bCs/>
         </w:rPr>
-        <w:t>data that is rarely available.</w:t>
-      </w:r>
-    </w:p>
-    <w:p>
-      <w:pPr>
-        <w:spacing w:line="360" w:lineRule="auto"/>
-        <w:ind w:firstLine="426"/>
-        <w:outlineLvl w:val="1"/>
-        <w:rPr>
-          <w:rFonts w:ascii="Times New Roman" w:hAnsi="Times New Roman" w:cs="Times New Roman"/>
-          <w:bCs/>
-        </w:rPr>
-      </w:pPr>
-      <w:r>
-        <w:rPr>
-          <w:rFonts w:ascii="Times New Roman" w:hAnsi="Times New Roman" w:cs="Times New Roman"/>
-          <w:bCs/>
-        </w:rPr>
-        <w:t xml:space="preserve">In </w:t>
-      </w:r>
-      <w:r>
-        <w:rPr>
-          <w:rFonts w:ascii="Times New Roman" w:hAnsi="Times New Roman" w:cs="Times New Roman"/>
-          <w:bCs/>
-        </w:rPr>
-        <w:t>this paper</w:t>
-      </w:r>
-      <w:r>
-        <w:rPr>
-          <w:rFonts w:ascii="Times New Roman" w:hAnsi="Times New Roman" w:cs="Times New Roman"/>
-          <w:bCs/>
-        </w:rPr>
-        <w:t xml:space="preserve">, </w:t>
-      </w:r>
-      <w:r>
-        <w:rPr>
-          <w:rFonts w:ascii="Times New Roman" w:hAnsi="Times New Roman" w:cs="Times New Roman"/>
-          <w:bCs/>
-        </w:rPr>
-        <w:t xml:space="preserve">we </w:t>
-      </w:r>
-      <w:r>
-        <w:rPr>
-          <w:rFonts w:ascii="Times New Roman" w:hAnsi="Times New Roman" w:cs="Times New Roman"/>
-          <w:bCs/>
-        </w:rPr>
-        <w:t>assume</w:t>
-      </w:r>
-      <w:r>
-        <w:rPr>
-          <w:rFonts w:ascii="Times New Roman" w:hAnsi="Times New Roman" w:cs="Times New Roman"/>
-          <w:bCs/>
-        </w:rPr>
-        <w:t xml:space="preserve"> that </w:t>
-      </w:r>
-      <w:r>
-        <w:rPr>
-          <w:rFonts w:ascii="Times New Roman" w:hAnsi="Times New Roman" w:cs="Times New Roman"/>
-          <w:bCs/>
-        </w:rPr>
-        <w:t>UCAS application data captures expressed demand prior to the administrative rationing of seats</w:t>
-      </w:r>
-      <w:r>
-        <w:rPr>
-          <w:rFonts w:ascii="Times New Roman" w:hAnsi="Times New Roman" w:cs="Times New Roman"/>
-          <w:bCs/>
-        </w:rPr>
-        <w:t xml:space="preserve"> because whether a student will apply for a specific institution through the UCAS portal is independent of how many places the university has made available (the </w:t>
-      </w:r>
-      <w:r>
-        <w:rPr>
-          <w:rFonts w:ascii="Times New Roman" w:hAnsi="Times New Roman" w:cs="Times New Roman"/>
-          <w:bCs/>
-        </w:rPr>
-        <w:t>rationing happens post the event of applying).</w:t>
-      </w:r>
-      <w:r>
-        <w:rPr>
-          <w:rFonts w:ascii="Times New Roman" w:hAnsi="Times New Roman" w:cs="Times New Roman"/>
-          <w:bCs/>
-        </w:rPr>
-        <w:t xml:space="preserve"> </w:t>
-      </w:r>
-      <w:r>
-        <w:rPr>
-          <w:rFonts w:ascii="Times New Roman" w:hAnsi="Times New Roman" w:cs="Times New Roman"/>
-          <w:bCs/>
-        </w:rPr>
-        <w:t>From a comparative perspective, our study exploits cross-country variation</w:t>
-      </w:r>
-      <w:r>
-        <w:rPr>
-          <w:rFonts w:ascii="Times New Roman" w:hAnsi="Times New Roman" w:cs="Times New Roman"/>
-          <w:bCs/>
-        </w:rPr>
-        <w:t xml:space="preserve"> – </w:t>
-      </w:r>
-      <w:r>
-        <w:rPr>
-          <w:rFonts w:ascii="Times New Roman" w:hAnsi="Times New Roman" w:cs="Times New Roman"/>
-          <w:bCs/>
-        </w:rPr>
-        <w:t>rather than the conventional within-country, individual-level variation</w:t>
-      </w:r>
-      <w:r>
-        <w:rPr>
-          <w:rFonts w:ascii="Times New Roman" w:hAnsi="Times New Roman" w:cs="Times New Roman"/>
-          <w:bCs/>
-        </w:rPr>
-        <w:t xml:space="preserve"> – </w:t>
-      </w:r>
-      <w:r>
-        <w:rPr>
-          <w:rFonts w:ascii="Times New Roman" w:hAnsi="Times New Roman" w:cs="Times New Roman"/>
-          <w:bCs/>
-        </w:rPr>
-        <w:t>to estimate international price responsiveness (i.e., demand elasticity).</w:t>
+        <w:t xml:space="preserve">, 1997; Bound et al., 2010). As a result, standard demand models using enrollment data conflate the desire to attend with the university's choice to admit. </w:t>
       </w:r>
     </w:p>
     <w:p>
@@ -420,97 +311,22 @@
         <w:spacing w:line="360" w:lineRule="auto"/>
         <w:ind w:firstLine="360"/>
         <w:outlineLvl w:val="1"/>
-      </w:pPr>
-      <w:r>
         <w:rPr>
           <w:rFonts w:ascii="Times New Roman" w:hAnsi="Times New Roman" w:cs="Times New Roman"/>
           <w:bCs/>
         </w:rPr>
-        <w:t>To further aid identification w</w:t>
-      </w:r>
+      </w:pPr>
       <w:r>
         <w:rPr>
           <w:rFonts w:ascii="Times New Roman" w:hAnsi="Times New Roman" w:cs="Times New Roman"/>
           <w:bCs/>
         </w:rPr>
-        <w:t xml:space="preserve">e </w:t>
-      </w:r>
-      <w:r>
-        <w:rPr>
-          <w:rFonts w:ascii="Times New Roman" w:hAnsi="Times New Roman" w:cs="Times New Roman"/>
-          <w:bCs/>
-        </w:rPr>
-        <w:t>utilize</w:t>
-      </w:r>
-      <w:r>
-        <w:rPr>
-          <w:rFonts w:ascii="Times New Roman" w:hAnsi="Times New Roman" w:cs="Times New Roman"/>
-          <w:bCs/>
-        </w:rPr>
-        <w:t xml:space="preserve"> the exogenous Brexit-induced tuition shock to estimate price elasticities at the origin-country level. Because the loss of Home Fee status and access to loans was a policy shock rather than a strategic pricing decision by universities, it provides a quasi-experimental setting to recover </w:t>
-      </w:r>
-      <w:r>
-        <w:rPr>
-          <w:rFonts w:ascii="Times New Roman" w:hAnsi="Times New Roman" w:cs="Times New Roman"/>
-          <w:bCs/>
-        </w:rPr>
-        <w:t>willingness-to-pay.</w:t>
-      </w:r>
-      <w:r>
-        <w:rPr>
-          <w:rFonts w:ascii="Times New Roman" w:hAnsi="Times New Roman" w:cs="Times New Roman"/>
-          <w:bCs/>
-        </w:rPr>
-        <w:t xml:space="preserve"> </w:t>
-      </w:r>
-      <w:r>
-        <w:rPr>
-          <w:rFonts w:ascii="Times New Roman" w:hAnsi="Times New Roman" w:cs="Times New Roman"/>
-          <w:bCs/>
-        </w:rPr>
-        <w:t xml:space="preserve">The results </w:t>
-      </w:r>
-      <w:r>
-        <w:rPr>
-          <w:rFonts w:ascii="Times New Roman" w:hAnsi="Times New Roman" w:cs="Times New Roman"/>
-        </w:rPr>
-        <w:t>allow</w:t>
-      </w:r>
-      <w:r>
-        <w:rPr>
-          <w:rFonts w:ascii="Times New Roman" w:hAnsi="Times New Roman" w:cs="Times New Roman"/>
-        </w:rPr>
-        <w:t xml:space="preserve"> the reconstruction of </w:t>
-      </w:r>
-      <w:r>
-        <w:rPr>
-          <w:rFonts w:ascii="Times New Roman" w:hAnsi="Times New Roman" w:cs="Times New Roman"/>
-        </w:rPr>
-        <w:t>country specific</w:t>
-      </w:r>
-      <w:r>
-        <w:rPr>
-          <w:rFonts w:ascii="Times New Roman" w:hAnsi="Times New Roman" w:cs="Times New Roman"/>
-        </w:rPr>
-        <w:t xml:space="preserve"> constant-elasticity demand function</w:t>
-      </w:r>
-      <w:r>
-        <w:rPr>
-          <w:rFonts w:ascii="Times New Roman" w:hAnsi="Times New Roman" w:cs="Times New Roman"/>
-        </w:rPr>
-        <w:t>s</w:t>
-      </w:r>
-      <w:r>
-        <w:rPr>
-          <w:rFonts w:ascii="Times New Roman" w:hAnsi="Times New Roman" w:cs="Times New Roman"/>
-        </w:rPr>
-        <w:t xml:space="preserve"> for international applications around the pre-Brexit price level.</w:t>
+        <w:t>In this paper, we assume that UCAS application data captures expressed demand before seats are rationed. Whether a student applies through the UCAS portal does not depend on how many places are available, as rationing occurs after applications are submitted. Our study uses cross-country variation, rather than traditional within-country, individual-level variation, to estimate international price responsiveness (i.e., demand elasticity).</w:t>
       </w:r>
     </w:p>
     <w:p>
       <w:pPr>
         <w:spacing w:line="360" w:lineRule="auto"/>
-        <w:ind w:firstLine="360"/>
         <w:outlineLvl w:val="1"/>
         <w:rPr>
           <w:rFonts w:ascii="Times New Roman" w:hAnsi="Times New Roman" w:cs="Times New Roman"/>
@@ -522,170 +338,78 @@
           <w:rFonts w:ascii="Times New Roman" w:hAnsi="Times New Roman" w:cs="Times New Roman"/>
           <w:bCs/>
         </w:rPr>
-        <w:t>We show that under specific assumptions</w:t>
-      </w:r>
-      <w:r>
-        <w:rPr>
-          <w:rFonts w:ascii="Times New Roman" w:hAnsi="Times New Roman" w:cs="Times New Roman"/>
-          <w:bCs/>
-        </w:rPr>
-        <w:t xml:space="preserve"> applicants from lower-income EU countries exhibit highly elastic responses, significantly reducing their demand in response to the price hike. This heterogeneity implies that while the UK higher education market faced a uniform regulatory shock</w:t>
-      </w:r>
-      <w:r>
-        <w:rPr>
-          <w:rFonts w:ascii="Times New Roman" w:hAnsi="Times New Roman" w:cs="Times New Roman"/>
-          <w:bCs/>
-        </w:rPr>
-        <w:t xml:space="preserve"> it also </w:t>
-      </w:r>
-      <w:r>
-        <w:rPr>
-          <w:rFonts w:ascii="Times New Roman" w:hAnsi="Times New Roman" w:cs="Times New Roman"/>
-          <w:bCs/>
-        </w:rPr>
-        <w:t>effectively filtering out price-sensitive consumers while retaining those with a higher ability to pay.</w:t>
-      </w:r>
-      <w:r>
-        <w:rPr>
-          <w:rFonts w:ascii="Times New Roman" w:hAnsi="Times New Roman" w:cs="Times New Roman"/>
-          <w:bCs/>
-        </w:rPr>
-        <w:t xml:space="preserve"> </w:t>
-      </w:r>
-      <w:r>
-        <w:rPr>
-          <w:rFonts w:ascii="Times New Roman" w:hAnsi="Times New Roman" w:cs="Times New Roman"/>
-          <w:bCs/>
-        </w:rPr>
-        <w:t>However, w</w:t>
-      </w:r>
-      <w:r>
-        <w:rPr>
-          <w:rFonts w:ascii="Times New Roman" w:hAnsi="Times New Roman" w:cs="Times New Roman"/>
-          <w:bCs/>
-        </w:rPr>
-        <w:t xml:space="preserve">e </w:t>
-      </w:r>
-      <w:r>
-        <w:rPr>
-          <w:rFonts w:ascii="Times New Roman" w:hAnsi="Times New Roman" w:cs="Times New Roman"/>
-          <w:bCs/>
-        </w:rPr>
-        <w:t xml:space="preserve">later </w:t>
-      </w:r>
-      <w:r>
-        <w:rPr>
-          <w:rFonts w:ascii="Times New Roman" w:hAnsi="Times New Roman" w:cs="Times New Roman"/>
-          <w:bCs/>
-        </w:rPr>
-        <w:t xml:space="preserve">revisit this </w:t>
-      </w:r>
-      <w:r>
-        <w:rPr>
-          <w:rFonts w:ascii="Times New Roman" w:hAnsi="Times New Roman" w:cs="Times New Roman"/>
-          <w:bCs/>
-        </w:rPr>
-        <w:t>elasticity estimates by adopting a different perspective on credit risk valuation prior to Brexit, showing that much of the observed demand heterogeneity is driven by the structure of the student loan system.</w:t>
-      </w:r>
-      <w:r>
-        <w:rPr>
-          <w:rFonts w:ascii="Times New Roman" w:hAnsi="Times New Roman" w:cs="Times New Roman"/>
-          <w:bCs/>
-        </w:rPr>
-        <w:t xml:space="preserve"> The result is the following set of contributions: </w:t>
+        <w:t>To further clarify causal inference, we utilize the exogenous Brexit-induced tuition shock to estimate price elasticities at the origin-country level. The loss of Home Fee status and access to loans resulted from an external policy change, not a university pricing decision, creating a quasi-experimental setting for inferring willingness-to-pay. This causal design enables us to reconstruct country-specific, constant-elasticity demand functions for international applications around pre-Brexit price levels.</w:t>
       </w:r>
     </w:p>
     <w:p>
       <w:pPr>
-        <w:numPr>
-          <w:ilvl w:val="0"/>
-          <w:numId w:val="36"/>
-        </w:numPr>
         <w:spacing w:line="360" w:lineRule="auto"/>
-        <w:rPr>
-          <w:rFonts w:ascii="Times New Roman" w:eastAsia="Times New Roman" w:hAnsi="Times New Roman" w:cs="Times New Roman"/>
-          <w:kern w:val="0"/>
-          <w14:ligatures w14:val="none"/>
-        </w:rPr>
-      </w:pPr>
-      <w:r>
-        <w:rPr>
-          <w:rFonts w:ascii="Times New Roman" w:eastAsia="Times New Roman" w:hAnsi="Times New Roman" w:cs="Times New Roman"/>
-          <w:kern w:val="0"/>
-          <w14:ligatures w14:val="none"/>
-        </w:rPr>
-        <w:t>Poorer EU economies initially exhibit very high demand elasticities, highlighting the starting variability across member states.</w:t>
+        <w:ind w:firstLine="720"/>
+        <w:outlineLvl w:val="1"/>
+        <w:rPr>
+          <w:rFonts w:ascii="Times New Roman" w:hAnsi="Times New Roman" w:cs="Times New Roman"/>
+          <w:bCs/>
+        </w:rPr>
+      </w:pPr>
+      <w:r>
+        <w:rPr>
+          <w:rFonts w:ascii="Times New Roman" w:hAnsi="Times New Roman" w:cs="Times New Roman"/>
+          <w:bCs/>
+        </w:rPr>
+        <w:t xml:space="preserve">We show that under specific assumptions, applicants from lower-income EU countries exhibit highly elastic responses, significantly reducing their demand in response to the price hike. This heterogeneity implies that, while the UK higher education market faced a uniform regulatory shock, it also effectively filtered out price-sensitive consumers while retaining those with greater ability to pay. However, we later revisit these elasticity estimates by adopting a different perspective on credit risk valuation prior to Brexit, showing that much of the observed demand heterogeneity is driven by the structure of the student loan system itself. The result is the following set of contributions: </w:t>
       </w:r>
     </w:p>
     <w:p>
       <w:pPr>
-        <w:numPr>
-          <w:ilvl w:val="0"/>
-          <w:numId w:val="36"/>
-        </w:numPr>
         <w:spacing w:line="360" w:lineRule="auto"/>
-        <w:rPr>
-          <w:rFonts w:ascii="Times New Roman" w:eastAsia="Times New Roman" w:hAnsi="Times New Roman" w:cs="Times New Roman"/>
-          <w:kern w:val="0"/>
-          <w14:ligatures w14:val="none"/>
-        </w:rPr>
-      </w:pPr>
-      <w:r>
-        <w:rPr>
-          <w:rFonts w:ascii="Times New Roman" w:eastAsia="Times New Roman" w:hAnsi="Times New Roman" w:cs="Times New Roman"/>
-          <w:kern w:val="0"/>
-          <w14:ligatures w14:val="none"/>
-        </w:rPr>
-        <w:t>Those demand elasticities show a strong positive correlation with GDP per capita</w:t>
+        <w:outlineLvl w:val="1"/>
+        <w:rPr>
+          <w:rFonts w:ascii="Times New Roman" w:hAnsi="Times New Roman" w:cs="Times New Roman"/>
+          <w:bCs/>
+        </w:rPr>
+      </w:pPr>
+      <w:r>
+        <w:rPr>
+          <w:rFonts w:ascii="Times New Roman" w:hAnsi="Times New Roman" w:cs="Times New Roman"/>
+          <w:bCs/>
+        </w:rPr>
+        <w:t xml:space="preserve">Poorer EU economies initially exhibit very high demand elasticities, highlighting the starting variability across member states, and demand elasticities strongly correlate with GDP per capita. </w:t>
       </w:r>
     </w:p>
     <w:p>
       <w:pPr>
-        <w:numPr>
-          <w:ilvl w:val="0"/>
-          <w:numId w:val="36"/>
-        </w:numPr>
         <w:spacing w:line="360" w:lineRule="auto"/>
-        <w:rPr>
-          <w:rFonts w:ascii="Times New Roman" w:eastAsia="Times New Roman" w:hAnsi="Times New Roman" w:cs="Times New Roman"/>
-          <w:kern w:val="0"/>
-          <w14:ligatures w14:val="none"/>
-        </w:rPr>
-      </w:pPr>
-      <w:r>
-        <w:rPr>
-          <w:rFonts w:ascii="Times New Roman" w:eastAsia="Times New Roman" w:hAnsi="Times New Roman" w:cs="Times New Roman"/>
-          <w:kern w:val="0"/>
-          <w14:ligatures w14:val="none"/>
-        </w:rPr>
-        <w:t xml:space="preserve">Building on this result, when elasticities are further rescaled using country-specific effective price shocks derived from the present value of the income-contingent loan, </w:t>
-      </w:r>
-      <w:r>
-        <w:rPr>
-          <w:rFonts w:ascii="Times New Roman" w:eastAsia="Times New Roman" w:hAnsi="Times New Roman" w:cs="Times New Roman"/>
-          <w:kern w:val="0"/>
-          <w14:ligatures w14:val="none"/>
-        </w:rPr>
-        <w:lastRenderedPageBreak/>
-        <w:t>the income gradient collapses to a level statistically indistinguishable from zero. This shift suggests that much of the cross-country heterogeneity in elasticities reflects differences in treatment intensity, rather than underlying preferences. Notably, the newly computed elasticity becomes strongly correlated with the percentage of GDP invested in education.</w:t>
+        <w:ind w:firstLine="720"/>
+        <w:outlineLvl w:val="1"/>
+        <w:rPr>
+          <w:rFonts w:ascii="Times New Roman" w:hAnsi="Times New Roman" w:cs="Times New Roman"/>
+          <w:bCs/>
+        </w:rPr>
+      </w:pPr>
+      <w:r>
+        <w:rPr>
+          <w:rFonts w:ascii="Times New Roman" w:hAnsi="Times New Roman" w:cs="Times New Roman"/>
+          <w:bCs/>
+        </w:rPr>
+        <w:t>When elasticities are rescaled using country-specific shocks from the value of the income-contingent loan, the income gradient shrinks to near zero. This implies most cross-country heterogeneity comes from treatment differences, not preferences. The rescaled elasticity is closely linked to the share of GDP invested in education.</w:t>
       </w:r>
     </w:p>
     <w:p>
       <w:pPr>
         <w:spacing w:line="360" w:lineRule="auto"/>
-        <w:rPr>
-          <w:rFonts w:ascii="Times New Roman" w:eastAsia="Times New Roman" w:hAnsi="Times New Roman" w:cs="Times New Roman"/>
-          <w:kern w:val="0"/>
-          <w14:ligatures w14:val="none"/>
-        </w:rPr>
-      </w:pPr>
-      <w:r>
-        <w:rPr>
-          <w:rFonts w:ascii="Times New Roman" w:eastAsia="Times New Roman" w:hAnsi="Times New Roman" w:cs="Times New Roman"/>
-          <w:kern w:val="0"/>
-          <w14:ligatures w14:val="none"/>
-        </w:rPr>
-        <w:t>Taken together, these findings demonstrate that our methodology enables the analysis of country-specific variance and provides insights into the nature of heterogeneous higher education demand within the EU context.</w:t>
+        <w:outlineLvl w:val="1"/>
+        <w:rPr>
+          <w:rFonts w:ascii="Times New Roman" w:hAnsi="Times New Roman" w:cs="Times New Roman"/>
+          <w:bCs/>
+        </w:rPr>
+      </w:pPr>
+      <w:r>
+        <w:rPr>
+          <w:rFonts w:ascii="Times New Roman" w:hAnsi="Times New Roman" w:cs="Times New Roman"/>
+          <w:bCs/>
+        </w:rPr>
+        <w:lastRenderedPageBreak/>
+        <w:t>After loan valuation corrections, the real correlation is actually with the percentage of GDP for education, not with GDP itself</w:t>
       </w:r>
     </w:p>
     <w:p>
@@ -695,7 +419,7 @@
           <w:ilvl w:val="0"/>
           <w:numId w:val="35"/>
         </w:numPr>
-        <w:spacing w:before="240" w:after="240" w:line="360" w:lineRule="auto"/>
+        <w:spacing w:line="360" w:lineRule="auto"/>
         <w:outlineLvl w:val="1"/>
         <w:rPr>
           <w:rFonts w:ascii="Times New Roman" w:hAnsi="Times New Roman" w:cs="Times New Roman"/>
@@ -755,66 +479,48 @@
     <w:p>
       <w:pPr>
         <w:spacing w:line="360" w:lineRule="auto"/>
-        <w:outlineLvl w:val="1"/>
-        <w:rPr>
-          <w:rFonts w:ascii="Times New Roman" w:hAnsi="Times New Roman" w:cs="Times New Roman"/>
-          <w:bCs/>
-        </w:rPr>
-      </w:pPr>
-      <w:r>
-        <w:rPr>
-          <w:rFonts w:ascii="Times New Roman" w:hAnsi="Times New Roman" w:cs="Times New Roman"/>
-          <w:bCs/>
-        </w:rPr>
-        <w:t>Over preceding decades, the UK higher education system has expanded under policies of widened access (Macdonald &amp; Stratta, 2001; Brown, 2011). Although price elasticity in higher education is generally moderate (Hoxby, 2000), most studies focus on individual-level characteristics, leaving macro-level effects less explored (for example, see Leslie (2003)).</w:t>
-      </w:r>
-      <w:r>
-        <w:rPr>
-          <w:rFonts w:ascii="Times New Roman" w:hAnsi="Times New Roman" w:cs="Times New Roman"/>
-          <w:bCs/>
-        </w:rPr>
-        <w:t xml:space="preserve"> </w:t>
-      </w:r>
-      <w:r>
-        <w:rPr>
-          <w:rFonts w:ascii="Times New Roman" w:hAnsi="Times New Roman" w:cs="Times New Roman"/>
-          <w:bCs/>
-        </w:rPr>
-        <w:t>Brexit was a multifaceted phenomenon that began as a political movement but ultimately led to the UK’s exit from the EU</w:t>
-      </w:r>
-      <w:r>
-        <w:rPr>
-          <w:rFonts w:ascii="Times New Roman" w:hAnsi="Times New Roman" w:cs="Times New Roman"/>
-          <w:bCs/>
-        </w:rPr>
-        <w:t xml:space="preserve"> – </w:t>
-      </w:r>
-      <w:r>
-        <w:rPr>
-          <w:rFonts w:ascii="Times New Roman" w:hAnsi="Times New Roman" w:cs="Times New Roman"/>
-          <w:bCs/>
-        </w:rPr>
-        <w:t>described as a populist pushback against globalization and a shift away from “London” (Calhoun, 2017). One of its most significant outcomes</w:t>
-      </w:r>
-      <w:r>
-        <w:rPr>
-          <w:rFonts w:ascii="Times New Roman" w:hAnsi="Times New Roman" w:cs="Times New Roman"/>
-          <w:bCs/>
-        </w:rPr>
-        <w:t xml:space="preserve">, however, </w:t>
-      </w:r>
-      <w:r>
-        <w:rPr>
-          <w:rFonts w:ascii="Times New Roman" w:hAnsi="Times New Roman" w:cs="Times New Roman"/>
-          <w:bCs/>
-        </w:rPr>
-        <w:t>was the rupture of academic ties between the UK and the EU, with 2020 marking the final year that EU students paid domestic-level tuition; fees then doubled or tripled, making Brexit one of the largest tuition policy changes of the 21st century (</w:t>
+        <w:rPr>
+          <w:rFonts w:ascii="Times New Roman" w:hAnsi="Times New Roman" w:cs="Times New Roman"/>
+        </w:rPr>
+      </w:pPr>
+      <w:r>
+        <w:rPr>
+          <w:rFonts w:ascii="Times New Roman" w:hAnsi="Times New Roman" w:cs="Times New Roman"/>
+        </w:rPr>
+        <w:t xml:space="preserve">Over the preceding decades, the UK higher education system has expanded under policies of widened access (Macdonald &amp; </w:t>
       </w:r>
       <w:proofErr w:type="spellStart"/>
       <w:r>
         <w:rPr>
           <w:rFonts w:ascii="Times New Roman" w:hAnsi="Times New Roman" w:cs="Times New Roman"/>
-          <w:bCs/>
+        </w:rPr>
+        <w:t>Stratta</w:t>
+      </w:r>
+      <w:proofErr w:type="spellEnd"/>
+      <w:r>
+        <w:rPr>
+          <w:rFonts w:ascii="Times New Roman" w:hAnsi="Times New Roman" w:cs="Times New Roman"/>
+        </w:rPr>
+        <w:t>, 2001; Brown, 2011). Although price elasticity in higher education is generally moderate (</w:t>
+      </w:r>
+      <w:proofErr w:type="spellStart"/>
+      <w:r>
+        <w:rPr>
+          <w:rFonts w:ascii="Times New Roman" w:hAnsi="Times New Roman" w:cs="Times New Roman"/>
+        </w:rPr>
+        <w:t>Hoxby</w:t>
+      </w:r>
+      <w:proofErr w:type="spellEnd"/>
+      <w:r>
+        <w:rPr>
+          <w:rFonts w:ascii="Times New Roman" w:hAnsi="Times New Roman" w:cs="Times New Roman"/>
+        </w:rPr>
+        <w:t>, 2000), most studies focus on individual-level characteristics (Leslie, 2003), leaving macro-level effects less explored. Brexit was a multifaceted phenomenon that began as a political movement but ultimately led to the UK’s exit from the EU, which was described as a populist pushback against globalization and a shift away from “London” (Calhoun, 2017). One of its most significant outcomes, however, was the rupture of academic ties between the UK and the EU, with 2020 marking the final year that EU students paid domestic-level tuition; fees then doubled or tripled, making Brexit one of the largest tuition policy changes of the 21st century (</w:t>
+      </w:r>
+      <w:proofErr w:type="spellStart"/>
+      <w:r>
+        <w:rPr>
+          <w:rFonts w:ascii="Times New Roman" w:hAnsi="Times New Roman" w:cs="Times New Roman"/>
         </w:rPr>
         <w:t>Cuibus</w:t>
       </w:r>
@@ -822,7 +528,6 @@
       <w:r>
         <w:rPr>
           <w:rFonts w:ascii="Times New Roman" w:hAnsi="Times New Roman" w:cs="Times New Roman"/>
-          <w:bCs/>
         </w:rPr>
         <w:t xml:space="preserve"> &amp; Walsh, 2024). </w:t>
       </w:r>
@@ -830,33 +535,15 @@
     <w:p>
       <w:pPr>
         <w:spacing w:line="360" w:lineRule="auto"/>
-        <w:ind w:firstLine="360"/>
-        <w:outlineLvl w:val="1"/>
-        <w:rPr>
-          <w:rFonts w:ascii="Times New Roman" w:hAnsi="Times New Roman" w:cs="Times New Roman"/>
-          <w:bCs/>
-        </w:rPr>
-      </w:pPr>
-      <w:r>
-        <w:rPr>
-          <w:rFonts w:ascii="Times New Roman" w:hAnsi="Times New Roman" w:cs="Times New Roman"/>
-          <w:bCs/>
-        </w:rPr>
-        <w:t>This shift also reshaped student mobility, although a declining trend in UK students heading to Europe was noted as early as 2006 (Findlay et al., 2006), partly offset by increased flows to North America and Australia. Locke and Marini (2021) note that in the decade preceding the</w:t>
-      </w:r>
-      <w:r>
-        <w:rPr>
-          <w:rFonts w:ascii="Times New Roman" w:hAnsi="Times New Roman" w:cs="Times New Roman"/>
-          <w:bCs/>
-        </w:rPr>
-        <w:t xml:space="preserve"> </w:t>
-      </w:r>
-      <w:r>
-        <w:rPr>
-          <w:rFonts w:ascii="Times New Roman" w:hAnsi="Times New Roman" w:cs="Times New Roman"/>
-          <w:bCs/>
-        </w:rPr>
-        <w:t>Referendum on the UK’s membership of the European Union (EU), there had been a rapid increase in foreign faculty in UK higher education institutions (HEIs), particularly from other EU countries. Many institutions had come to rely on academics from other EU countries, as well as those from outside the EU, for a significant part of their research, teaching and other activities. Locke and Marini (2021) indicate that the growth in academic outflow to UK (from 2004/2005 to 2017/2018) had been most pronounced in countries like Bulgaria, Croatia, Estonia, Latvia and Lithuania. Luthra (2020) argues that the rejection of free movement created vulnerability among EU staff, highlighting feelings of insecurity regarding their legal rights and public acceptance within their workplaces.</w:t>
+        <w:rPr>
+          <w:rFonts w:ascii="Times New Roman" w:hAnsi="Times New Roman" w:cs="Times New Roman"/>
+        </w:rPr>
+      </w:pPr>
+      <w:r>
+        <w:rPr>
+          <w:rFonts w:ascii="Times New Roman" w:hAnsi="Times New Roman" w:cs="Times New Roman"/>
+        </w:rPr>
+        <w:t>This shift also reshaped student mobility, although a declining trend in UK students heading to Europe was noted as early as 2006 (Findlay et al., 2006), partly offset by increased flows to North America and Australia. Locke and Marini (2021) note that in the decade preceding the Referendum on the UK’s membership of the European Union (EU), there had been a rapid increase in foreign faculty in UK higher education institutions (HEIs), particularly from other EU countries. Many institutions had come to rely on academics from other EU countries, as well as those from outside the EU, for a significant part of their research, teaching, and other activities. Locke and Marini (2021) indicate that the growth in academic outflow to the UK (from 2004/2005 to 2017/2018) was most pronounced in countries such as Bulgaria, Croatia, Estonia, Latvia, and Lithuania. Luthra (2020) argues that the rejection of free movement created vulnerability among EU staff, highlighting feelings of insecurity regarding their legal rights and public acceptance within their workplaces.</w:t>
       </w:r>
     </w:p>
     <w:p>
@@ -872,69 +559,30 @@
       </w:pPr>
       <w:r>
         <w:rPr>
-          <w:rFonts w:ascii="Times New Roman" w:eastAsia="Times New Roman" w:hAnsi="Times New Roman" w:cs="Times New Roman"/>
-          <w:kern w:val="0"/>
-          <w:lang w:eastAsia="en-GB"/>
-          <w14:ligatures w14:val="none"/>
+          <w:rFonts w:ascii="Times New Roman" w:hAnsi="Times New Roman" w:cs="Times New Roman"/>
+        </w:rPr>
+        <w:t>The causal design of the Brexit shock was implemented later (once UCAS data became available). For example, Neville et al. (2024) document sharp post-2021 declines in EU applications and acceptances, even after controlling for COVID-19 conditions. Clifton-</w:t>
+      </w:r>
+      <w:proofErr w:type="spellStart"/>
+      <w:r>
+        <w:rPr>
+          <w:rFonts w:ascii="Times New Roman" w:hAnsi="Times New Roman" w:cs="Times New Roman"/>
+        </w:rPr>
+        <w:t>Sprigg</w:t>
+      </w:r>
+      <w:proofErr w:type="spellEnd"/>
+      <w:r>
+        <w:rPr>
+          <w:rFonts w:ascii="Times New Roman" w:hAnsi="Times New Roman" w:cs="Times New Roman"/>
+        </w:rPr>
+        <w:t xml:space="preserve"> et al. (2025) explicitly conclude that the introduction of international tuition fees, rather than the referendum result or visa changes, caused the substantial contraction in EU study mobility. Our contribution advances these designs by treating the fee increase as a quasi-experimental price shock to identify origin-specific price elasticities from uncensored </w:t>
+      </w:r>
+      <w:r>
+        <w:rPr>
+          <w:rFonts w:ascii="Times New Roman" w:hAnsi="Times New Roman" w:cs="Times New Roman"/>
         </w:rPr>
         <w:lastRenderedPageBreak/>
-        <w:t>The causal designs of the Brexit shock came later (once data from UCAS became available). For example, Neville et al. (2024) document sharp post-2021 declines in EU applications and acceptances, even after controlling for COVID-19 conditions. Clifton-</w:t>
-      </w:r>
-      <w:proofErr w:type="spellStart"/>
-      <w:r>
-        <w:rPr>
-          <w:rFonts w:ascii="Times New Roman" w:eastAsia="Times New Roman" w:hAnsi="Times New Roman" w:cs="Times New Roman"/>
-          <w:kern w:val="0"/>
-          <w:lang w:eastAsia="en-GB"/>
-          <w14:ligatures w14:val="none"/>
-        </w:rPr>
-        <w:t>Sprigg</w:t>
-      </w:r>
-      <w:proofErr w:type="spellEnd"/>
-      <w:r>
-        <w:rPr>
-          <w:rFonts w:ascii="Times New Roman" w:eastAsia="Times New Roman" w:hAnsi="Times New Roman" w:cs="Times New Roman"/>
-          <w:kern w:val="0"/>
-          <w:lang w:eastAsia="en-GB"/>
-          <w14:ligatures w14:val="none"/>
-        </w:rPr>
-        <w:t xml:space="preserve"> et al. (2025) explicitly conclude that the introduction of international tuition fees </w:t>
-      </w:r>
-      <w:r>
-        <w:rPr>
-          <w:rFonts w:ascii="Times New Roman" w:eastAsia="Times New Roman" w:hAnsi="Times New Roman" w:cs="Times New Roman"/>
-          <w:kern w:val="0"/>
-          <w:lang w:eastAsia="en-GB"/>
-          <w14:ligatures w14:val="none"/>
-        </w:rPr>
-        <w:t>–</w:t>
-      </w:r>
-      <w:r>
-        <w:rPr>
-          <w:rFonts w:ascii="Times New Roman" w:eastAsia="Times New Roman" w:hAnsi="Times New Roman" w:cs="Times New Roman"/>
-          <w:kern w:val="0"/>
-          <w:lang w:eastAsia="en-GB"/>
-          <w14:ligatures w14:val="none"/>
-        </w:rPr>
-        <w:t xml:space="preserve"> rather than the referendum result or visa changes </w:t>
-      </w:r>
-      <w:r>
-        <w:rPr>
-          <w:rFonts w:ascii="Times New Roman" w:eastAsia="Times New Roman" w:hAnsi="Times New Roman" w:cs="Times New Roman"/>
-          <w:kern w:val="0"/>
-          <w:lang w:eastAsia="en-GB"/>
-          <w14:ligatures w14:val="none"/>
-        </w:rPr>
-        <w:t>–</w:t>
-      </w:r>
-      <w:r>
-        <w:rPr>
-          <w:rFonts w:ascii="Times New Roman" w:eastAsia="Times New Roman" w:hAnsi="Times New Roman" w:cs="Times New Roman"/>
-          <w:kern w:val="0"/>
-          <w:lang w:eastAsia="en-GB"/>
-          <w14:ligatures w14:val="none"/>
-        </w:rPr>
-        <w:t xml:space="preserve"> caused the substantial contraction in EU study mobility. Our contribution advances these designs by treating the fee increase as a quasi-experimental price shock to identify origin-specific price elasticities from uncensored applications; extending the analysis through 2023/25, after pandemic disruptions abated, to isolate persistent price responsiveness from COVID-era volatility; and accounting for income-specific loan valuation. We therefore move from measuring how much demand fell to uncovering why it fell and what this implies for pricing and market structure.</w:t>
+        <w:t>applications and by accounting for income-specific loan valuation. We therefore extend the literature by moving away from measuring how much demand fell to uncovering why it fell and what this implies for pricing and market structure.</w:t>
       </w:r>
     </w:p>
     <w:p>
@@ -975,6 +623,7 @@
     <w:p>
       <w:pPr>
         <w:spacing w:line="360" w:lineRule="auto"/>
+        <w:ind w:firstLine="360"/>
         <w:outlineLvl w:val="1"/>
         <w:rPr>
           <w:rFonts w:ascii="Times New Roman" w:hAnsi="Times New Roman" w:cs="Times New Roman"/>
@@ -986,14 +635,23 @@
           <w:rFonts w:ascii="Times New Roman" w:hAnsi="Times New Roman" w:cs="Times New Roman"/>
           <w:iCs/>
         </w:rPr>
-        <w:t>Our</w:t>
-      </w:r>
+        <w:t xml:space="preserve">Our use of </w:t>
+      </w:r>
+      <w:proofErr w:type="spellStart"/>
       <w:r>
         <w:rPr>
           <w:rFonts w:ascii="Times New Roman" w:hAnsi="Times New Roman" w:cs="Times New Roman"/>
           <w:iCs/>
         </w:rPr>
-        <w:t xml:space="preserve"> use of </w:t>
+        <w:t>DiD</w:t>
+      </w:r>
+      <w:proofErr w:type="spellEnd"/>
+      <w:r>
+        <w:rPr>
+          <w:rFonts w:ascii="Times New Roman" w:hAnsi="Times New Roman" w:cs="Times New Roman"/>
+          <w:iCs/>
+        </w:rPr>
+        <w:t xml:space="preserve"> designs to recover structural demand parameters has a lineage in the IO literature, as Bresnahan (1982) showed that market-level price and quantity variation can identify demand elasticities when supply-side conduct is explicitly modeled. The present paper adapts this logic to a quasi-experimental setting, using the Brexit shock to identify the slope of country-level isoelastic demand curves. We extend the standard literature in the economics of education by building on Sá (2014), the closest methodological predecessor, who used the same UCAS application data and similar </w:t>
       </w:r>
       <w:proofErr w:type="spellStart"/>
       <w:r>
@@ -1009,28 +667,41 @@
           <w:rFonts w:ascii="Times New Roman" w:hAnsi="Times New Roman" w:cs="Times New Roman"/>
           <w:iCs/>
         </w:rPr>
-        <w:t xml:space="preserve"> designs to recover structural demand parameters has a lineage in the IO literature. Bresnahan (1982) showed how market-level price and quantity variation can identify demand elasticities when supply-side conduct is modeled explicitly. The present paper adapts this logic to a quasi-experimental setting</w:t>
-      </w:r>
-      <w:r>
+        <w:t xml:space="preserve"> logic to derive elasticities of 0.14–0.26 for domestic students. Her key finding is that credit-constrained students are not disproportionately affected, due to income-contingent loans equalizing access, a claim directly tested by Brexit, which removes those loans for an identifiable group. Our results extend the loan valuation mechanics by demonstrating that the income gradient in demand elasticities across EU countries collapses once elasticities are corrected for heterogeneous loan present values.</w:t>
+      </w:r>
+    </w:p>
+    <w:p>
+      <w:pPr>
+        <w:spacing w:line="360" w:lineRule="auto"/>
+        <w:ind w:firstLine="360"/>
+        <w:outlineLvl w:val="1"/>
         <w:rPr>
           <w:rFonts w:ascii="Times New Roman" w:hAnsi="Times New Roman" w:cs="Times New Roman"/>
           <w:iCs/>
         </w:rPr>
-        <w:t xml:space="preserve"> as </w:t>
-      </w:r>
+      </w:pPr>
       <w:r>
         <w:rPr>
           <w:rFonts w:ascii="Times New Roman" w:hAnsi="Times New Roman" w:cs="Times New Roman"/>
           <w:iCs/>
         </w:rPr>
-        <w:t>the Brexit shock provides exogenous price variation that identifies the slope of country-level isoelastic demand curves, avoiding the endogeneity of institutional pricing</w:t>
-      </w:r>
+        <w:t xml:space="preserve">Endogeneity between demand and supply for higher education is another concern. </w:t>
+      </w:r>
+      <w:proofErr w:type="spellStart"/>
       <w:r>
         <w:rPr>
           <w:rFonts w:ascii="Times New Roman" w:hAnsi="Times New Roman" w:cs="Times New Roman"/>
           <w:iCs/>
         </w:rPr>
-        <w:t>.</w:t>
+        <w:t>Hoxby</w:t>
+      </w:r>
+      <w:proofErr w:type="spellEnd"/>
+      <w:r>
+        <w:rPr>
+          <w:rFonts w:ascii="Times New Roman" w:hAnsi="Times New Roman" w:cs="Times New Roman"/>
+          <w:iCs/>
+        </w:rPr>
+        <w:t xml:space="preserve"> (1997) argues that increased competition in higher education can lead to higher tuition because institutions respond by differentiating their products, increasing quality, sorting students more sharply, and adjusting subsidies. In that account, rising tuition is an endogenous feature of a new competitive equilibrium. The Brexit design differs sharply in that the increase in tuition for EU students was not driven by institutional competition, quality upgrading, or a university-level pricing strategy. It was an externally imposed regulatory shock that removed Home Fee status and access to income-contingent loans while leaving the underlying educational product largely unchanged. This corresponds directly to Leslie and Brinkman (1987), who define demand elasticity as ε = (E/P), where E is the percentage change in enrollment, and P is the percentage change in price. If elasticity is derived from time-series variation rather than cross-sectional variation, then increasing competition can generate endogenous price shifts within the institutions affected.</w:t>
       </w:r>
     </w:p>
     <w:p>
@@ -1048,23 +719,29 @@
           <w:rFonts w:ascii="Times New Roman" w:hAnsi="Times New Roman" w:cs="Times New Roman"/>
           <w:iCs/>
         </w:rPr>
-        <w:t xml:space="preserve">Sá (2014) is the closest methodological predecessor, using the same UCAS application data and </w:t>
-      </w:r>
-      <w:proofErr w:type="spellStart"/>
+        <w:t xml:space="preserve">Furthermore, Leslie and Brinkman (1987) explain that when we have a tuition elasticity from a time-series study, we cannot directly use it as a total-cost elasticity, because </w:t>
+      </w:r>
       <w:r>
         <w:rPr>
           <w:rFonts w:ascii="Times New Roman" w:hAnsi="Times New Roman" w:cs="Times New Roman"/>
           <w:iCs/>
         </w:rPr>
-        <w:t>DiD</w:t>
-      </w:r>
-      <w:proofErr w:type="spellEnd"/>
+        <w:lastRenderedPageBreak/>
+        <w:t>tuition and total cost did not move proportionally over time. This is why Brexit represents such an important empirical event, because it generated implicit tuition variation by sharply changing the effective price faced by EU applicants, allowing the analysis to identify how demand responds to changes in the actual cost of study rather than to nominal tuition alone. Campbell &amp; Siegel (19</w:t>
+      </w:r>
       <w:r>
         <w:rPr>
           <w:rFonts w:ascii="Times New Roman" w:hAnsi="Times New Roman" w:cs="Times New Roman"/>
           <w:iCs/>
         </w:rPr>
-        <w:t xml:space="preserve"> logic to derive elasticities of 0.14–0.26 for domestic students. Her key finding — that credit-constrained students are not disproportionately affected, attributed to income-contingent loans equalizing access — is directly tested by Brexit, which removes those loans for an identifiable group. Our results vindicate her mechanism: the income gradient across EU countries collapses once elasticities are corrected for heterogeneous loan present values. Note that her estimates are not directly comparable to ours given that arc and log-linear elasticities diverge under large discrete price changes of the magnitude observed here (see Appendix).</w:t>
+        <w:t>67</w:t>
+      </w:r>
+      <w:r>
+        <w:rPr>
+          <w:rFonts w:ascii="Times New Roman" w:hAnsi="Times New Roman" w:cs="Times New Roman"/>
+          <w:iCs/>
+        </w:rPr>
+        <w:t xml:space="preserve">) present an example in which tuition rose 148% between 1927 and 1963, more than the total direct costs, so their tuition elasticity of −0.44 understates the true total cost elasticity. </w:t>
       </w:r>
     </w:p>
     <w:p>
@@ -1082,102 +759,7 @@
           <w:rFonts w:ascii="Times New Roman" w:hAnsi="Times New Roman" w:cs="Times New Roman"/>
           <w:iCs/>
         </w:rPr>
-        <w:t xml:space="preserve">The endogeneity between demand and supply of higher education is another concern. </w:t>
-      </w:r>
-      <w:proofErr w:type="spellStart"/>
-      <w:r>
-        <w:rPr>
-          <w:rFonts w:ascii="Times New Roman" w:hAnsi="Times New Roman" w:cs="Times New Roman"/>
-          <w:iCs/>
-        </w:rPr>
-        <w:t>Hoxby</w:t>
-      </w:r>
-      <w:proofErr w:type="spellEnd"/>
-      <w:r>
-        <w:rPr>
-          <w:rFonts w:ascii="Times New Roman" w:hAnsi="Times New Roman" w:cs="Times New Roman"/>
-          <w:iCs/>
-        </w:rPr>
-        <w:t xml:space="preserve"> </w:t>
-      </w:r>
-      <w:r>
-        <w:rPr>
-          <w:rFonts w:ascii="Times New Roman" w:hAnsi="Times New Roman" w:cs="Times New Roman"/>
-          <w:iCs/>
-        </w:rPr>
-        <w:t xml:space="preserve">(1997) </w:t>
-      </w:r>
-      <w:r>
-        <w:rPr>
-          <w:rFonts w:ascii="Times New Roman" w:hAnsi="Times New Roman" w:cs="Times New Roman"/>
-          <w:iCs/>
-        </w:rPr>
-        <w:t xml:space="preserve">argues that increased competition in higher education can generate higher tuition because institutions respond by differentiating products, increasing quality, sorting students more sharply, and adjusting subsidies. In that account, rising tuition is an </w:t>
-      </w:r>
-      <w:r>
-        <w:rPr>
-          <w:rFonts w:ascii="Times New Roman" w:hAnsi="Times New Roman" w:cs="Times New Roman"/>
-          <w:iCs/>
-        </w:rPr>
-        <w:t>endogenous feature of a new competitive equilibrium</w:t>
-      </w:r>
-      <w:r>
-        <w:rPr>
-          <w:rFonts w:ascii="Times New Roman" w:hAnsi="Times New Roman" w:cs="Times New Roman"/>
-          <w:iCs/>
-        </w:rPr>
-        <w:t>.</w:t>
-      </w:r>
-      <w:r>
-        <w:rPr>
-          <w:rFonts w:ascii="Times New Roman" w:hAnsi="Times New Roman" w:cs="Times New Roman"/>
-          <w:iCs/>
-        </w:rPr>
-        <w:t xml:space="preserve"> However,</w:t>
-      </w:r>
-      <w:r>
-        <w:rPr>
-          <w:rFonts w:ascii="Times New Roman" w:hAnsi="Times New Roman" w:cs="Times New Roman"/>
-          <w:iCs/>
-        </w:rPr>
-        <w:t xml:space="preserve"> </w:t>
-      </w:r>
-      <w:r>
-        <w:rPr>
-          <w:rFonts w:ascii="Times New Roman" w:hAnsi="Times New Roman" w:cs="Times New Roman"/>
-          <w:iCs/>
-        </w:rPr>
-        <w:t>t</w:t>
-      </w:r>
-      <w:r>
-        <w:rPr>
-          <w:rFonts w:ascii="Times New Roman" w:hAnsi="Times New Roman" w:cs="Times New Roman"/>
-          <w:iCs/>
-        </w:rPr>
-        <w:t xml:space="preserve">he Brexit design differs </w:t>
-      </w:r>
-      <w:r>
-        <w:rPr>
-          <w:rFonts w:ascii="Times New Roman" w:hAnsi="Times New Roman" w:cs="Times New Roman"/>
-          <w:iCs/>
-        </w:rPr>
-        <w:lastRenderedPageBreak/>
-        <w:t xml:space="preserve">sharply. The increase in tuition for EU students </w:t>
-      </w:r>
-      <w:r>
-        <w:rPr>
-          <w:rFonts w:ascii="Times New Roman" w:hAnsi="Times New Roman" w:cs="Times New Roman"/>
-          <w:i/>
-          <w:iCs/>
-        </w:rPr>
-        <w:t>was not produced by institutional competition, quality upgrading, or a university-level pricing strategy</w:t>
-      </w:r>
-      <w:r>
-        <w:rPr>
-          <w:rFonts w:ascii="Times New Roman" w:hAnsi="Times New Roman" w:cs="Times New Roman"/>
-          <w:iCs/>
-        </w:rPr>
-        <w:t xml:space="preserve">. It was an externally imposed regulatory shock that removed Home Fee status and access to income-contingent loans while leaving the underlying educational product largely unchanged. The observed fall in EU applications therefore challenges the view that large tuition increases can be interpreted primarily as the price counterpart of improved quality or market differentiation. </w:t>
+        <w:t xml:space="preserve">Leslie and Brinkman (1987) further conclude that for every $100 increase in tuition price, given the 1982-83 average weighted higher education prices of $3,420 for tuition and room and board, one would expect a 18-24-year-old participation rate drop of about three-quarters of a percentage point. Since the national higher education participation rate was about 0.33 in 1982, U.S. enrollments would decline by about 2.1 percent for each $ 100 price increase, all other factors equal. This implies a price elasticity of about -0.73, which is largely consistent with some of our own estimates. </w:t>
       </w:r>
     </w:p>
     <w:p>
@@ -1190,202 +772,42 @@
           <w:iCs/>
         </w:rPr>
       </w:pPr>
+      <w:proofErr w:type="spellStart"/>
       <w:r>
         <w:rPr>
           <w:rFonts w:ascii="Times New Roman" w:hAnsi="Times New Roman" w:cs="Times New Roman"/>
           <w:iCs/>
         </w:rPr>
-        <w:t xml:space="preserve">In regards to </w:t>
-      </w:r>
+        <w:t>Savoca</w:t>
+      </w:r>
+      <w:proofErr w:type="spellEnd"/>
       <w:r>
         <w:rPr>
           <w:rFonts w:ascii="Times New Roman" w:hAnsi="Times New Roman" w:cs="Times New Roman"/>
           <w:iCs/>
         </w:rPr>
-        <w:t>the endogeneity concern</w:t>
-      </w:r>
+        <w:t xml:space="preserve"> (1990) argues that standard enrollment-based estimates understate true demand sensitivity by conflating application behavior with admissions and matriculation decisions. Under the assumption that tuition and admissions policy are set independently, the price elasticity of enrollment equals the sum of the application and matriculation elasticities – a combined figure she estimates at −0.49, suggesting the true demand elasticity may be more than twice as large as conventional estimates. Following the modern wave of more robust causal evidence, </w:t>
+      </w:r>
+      <w:proofErr w:type="spellStart"/>
       <w:r>
         <w:rPr>
           <w:rFonts w:ascii="Times New Roman" w:hAnsi="Times New Roman" w:cs="Times New Roman"/>
           <w:iCs/>
         </w:rPr>
-        <w:t xml:space="preserve">, </w:t>
-      </w:r>
+        <w:t>Dwenger</w:t>
+      </w:r>
+      <w:proofErr w:type="spellEnd"/>
       <w:r>
         <w:rPr>
           <w:rFonts w:ascii="Times New Roman" w:hAnsi="Times New Roman" w:cs="Times New Roman"/>
           <w:iCs/>
         </w:rPr>
-        <w:t xml:space="preserve">Leslie and Brinkman (1987) </w:t>
-      </w:r>
-      <w:r>
-        <w:rPr>
-          <w:rFonts w:ascii="Times New Roman" w:hAnsi="Times New Roman" w:cs="Times New Roman"/>
-          <w:iCs/>
-        </w:rPr>
-        <w:t xml:space="preserve">defines demand elasticity as </w:t>
-      </w:r>
-      <w:r>
-        <w:rPr>
-          <w:rFonts w:ascii="Times New Roman" w:hAnsi="Times New Roman" w:cs="Times New Roman"/>
-          <w:iCs/>
-        </w:rPr>
-        <w:t>ε = E/P, where E is the percentage change in enrollment and P is the percentage change in price.</w:t>
-      </w:r>
-      <w:r>
-        <w:rPr>
-          <w:rFonts w:ascii="Times New Roman" w:hAnsi="Times New Roman" w:cs="Times New Roman"/>
-          <w:iCs/>
-        </w:rPr>
-        <w:t xml:space="preserve"> This is inherently problematic as enrollment is an equilibrium outcome</w:t>
-      </w:r>
-      <w:r>
-        <w:rPr>
-          <w:rFonts w:ascii="Times New Roman" w:hAnsi="Times New Roman" w:cs="Times New Roman"/>
-          <w:iCs/>
-        </w:rPr>
-        <w:t xml:space="preserve"> (as demonstrated by </w:t>
-      </w:r>
-      <w:proofErr w:type="spellStart"/>
-      <w:r>
-        <w:rPr>
-          <w:rFonts w:ascii="Times New Roman" w:hAnsi="Times New Roman" w:cs="Times New Roman"/>
-          <w:iCs/>
-        </w:rPr>
-        <w:t>Hoxby</w:t>
-      </w:r>
-      <w:proofErr w:type="spellEnd"/>
-      <w:r>
-        <w:rPr>
-          <w:rFonts w:ascii="Times New Roman" w:hAnsi="Times New Roman" w:cs="Times New Roman"/>
-          <w:iCs/>
-        </w:rPr>
-        <w:t xml:space="preserve"> (1997)</w:t>
-      </w:r>
-      <w:r>
-        <w:rPr>
-          <w:rFonts w:ascii="Times New Roman" w:hAnsi="Times New Roman" w:cs="Times New Roman"/>
-          <w:iCs/>
-        </w:rPr>
-        <w:t>) and</w:t>
-      </w:r>
-      <w:r>
-        <w:rPr>
-          <w:rFonts w:ascii="Times New Roman" w:hAnsi="Times New Roman" w:cs="Times New Roman"/>
-          <w:iCs/>
-        </w:rPr>
-        <w:t xml:space="preserve"> increasing competition can generate endogenous price shifts within the institutions affected</w:t>
-      </w:r>
-      <w:r>
-        <w:rPr>
-          <w:rFonts w:ascii="Times New Roman" w:hAnsi="Times New Roman" w:cs="Times New Roman"/>
-          <w:iCs/>
-        </w:rPr>
-        <w:t>.</w:t>
-      </w:r>
-      <w:r>
-        <w:rPr>
-          <w:rFonts w:ascii="Times New Roman" w:hAnsi="Times New Roman" w:cs="Times New Roman"/>
-          <w:iCs/>
-        </w:rPr>
-        <w:t xml:space="preserve"> </w:t>
-      </w:r>
-      <w:r>
-        <w:rPr>
-          <w:rFonts w:ascii="Times New Roman" w:hAnsi="Times New Roman" w:cs="Times New Roman"/>
-          <w:iCs/>
-        </w:rPr>
-        <w:t>Therefore,</w:t>
-      </w:r>
-      <w:r>
-        <w:rPr>
-          <w:rFonts w:ascii="Times New Roman" w:hAnsi="Times New Roman" w:cs="Times New Roman"/>
-          <w:iCs/>
-        </w:rPr>
-        <w:t xml:space="preserve"> any change in this parameter will be endogenous to the own institutional rationing. </w:t>
-      </w:r>
-      <w:r>
-        <w:rPr>
-          <w:rFonts w:ascii="Times New Roman" w:hAnsi="Times New Roman" w:cs="Times New Roman"/>
-          <w:iCs/>
-        </w:rPr>
-        <w:t xml:space="preserve">Leslie and Brinkman (1987) </w:t>
-      </w:r>
-      <w:r>
-        <w:rPr>
-          <w:rFonts w:ascii="Times New Roman" w:hAnsi="Times New Roman" w:cs="Times New Roman"/>
-          <w:iCs/>
-        </w:rPr>
-        <w:t>explain that w</w:t>
-      </w:r>
-      <w:r>
-        <w:rPr>
-          <w:rFonts w:ascii="Times New Roman" w:hAnsi="Times New Roman" w:cs="Times New Roman"/>
-          <w:iCs/>
-        </w:rPr>
-        <w:t xml:space="preserve">hen </w:t>
-      </w:r>
-      <w:r>
-        <w:rPr>
-          <w:rFonts w:ascii="Times New Roman" w:hAnsi="Times New Roman" w:cs="Times New Roman"/>
-          <w:iCs/>
-        </w:rPr>
-        <w:t>we</w:t>
-      </w:r>
-      <w:r>
-        <w:rPr>
-          <w:rFonts w:ascii="Times New Roman" w:hAnsi="Times New Roman" w:cs="Times New Roman"/>
-          <w:iCs/>
-        </w:rPr>
-        <w:t xml:space="preserve"> have a tuition elasticity from a time-series study, </w:t>
-      </w:r>
-      <w:r>
-        <w:rPr>
-          <w:rFonts w:ascii="Times New Roman" w:hAnsi="Times New Roman" w:cs="Times New Roman"/>
-          <w:iCs/>
-        </w:rPr>
-        <w:t>we</w:t>
-      </w:r>
-      <w:r>
-        <w:rPr>
-          <w:rFonts w:ascii="Times New Roman" w:hAnsi="Times New Roman" w:cs="Times New Roman"/>
-          <w:iCs/>
-        </w:rPr>
-        <w:t xml:space="preserve"> cannot directly use it as a total-cost elasticity, because tuition and total cost did not move proportionally over time.</w:t>
-      </w:r>
-      <w:r>
-        <w:rPr>
-          <w:rFonts w:ascii="Times New Roman" w:hAnsi="Times New Roman" w:cs="Times New Roman"/>
-          <w:iCs/>
-        </w:rPr>
-        <w:t xml:space="preserve"> In modern designs</w:t>
-      </w:r>
-      <w:r>
-        <w:rPr>
-          <w:rFonts w:ascii="Times New Roman" w:hAnsi="Times New Roman" w:cs="Times New Roman"/>
-          <w:iCs/>
-        </w:rPr>
-        <w:t xml:space="preserve">, </w:t>
-      </w:r>
-      <w:r>
-        <w:rPr>
-          <w:rFonts w:ascii="Times New Roman" w:hAnsi="Times New Roman" w:cs="Times New Roman"/>
-          <w:iCs/>
-        </w:rPr>
-        <w:t>using time series to analyze price elasticity, scholars like Sa (2019) and us normally rely on exogeneous price shocks which assume that the change is in</w:t>
-      </w:r>
-      <w:r>
-        <w:rPr>
-          <w:rFonts w:ascii="Times New Roman" w:hAnsi="Times New Roman" w:cs="Times New Roman"/>
-          <w:iCs/>
-        </w:rPr>
-        <w:t xml:space="preserve">dependent of institutional rationing or macroeconomic conditions. </w:t>
+        <w:t xml:space="preserve"> et al. (2012) corroborate this direction of effect in a different setting – among German high-school graduates, residing in a state with tuition fees reduces the probability of applying to a home-state university by 2 percentage points (against a baseline of 69%), with stronger responses among higher-achieving students.</w:t>
       </w:r>
     </w:p>
     <w:p>
       <w:pPr>
         <w:spacing w:line="360" w:lineRule="auto"/>
-        <w:ind w:firstLine="720"/>
         <w:outlineLvl w:val="1"/>
         <w:rPr>
           <w:rFonts w:ascii="Times New Roman" w:hAnsi="Times New Roman" w:cs="Times New Roman"/>
@@ -1397,566 +819,23 @@
           <w:rFonts w:ascii="Times New Roman" w:hAnsi="Times New Roman" w:cs="Times New Roman"/>
           <w:iCs/>
         </w:rPr>
-        <w:t xml:space="preserve"> Campbell &amp; Siegel </w:t>
-      </w:r>
+        <w:t xml:space="preserve">To understand why the Brexit-derived elasticities may be larger than the standard estimates in the literature, consider, for example, Heller (1997), who argues that tuition increases reduce enrolment (so higher education is not a luxury good). The studies reviewed by Heller (1997) converge on the finding that each $100 tuition increase lowers enrolment by roughly 0.5 to 1.0 percentage points, which is consistent with Leslie and Brinkman (1987). Reductions in financial aid also reduce enrolment, though the effect varies by aid type. Lower-income students are more sensitive to changes in tuition and aid than middle- and upper-income students. The results presented in </w:t>
+      </w:r>
+      <w:proofErr w:type="spellStart"/>
       <w:r>
         <w:rPr>
           <w:rFonts w:ascii="Times New Roman" w:hAnsi="Times New Roman" w:cs="Times New Roman"/>
           <w:iCs/>
         </w:rPr>
-        <w:t>(1976) present an example where b</w:t>
-      </w:r>
+        <w:t>Hemelt</w:t>
+      </w:r>
+      <w:proofErr w:type="spellEnd"/>
       <w:r>
         <w:rPr>
           <w:rFonts w:ascii="Times New Roman" w:hAnsi="Times New Roman" w:cs="Times New Roman"/>
           <w:iCs/>
         </w:rPr>
-        <w:t xml:space="preserve">etween 1927 and 1963, tuition rose 148% </w:t>
-      </w:r>
-      <w:r>
-        <w:rPr>
-          <w:rFonts w:ascii="Times New Roman" w:hAnsi="Times New Roman" w:cs="Times New Roman"/>
-          <w:iCs/>
-        </w:rPr>
-        <w:t xml:space="preserve">which was </w:t>
-      </w:r>
-      <w:r>
-        <w:rPr>
-          <w:rFonts w:ascii="Times New Roman" w:hAnsi="Times New Roman" w:cs="Times New Roman"/>
-          <w:iCs/>
-        </w:rPr>
-        <w:t xml:space="preserve">more than </w:t>
-      </w:r>
-      <w:r>
-        <w:rPr>
-          <w:rFonts w:ascii="Times New Roman" w:hAnsi="Times New Roman" w:cs="Times New Roman"/>
-          <w:iCs/>
-        </w:rPr>
-        <w:t xml:space="preserve">the </w:t>
-      </w:r>
-      <w:r>
-        <w:rPr>
-          <w:rFonts w:ascii="Times New Roman" w:hAnsi="Times New Roman" w:cs="Times New Roman"/>
-          <w:iCs/>
-        </w:rPr>
-        <w:t>total direct costs</w:t>
-      </w:r>
-      <w:r>
-        <w:rPr>
-          <w:rFonts w:ascii="Times New Roman" w:hAnsi="Times New Roman" w:cs="Times New Roman"/>
-          <w:iCs/>
-        </w:rPr>
-        <w:t>. T</w:t>
-      </w:r>
-      <w:r>
-        <w:rPr>
-          <w:rFonts w:ascii="Times New Roman" w:hAnsi="Times New Roman" w:cs="Times New Roman"/>
-          <w:iCs/>
-        </w:rPr>
-        <w:t>heir tuition elasticity of −0.44 understates the true total cost elasticity</w:t>
-      </w:r>
-      <w:r>
-        <w:rPr>
-          <w:rFonts w:ascii="Times New Roman" w:hAnsi="Times New Roman" w:cs="Times New Roman"/>
-          <w:iCs/>
-        </w:rPr>
-        <w:t xml:space="preserve">. In comparison to this result, the </w:t>
-      </w:r>
-      <w:r>
-        <w:rPr>
-          <w:rFonts w:ascii="Times New Roman" w:hAnsi="Times New Roman" w:cs="Times New Roman"/>
-          <w:iCs/>
-        </w:rPr>
-        <w:t>Brexit shock is unambiguously a total cost shock</w:t>
-      </w:r>
-      <w:r>
-        <w:rPr>
-          <w:rFonts w:ascii="Times New Roman" w:hAnsi="Times New Roman" w:cs="Times New Roman"/>
-          <w:iCs/>
-        </w:rPr>
-        <w:t xml:space="preserve"> as </w:t>
-      </w:r>
-      <w:r>
-        <w:rPr>
-          <w:rFonts w:ascii="Times New Roman" w:hAnsi="Times New Roman" w:cs="Times New Roman"/>
-          <w:iCs/>
-        </w:rPr>
-        <w:t xml:space="preserve">the fee change from £9,250 to £22,200 is the dominant component, and it is the entire treatment. </w:t>
-      </w:r>
-    </w:p>
-    <w:p>
-      <w:pPr>
-        <w:spacing w:line="360" w:lineRule="auto"/>
-        <w:ind w:firstLine="720"/>
-        <w:outlineLvl w:val="1"/>
-        <w:rPr>
-          <w:rFonts w:ascii="Times New Roman" w:hAnsi="Times New Roman" w:cs="Times New Roman"/>
-          <w:iCs/>
-        </w:rPr>
-      </w:pPr>
-      <w:r>
-        <w:rPr>
-          <w:rFonts w:ascii="Times New Roman" w:hAnsi="Times New Roman" w:cs="Times New Roman"/>
-          <w:iCs/>
-        </w:rPr>
-        <w:t>Leslie and Brinkman’s (1987)</w:t>
-      </w:r>
-      <w:r>
-        <w:rPr>
-          <w:rFonts w:ascii="Times New Roman" w:hAnsi="Times New Roman" w:cs="Times New Roman"/>
-          <w:iCs/>
-        </w:rPr>
-        <w:t xml:space="preserve"> </w:t>
-      </w:r>
-      <w:r>
-        <w:rPr>
-          <w:rFonts w:ascii="Times New Roman" w:hAnsi="Times New Roman" w:cs="Times New Roman"/>
-          <w:iCs/>
-        </w:rPr>
-        <w:t xml:space="preserve">further </w:t>
-      </w:r>
-      <w:r>
-        <w:rPr>
-          <w:rFonts w:ascii="Times New Roman" w:hAnsi="Times New Roman" w:cs="Times New Roman"/>
-          <w:iCs/>
-        </w:rPr>
-        <w:t>conclude</w:t>
-      </w:r>
-      <w:r>
-        <w:rPr>
-          <w:rFonts w:ascii="Times New Roman" w:hAnsi="Times New Roman" w:cs="Times New Roman"/>
-          <w:iCs/>
-        </w:rPr>
-        <w:t xml:space="preserve"> that </w:t>
-      </w:r>
-      <w:r>
-        <w:rPr>
-          <w:rFonts w:ascii="Times New Roman" w:hAnsi="Times New Roman" w:cs="Times New Roman"/>
-          <w:iCs/>
-        </w:rPr>
-        <w:t>for every $100 increase in tuition price</w:t>
-      </w:r>
-      <w:r>
-        <w:rPr>
-          <w:rFonts w:ascii="Times New Roman" w:hAnsi="Times New Roman" w:cs="Times New Roman"/>
-          <w:iCs/>
-        </w:rPr>
-        <w:t xml:space="preserve"> –</w:t>
-      </w:r>
-      <w:r>
-        <w:rPr>
-          <w:rFonts w:ascii="Times New Roman" w:hAnsi="Times New Roman" w:cs="Times New Roman"/>
-          <w:iCs/>
-        </w:rPr>
-        <w:t xml:space="preserve"> given 1982-83 average weighted higher education prices of $3,420</w:t>
-      </w:r>
-      <w:r>
-        <w:rPr>
-          <w:rFonts w:ascii="Times New Roman" w:hAnsi="Times New Roman" w:cs="Times New Roman"/>
-          <w:iCs/>
-        </w:rPr>
-        <w:t xml:space="preserve"> </w:t>
-      </w:r>
-      <w:r>
-        <w:rPr>
-          <w:rFonts w:ascii="Times New Roman" w:hAnsi="Times New Roman" w:cs="Times New Roman"/>
-          <w:iCs/>
-        </w:rPr>
-        <w:t xml:space="preserve">for tuition and room and board </w:t>
-      </w:r>
-      <w:r>
-        <w:rPr>
-          <w:rFonts w:ascii="Times New Roman" w:hAnsi="Times New Roman" w:cs="Times New Roman"/>
-          <w:iCs/>
-        </w:rPr>
-        <w:t>–</w:t>
-      </w:r>
-      <w:r>
-        <w:rPr>
-          <w:rFonts w:ascii="Times New Roman" w:hAnsi="Times New Roman" w:cs="Times New Roman"/>
-          <w:iCs/>
-        </w:rPr>
-        <w:t xml:space="preserve"> one would expect an 18-24-year-old participation rate drop of about three-quarters of a percentage</w:t>
-      </w:r>
-      <w:r>
-        <w:rPr>
-          <w:rFonts w:ascii="Times New Roman" w:hAnsi="Times New Roman" w:cs="Times New Roman"/>
-          <w:iCs/>
-        </w:rPr>
-        <w:t xml:space="preserve"> </w:t>
-      </w:r>
-      <w:r>
-        <w:rPr>
-          <w:rFonts w:ascii="Times New Roman" w:hAnsi="Times New Roman" w:cs="Times New Roman"/>
-          <w:iCs/>
-        </w:rPr>
-        <w:t>point.</w:t>
-      </w:r>
-      <w:r>
-        <w:rPr>
-          <w:rFonts w:ascii="Times New Roman" w:hAnsi="Times New Roman" w:cs="Times New Roman"/>
-          <w:iCs/>
-        </w:rPr>
-        <w:t xml:space="preserve"> </w:t>
-      </w:r>
-      <w:r>
-        <w:rPr>
-          <w:rFonts w:ascii="Times New Roman" w:hAnsi="Times New Roman" w:cs="Times New Roman"/>
-          <w:iCs/>
-        </w:rPr>
-        <w:t>Since the national higher education participation rate was about 0.33 in 1982, U.S. enrollments would decline by about 2.1 percent for each $ 100 price increase, all other factors equal.</w:t>
-      </w:r>
-      <w:r>
-        <w:rPr>
-          <w:rFonts w:ascii="Times New Roman" w:hAnsi="Times New Roman" w:cs="Times New Roman"/>
-          <w:iCs/>
-        </w:rPr>
-        <w:t xml:space="preserve"> This implies a price elasticity of about -0.73</w:t>
-      </w:r>
-      <w:r>
-        <w:rPr>
-          <w:rStyle w:val="FootnoteReference"/>
-          <w:rFonts w:ascii="Times New Roman" w:hAnsi="Times New Roman" w:cs="Times New Roman"/>
-          <w:iCs/>
-        </w:rPr>
-        <w:footnoteReference w:id="1"/>
-      </w:r>
-      <w:r>
-        <w:rPr>
-          <w:rFonts w:ascii="Times New Roman" w:hAnsi="Times New Roman" w:cs="Times New Roman"/>
-          <w:iCs/>
-        </w:rPr>
-        <w:t xml:space="preserve"> which is largely consistent with some of our own estimates. </w:t>
-      </w:r>
-    </w:p>
-    <w:p>
-      <w:pPr>
-        <w:spacing w:line="360" w:lineRule="auto"/>
-        <w:ind w:firstLine="720"/>
-        <w:outlineLvl w:val="1"/>
-        <w:rPr>
-          <w:rFonts w:ascii="Times New Roman" w:hAnsi="Times New Roman" w:cs="Times New Roman"/>
-          <w:iCs/>
-        </w:rPr>
-      </w:pPr>
-      <w:proofErr w:type="spellStart"/>
-      <w:r>
-        <w:rPr>
-          <w:rFonts w:ascii="Times New Roman" w:hAnsi="Times New Roman" w:cs="Times New Roman"/>
-          <w:iCs/>
-        </w:rPr>
-        <w:t>Savoca</w:t>
-      </w:r>
-      <w:proofErr w:type="spellEnd"/>
-      <w:r>
-        <w:rPr>
-          <w:rFonts w:ascii="Times New Roman" w:hAnsi="Times New Roman" w:cs="Times New Roman"/>
-          <w:iCs/>
-        </w:rPr>
-        <w:t xml:space="preserve"> (1990) argues that standard enrollment-based estimates understate true demand sensitivity by conflating application behavior with admissions and matriculation </w:t>
-      </w:r>
-      <w:r>
-        <w:rPr>
-          <w:rFonts w:ascii="Times New Roman" w:hAnsi="Times New Roman" w:cs="Times New Roman"/>
-          <w:iCs/>
-        </w:rPr>
-        <w:lastRenderedPageBreak/>
-        <w:t xml:space="preserve">decisions. Under the assumption that tuition and admissions policy are set independently, the price elasticity of enrollment equals the sum of the application and matriculation elasticities </w:t>
-      </w:r>
-      <w:r>
-        <w:rPr>
-          <w:rFonts w:ascii="Times New Roman" w:hAnsi="Times New Roman" w:cs="Times New Roman"/>
-          <w:iCs/>
-        </w:rPr>
-        <w:t>–</w:t>
-      </w:r>
-      <w:r>
-        <w:rPr>
-          <w:rFonts w:ascii="Times New Roman" w:hAnsi="Times New Roman" w:cs="Times New Roman"/>
-          <w:iCs/>
-        </w:rPr>
-        <w:t xml:space="preserve"> a combined figure she estimates at −0.49, suggesting the true demand elasticity may be more than twice as large as conventional estimates.</w:t>
-      </w:r>
-      <w:r>
-        <w:rPr>
-          <w:rFonts w:ascii="Times New Roman" w:hAnsi="Times New Roman" w:cs="Times New Roman"/>
-          <w:iCs/>
-        </w:rPr>
-        <w:t xml:space="preserve"> Following the modern wave of more robust causal evidence,</w:t>
-      </w:r>
-      <w:r>
-        <w:rPr>
-          <w:rFonts w:ascii="Times New Roman" w:hAnsi="Times New Roman" w:cs="Times New Roman"/>
-          <w:iCs/>
-        </w:rPr>
-        <w:t xml:space="preserve"> </w:t>
-      </w:r>
-      <w:proofErr w:type="spellStart"/>
-      <w:r>
-        <w:rPr>
-          <w:rFonts w:ascii="Times New Roman" w:hAnsi="Times New Roman" w:cs="Times New Roman"/>
-          <w:iCs/>
-        </w:rPr>
-        <w:t>Dwenger</w:t>
-      </w:r>
-      <w:proofErr w:type="spellEnd"/>
-      <w:r>
-        <w:rPr>
-          <w:rFonts w:ascii="Times New Roman" w:hAnsi="Times New Roman" w:cs="Times New Roman"/>
-          <w:iCs/>
-        </w:rPr>
-        <w:t xml:space="preserve"> et al. (2012) corroborate this direction of effect in a different setting</w:t>
-      </w:r>
-      <w:r>
-        <w:rPr>
-          <w:rFonts w:ascii="Times New Roman" w:hAnsi="Times New Roman" w:cs="Times New Roman"/>
-          <w:iCs/>
-        </w:rPr>
-        <w:t xml:space="preserve"> –</w:t>
-      </w:r>
-      <w:r>
-        <w:rPr>
-          <w:rFonts w:ascii="Times New Roman" w:hAnsi="Times New Roman" w:cs="Times New Roman"/>
-          <w:iCs/>
-        </w:rPr>
-        <w:t xml:space="preserve"> among German high-school graduates, residing in a state with tuition fees reduces the probability of applying to a home-state university by 2 percentage points (against a baseline of 69%), with stronger responses among higher-achieving students.</w:t>
-      </w:r>
-    </w:p>
-    <w:p>
-      <w:pPr>
-        <w:spacing w:line="360" w:lineRule="auto"/>
-        <w:ind w:firstLine="720"/>
-        <w:outlineLvl w:val="1"/>
-        <w:rPr>
-          <w:rFonts w:ascii="Times New Roman" w:hAnsi="Times New Roman" w:cs="Times New Roman"/>
-          <w:iCs/>
-        </w:rPr>
-      </w:pPr>
-      <w:r>
-        <w:rPr>
-          <w:rFonts w:ascii="Times New Roman" w:hAnsi="Times New Roman" w:cs="Times New Roman"/>
-          <w:iCs/>
-        </w:rPr>
-        <w:t xml:space="preserve">To understand why the Brexit derived elasticities </w:t>
-      </w:r>
-      <w:r>
-        <w:rPr>
-          <w:rFonts w:ascii="Times New Roman" w:hAnsi="Times New Roman" w:cs="Times New Roman"/>
-          <w:iCs/>
-        </w:rPr>
-        <w:t>may</w:t>
-      </w:r>
-      <w:r>
-        <w:rPr>
-          <w:rFonts w:ascii="Times New Roman" w:hAnsi="Times New Roman" w:cs="Times New Roman"/>
-          <w:iCs/>
-        </w:rPr>
-        <w:t xml:space="preserve"> be larger</w:t>
-      </w:r>
-      <w:r>
-        <w:rPr>
-          <w:rFonts w:ascii="Times New Roman" w:hAnsi="Times New Roman" w:cs="Times New Roman"/>
-          <w:iCs/>
-        </w:rPr>
-        <w:t xml:space="preserve"> compared to the standard estimated listed,</w:t>
-      </w:r>
-      <w:r>
-        <w:rPr>
-          <w:rFonts w:ascii="Times New Roman" w:hAnsi="Times New Roman" w:cs="Times New Roman"/>
-          <w:iCs/>
-        </w:rPr>
-        <w:t xml:space="preserve"> it is noteworthy to consider, for example,</w:t>
-      </w:r>
-      <w:r>
-        <w:rPr>
-          <w:rFonts w:ascii="Times New Roman" w:hAnsi="Times New Roman" w:cs="Times New Roman"/>
-          <w:iCs/>
-        </w:rPr>
-        <w:t xml:space="preserve"> </w:t>
-      </w:r>
-      <w:r>
-        <w:rPr>
-          <w:rFonts w:ascii="Times New Roman" w:hAnsi="Times New Roman" w:cs="Times New Roman"/>
-          <w:iCs/>
-        </w:rPr>
-        <w:t>Heller (1997)</w:t>
-      </w:r>
-      <w:r>
-        <w:rPr>
-          <w:rFonts w:ascii="Times New Roman" w:hAnsi="Times New Roman" w:cs="Times New Roman"/>
-          <w:iCs/>
-        </w:rPr>
-        <w:t xml:space="preserve"> who</w:t>
-      </w:r>
-      <w:r>
-        <w:rPr>
-          <w:rFonts w:ascii="Times New Roman" w:hAnsi="Times New Roman" w:cs="Times New Roman"/>
-          <w:iCs/>
-        </w:rPr>
-        <w:t xml:space="preserve"> </w:t>
-      </w:r>
-      <w:r>
-        <w:rPr>
-          <w:rFonts w:ascii="Times New Roman" w:hAnsi="Times New Roman" w:cs="Times New Roman"/>
-          <w:iCs/>
-        </w:rPr>
-        <w:t xml:space="preserve">also uncovers several structural factors about demand elasticities that will later become relevant for our results. </w:t>
-      </w:r>
-      <w:r>
-        <w:rPr>
-          <w:rFonts w:ascii="Times New Roman" w:hAnsi="Times New Roman" w:cs="Times New Roman"/>
-          <w:iCs/>
-        </w:rPr>
-        <w:t>First, t</w:t>
-      </w:r>
-      <w:r>
-        <w:rPr>
-          <w:rFonts w:ascii="Times New Roman" w:hAnsi="Times New Roman" w:cs="Times New Roman"/>
-          <w:iCs/>
-        </w:rPr>
-        <w:t>uition increases reduce enrolment</w:t>
-      </w:r>
-      <w:r>
-        <w:rPr>
-          <w:rFonts w:ascii="Times New Roman" w:hAnsi="Times New Roman" w:cs="Times New Roman"/>
-          <w:iCs/>
-        </w:rPr>
-        <w:t xml:space="preserve"> (so higher education is not a luxury good)</w:t>
-      </w:r>
-      <w:r>
-        <w:rPr>
-          <w:rFonts w:ascii="Times New Roman" w:hAnsi="Times New Roman" w:cs="Times New Roman"/>
-          <w:iCs/>
-        </w:rPr>
-        <w:t xml:space="preserve">. The </w:t>
-      </w:r>
-      <w:r>
-        <w:rPr>
-          <w:rFonts w:ascii="Times New Roman" w:hAnsi="Times New Roman" w:cs="Times New Roman"/>
-          <w:iCs/>
-        </w:rPr>
-        <w:t xml:space="preserve">studies </w:t>
-      </w:r>
-      <w:r>
-        <w:rPr>
-          <w:rFonts w:ascii="Times New Roman" w:hAnsi="Times New Roman" w:cs="Times New Roman"/>
-          <w:iCs/>
-        </w:rPr>
-        <w:t>reviewed</w:t>
-      </w:r>
-      <w:r>
-        <w:rPr>
-          <w:rFonts w:ascii="Times New Roman" w:hAnsi="Times New Roman" w:cs="Times New Roman"/>
-          <w:iCs/>
-        </w:rPr>
-        <w:t xml:space="preserve"> by </w:t>
-      </w:r>
-      <w:r>
-        <w:rPr>
-          <w:rFonts w:ascii="Times New Roman" w:hAnsi="Times New Roman" w:cs="Times New Roman"/>
-          <w:iCs/>
-        </w:rPr>
-        <w:t>Heller (1997)</w:t>
-      </w:r>
-      <w:r>
-        <w:rPr>
-          <w:rFonts w:ascii="Times New Roman" w:hAnsi="Times New Roman" w:cs="Times New Roman"/>
-          <w:iCs/>
-        </w:rPr>
-        <w:t xml:space="preserve"> </w:t>
-      </w:r>
-      <w:r>
-        <w:rPr>
-          <w:rFonts w:ascii="Times New Roman" w:hAnsi="Times New Roman" w:cs="Times New Roman"/>
-          <w:iCs/>
-        </w:rPr>
-        <w:t>converge on the finding that each $100 tuition increase lowers enrolment by roughly 0.5 to 1.0 percentage points, consistent with Leslie and Brinkman (1987). Reductions in financial aid also reduce enrolment, though the effect varies by aid type. Lower-income students are more sensitive to changes in tuition and aid than middle- and upper-income students.</w:t>
-      </w:r>
-      <w:r>
-        <w:rPr>
-          <w:rFonts w:ascii="Times New Roman" w:hAnsi="Times New Roman" w:cs="Times New Roman"/>
-          <w:iCs/>
-        </w:rPr>
-        <w:t xml:space="preserve"> </w:t>
-      </w:r>
-      <w:r>
-        <w:rPr>
-          <w:rFonts w:ascii="Times New Roman" w:hAnsi="Times New Roman" w:cs="Times New Roman"/>
-          <w:iCs/>
-        </w:rPr>
-        <w:t xml:space="preserve">The results presented in </w:t>
-      </w:r>
-      <w:proofErr w:type="spellStart"/>
-      <w:r>
-        <w:rPr>
-          <w:rFonts w:ascii="Times New Roman" w:hAnsi="Times New Roman" w:cs="Times New Roman"/>
-          <w:iCs/>
-        </w:rPr>
-        <w:t>Hemelt</w:t>
-      </w:r>
-      <w:proofErr w:type="spellEnd"/>
-      <w:r>
-        <w:rPr>
-          <w:rFonts w:ascii="Times New Roman" w:hAnsi="Times New Roman" w:cs="Times New Roman"/>
-          <w:iCs/>
-        </w:rPr>
-        <w:t xml:space="preserve"> and Marcotte</w:t>
-      </w:r>
-      <w:r>
-        <w:rPr>
-          <w:rFonts w:ascii="Times New Roman" w:hAnsi="Times New Roman" w:cs="Times New Roman"/>
-          <w:iCs/>
-        </w:rPr>
-        <w:t xml:space="preserve"> (2011)</w:t>
-      </w:r>
-      <w:r>
-        <w:rPr>
-          <w:rFonts w:ascii="Times New Roman" w:hAnsi="Times New Roman" w:cs="Times New Roman"/>
-          <w:iCs/>
-        </w:rPr>
-        <w:t xml:space="preserve"> are </w:t>
-      </w:r>
-      <w:r>
-        <w:rPr>
-          <w:rFonts w:ascii="Times New Roman" w:hAnsi="Times New Roman" w:cs="Times New Roman"/>
-          <w:iCs/>
-        </w:rPr>
-        <w:t xml:space="preserve">also </w:t>
-      </w:r>
-      <w:r>
-        <w:rPr>
-          <w:rFonts w:ascii="Times New Roman" w:hAnsi="Times New Roman" w:cs="Times New Roman"/>
-          <w:iCs/>
-        </w:rPr>
-        <w:t xml:space="preserve">relevant because they confirm the standard negative relationship between tuition and enrolment, but their design is </w:t>
-      </w:r>
-      <w:r>
-        <w:rPr>
-          <w:rFonts w:ascii="Times New Roman" w:hAnsi="Times New Roman" w:cs="Times New Roman"/>
-          <w:iCs/>
-        </w:rPr>
-        <w:t xml:space="preserve">also </w:t>
-      </w:r>
-      <w:r>
-        <w:rPr>
-          <w:rFonts w:ascii="Times New Roman" w:hAnsi="Times New Roman" w:cs="Times New Roman"/>
-          <w:iCs/>
-        </w:rPr>
-        <w:t xml:space="preserve">not directly comparable to Brexit. Their estimates come from domestic U.S. public universities and enrolment outcomes, while the present paper studies international UCAS applications before admissions rationing and exploits a large policy-induced price </w:t>
-      </w:r>
-      <w:r>
-        <w:rPr>
-          <w:rFonts w:ascii="Times New Roman" w:hAnsi="Times New Roman" w:cs="Times New Roman"/>
-          <w:iCs/>
-        </w:rPr>
-        <w:t>shock.</w:t>
-      </w:r>
-      <w:r>
-        <w:rPr>
-          <w:rFonts w:ascii="Times New Roman" w:hAnsi="Times New Roman" w:cs="Times New Roman"/>
-          <w:iCs/>
-        </w:rPr>
-        <w:t xml:space="preserve"> </w:t>
+        <w:t xml:space="preserve"> and Marcotte (2011) are also relevant because they confirm the standard negative relationship between tuition and enrolment, but their design is also not directly comparable to Brexit. </w:t>
       </w:r>
     </w:p>
     <w:p>
@@ -1967,24 +846,15 @@
         <w:rPr>
           <w:rFonts w:ascii="Times New Roman" w:hAnsi="Times New Roman" w:cs="Times New Roman"/>
           <w:iCs/>
-          <w:highlight w:val="yellow"/>
         </w:rPr>
       </w:pPr>
       <w:r>
         <w:rPr>
           <w:rFonts w:ascii="Times New Roman" w:hAnsi="Times New Roman" w:cs="Times New Roman"/>
           <w:iCs/>
-          <w:highlight w:val="yellow"/>
-        </w:rPr>
-        <w:t>Another branch in the literature are the</w:t>
-      </w:r>
-      <w:r>
-        <w:rPr>
-          <w:rFonts w:ascii="Times New Roman" w:hAnsi="Times New Roman" w:cs="Times New Roman"/>
-          <w:iCs/>
-          <w:highlight w:val="yellow"/>
-        </w:rPr>
-        <w:t xml:space="preserve"> BLP-type models derive elasticities from estimated heterogeneity in preferences across differentiated alternatives, the present design derives elasticity from observed variation in exposure to a large policy-induced price shock. The former is better suited for recovering substitution matrices across choices; the latter is better suited for identifying a destination-level demand response to a discrete change in the relative price of UK higher education.</w:t>
+        </w:rPr>
+        <w:lastRenderedPageBreak/>
+        <w:t>Another branch in the literature is the BLP-type models, which derive elasticities from estimated heterogeneity in preferences across differentiated alternatives; the present design derives elasticity from observed variation in exposure to a large policy-induced price shock. The former is better suited for recovering substitution matrices across choices; the latter is better suited for identifying a destination-level demand response to a discrete change in the relative price of UK higher education.</w:t>
       </w:r>
     </w:p>
     <w:p>
@@ -2014,51 +884,138 @@
     </w:p>
     <w:p>
       <w:pPr>
-        <w:pStyle w:val="NormalWeb"/>
-        <w:spacing w:before="0" w:beforeAutospacing="0" w:after="0" w:afterAutospacing="0" w:line="360" w:lineRule="auto"/>
-        <w:ind w:firstLine="360"/>
-      </w:pPr>
-      <w:r>
-        <w:t xml:space="preserve">The primary data source is the most recent release of the UCAS database (2025), covering application cycles from 2016 to 2025. UCAS provides centralized information on applications to UK higher education institutions, allowing us to observe applicant behavior </w:t>
-      </w:r>
-      <w:r>
-        <w:lastRenderedPageBreak/>
-        <w:t>prior to admissions decisions. This is particularly important for our empirical design, as applications capture expressed demand before institutional rationing takes place. The dataset reports application counts by country of domicile along with additional demographic breakdowns. In this study, application series are constructed by aggregating counts across all available categories of sex and gender to obtain total demand from each origin country, while nationality is retained as the key dimension of variation.</w:t>
-      </w:r>
-      <w:r>
-        <w:t xml:space="preserve"> </w:t>
+        <w:pStyle w:val="Caption"/>
+        <w:keepNext/>
+        <w:spacing w:line="360" w:lineRule="auto"/>
+        <w:rPr>
+          <w:rFonts w:ascii="Times New Roman" w:eastAsia="Times New Roman" w:hAnsi="Times New Roman" w:cs="Times New Roman"/>
+          <w:i w:val="0"/>
+          <w:iCs w:val="0"/>
+          <w:color w:val="auto"/>
+          <w:kern w:val="0"/>
+          <w:sz w:val="24"/>
+          <w:szCs w:val="24"/>
+          <w:lang w:eastAsia="en-GB"/>
+          <w14:ligatures w14:val="none"/>
+        </w:rPr>
+      </w:pPr>
+      <w:r>
+        <w:rPr>
+          <w:rFonts w:ascii="Times New Roman" w:eastAsia="Times New Roman" w:hAnsi="Times New Roman" w:cs="Times New Roman"/>
+          <w:i w:val="0"/>
+          <w:iCs w:val="0"/>
+          <w:color w:val="auto"/>
+          <w:kern w:val="0"/>
+          <w:sz w:val="24"/>
+          <w:szCs w:val="24"/>
+          <w:lang w:eastAsia="en-GB"/>
+          <w14:ligatures w14:val="none"/>
+        </w:rPr>
+        <w:t xml:space="preserve">The primary data source is the most recent release of the UCAS database (2025), covering application cycles from 2016 to 2025. UCAS provides centralized information on applications to UK higher education institutions, enabling us to observe applicant behavior before admissions decisions are made. This is particularly important for our empirical design, as applications capture expressed demand before institutional rationing takes place. The dataset reports application counts by country of domicile along with additional demographic breakdowns. In this study, application series are constructed by aggregating counts across all available categories of sex and gender to obtain total demand from each origin country, while nationality is retained as the key dimension of variation. </w:t>
       </w:r>
     </w:p>
     <w:p>
       <w:pPr>
-        <w:pStyle w:val="NormalWeb"/>
-        <w:spacing w:before="0" w:beforeAutospacing="0" w:after="0" w:afterAutospacing="0" w:line="360" w:lineRule="auto"/>
-        <w:ind w:firstLine="360"/>
-      </w:pPr>
-      <w:r>
-        <w:t xml:space="preserve">It is a natural extension of this manuscript for other researcher to derive gender specific, age specific or even subject specific elasticities with the same data. However, we decided to focus on crude aggregates for space concerns but this option was discussed prior to this article conceptualization. </w:t>
+        <w:pStyle w:val="Caption"/>
+        <w:keepNext/>
+        <w:spacing w:line="360" w:lineRule="auto"/>
+        <w:ind w:firstLine="720"/>
+        <w:rPr>
+          <w:rFonts w:ascii="Times New Roman" w:eastAsia="Times New Roman" w:hAnsi="Times New Roman" w:cs="Times New Roman"/>
+          <w:i w:val="0"/>
+          <w:iCs w:val="0"/>
+          <w:color w:val="auto"/>
+          <w:kern w:val="0"/>
+          <w:sz w:val="24"/>
+          <w:szCs w:val="24"/>
+          <w:lang w:eastAsia="en-GB"/>
+          <w14:ligatures w14:val="none"/>
+        </w:rPr>
+      </w:pPr>
+      <w:r>
+        <w:rPr>
+          <w:rFonts w:ascii="Times New Roman" w:eastAsia="Times New Roman" w:hAnsi="Times New Roman" w:cs="Times New Roman"/>
+          <w:i w:val="0"/>
+          <w:iCs w:val="0"/>
+          <w:color w:val="auto"/>
+          <w:kern w:val="0"/>
+          <w:sz w:val="24"/>
+          <w:szCs w:val="24"/>
+          <w:lang w:eastAsia="en-GB"/>
+          <w14:ligatures w14:val="none"/>
+        </w:rPr>
+        <w:t xml:space="preserve">It is a natural extension of this manuscript for other researchers to derive gender-, age-, or even subject-specific elasticities from the same data. However, we decided to focus on crude aggregates for space concerns, but this option was discussed prior to the conceptualization of this article. </w:t>
       </w:r>
     </w:p>
     <w:p>
       <w:pPr>
-        <w:pStyle w:val="NormalWeb"/>
-        <w:spacing w:before="0" w:beforeAutospacing="0" w:after="0" w:afterAutospacing="0" w:line="360" w:lineRule="auto"/>
-        <w:ind w:firstLine="360"/>
-      </w:pPr>
-      <w:r>
-        <w:t xml:space="preserve">The unit of observation is the origin country–year, yielding a panel dataset that includes both EU countries (treated group) and a set of non-EU countries used to construct the synthetic control group. The main outcome variable is the logarithm of the number of applications from country </w:t>
+        <w:pStyle w:val="Caption"/>
+        <w:keepNext/>
+        <w:spacing w:after="0" w:line="360" w:lineRule="auto"/>
+        <w:ind w:firstLine="720"/>
+        <w:rPr>
+          <w:rFonts w:ascii="Times New Roman" w:eastAsia="Times New Roman" w:hAnsi="Times New Roman" w:cs="Times New Roman"/>
+          <w:i w:val="0"/>
+          <w:iCs w:val="0"/>
+          <w:color w:val="auto"/>
+          <w:kern w:val="0"/>
+          <w:sz w:val="24"/>
+          <w:szCs w:val="24"/>
+          <w:lang w:eastAsia="en-GB"/>
+          <w14:ligatures w14:val="none"/>
+        </w:rPr>
+      </w:pPr>
+      <w:r>
+        <w:rPr>
+          <w:rFonts w:ascii="Times New Roman" w:eastAsia="Times New Roman" w:hAnsi="Times New Roman" w:cs="Times New Roman"/>
+          <w:i w:val="0"/>
+          <w:iCs w:val="0"/>
+          <w:color w:val="auto"/>
+          <w:kern w:val="0"/>
+          <w:sz w:val="24"/>
+          <w:szCs w:val="24"/>
+          <w:lang w:eastAsia="en-GB"/>
+          <w14:ligatures w14:val="none"/>
+        </w:rPr>
+        <w:t xml:space="preserve">The unit of observation is the origin-country–year, yielding a panel dataset that includes both EU countries (the treated group) and non-EU countries used to construct the “pseudo EU” (the artificial control group). The main outcome variable is the logarithm of the number of applications from country </w:t>
       </w:r>
       <w:proofErr w:type="spellStart"/>
       <w:r>
+        <w:rPr>
+          <w:rFonts w:ascii="Times New Roman" w:eastAsia="Times New Roman" w:hAnsi="Times New Roman" w:cs="Times New Roman"/>
+          <w:i w:val="0"/>
+          <w:iCs w:val="0"/>
+          <w:color w:val="auto"/>
+          <w:kern w:val="0"/>
+          <w:sz w:val="24"/>
+          <w:szCs w:val="24"/>
+          <w:lang w:eastAsia="en-GB"/>
+          <w14:ligatures w14:val="none"/>
+        </w:rPr>
         <w:t>i</w:t>
       </w:r>
       <w:proofErr w:type="spellEnd"/>
       <w:r>
-        <w:t xml:space="preserve"> in year t, which captures cross-country variation in demand over time. To analyze heterogeneity in responses to the Brexit-induced tuition shock, the UCAS data are merged with macroeconomic indicators, including GDP per capita and labor market variables obtained from World Bank sources.</w:t>
-      </w:r>
-      <w:r>
-        <w:t xml:space="preserve"> The descriptive statistics are presented on table 1. </w:t>
-      </w:r>
+        <w:rPr>
+          <w:rFonts w:ascii="Times New Roman" w:eastAsia="Times New Roman" w:hAnsi="Times New Roman" w:cs="Times New Roman"/>
+          <w:i w:val="0"/>
+          <w:iCs w:val="0"/>
+          <w:color w:val="auto"/>
+          <w:kern w:val="0"/>
+          <w:sz w:val="24"/>
+          <w:szCs w:val="24"/>
+          <w:lang w:eastAsia="en-GB"/>
+          <w14:ligatures w14:val="none"/>
+        </w:rPr>
+        <w:t xml:space="preserve"> in year t, which captures cross-country variation in demand over time. To analyze heterogeneity in responses to the Brexit-induced tuition shock, the UCAS data are merged with macroeconomic indicators, including GDP per capita and labor-market variables from the World Bank. The descriptive statistics are presented in Table 1. </w:t>
+      </w:r>
+    </w:p>
+    <w:p>
+      <w:pPr>
+        <w:rPr>
+          <w:lang w:eastAsia="en-GB"/>
+        </w:rPr>
+      </w:pPr>
     </w:p>
     <w:p>
       <w:pPr>
@@ -2237,6 +1194,7 @@
               <w:rPr>
                 <w:b/>
               </w:rPr>
+              <w:lastRenderedPageBreak/>
               <w:t>Group:</w:t>
             </w:r>
           </w:p>
@@ -2819,21 +1777,57 @@
       </w:pPr>
       <w:r>
         <w:tab/>
-        <w:t>It is also important to note that we use country level data and not university specific data (as in Sa (2019)</w:t>
-      </w:r>
-      <w:r>
-        <w:t xml:space="preserve"> for example</w:t>
-      </w:r>
-      <w:r>
-        <w:t xml:space="preserve">) because of an internal limitation of the UCAS data itself. </w:t>
-      </w:r>
-      <w:r>
-        <w:t xml:space="preserve">Once a student creates a registration within the UCAS web portal he has the ability to choose up to 5 universities at once. Furthermore, he can be accepted to all five of them. This creates double and sometimes triple counting of the same applicant. This internal limitation is not </w:t>
-      </w:r>
-      <w:r>
-        <w:lastRenderedPageBreak/>
-        <w:t xml:space="preserve">present when the series are country-level aggregated because one applicant, in this design, can be counted only once per country. </w:t>
-      </w:r>
+      </w:r>
+      <w:r>
+        <w:t>It is also important to note that we use country-level data and not university-specific data (as in Sa (201</w:t>
+      </w:r>
+      <w:r>
+        <w:t>4</w:t>
+      </w:r>
+      <w:r>
+        <w:t>)</w:t>
+      </w:r>
+      <w:r>
+        <w:t xml:space="preserve"> or </w:t>
+      </w:r>
+      <w:r>
+        <w:rPr>
+          <w:bCs/>
+        </w:rPr>
+        <w:t>Clifton-</w:t>
+      </w:r>
+      <w:proofErr w:type="spellStart"/>
+      <w:r>
+        <w:rPr>
+          <w:bCs/>
+        </w:rPr>
+        <w:t>Sprigg</w:t>
+      </w:r>
+      <w:proofErr w:type="spellEnd"/>
+      <w:r>
+        <w:rPr>
+          <w:bCs/>
+        </w:rPr>
+        <w:t xml:space="preserve"> et. al</w:t>
+      </w:r>
+      <w:r>
+        <w:t xml:space="preserve"> (2025)</w:t>
+      </w:r>
+      <w:r>
+        <w:t xml:space="preserve">, for example) because of an internal limitation of the UCAS data itself. Once a student creates a registration in the UCAS web portal, they can choose up to 5 universities at once. Furthermore, the student can be accepted to all five of them. This results in double, and sometimes triple, counting of the same applicant. This internal limitation is absent when the series is country-level aggregated, because in this design, each applicant is counted only once per country. </w:t>
+      </w:r>
+    </w:p>
+    <w:p>
+      <w:pPr>
+        <w:pStyle w:val="NormalWeb"/>
+        <w:spacing w:before="0" w:beforeAutospacing="0" w:after="0" w:afterAutospacing="0" w:line="360" w:lineRule="auto"/>
+        <w:rPr>
+          <w:b/>
+          <w:i/>
+          <w:iCs/>
+          <w:sz w:val="28"/>
+        </w:rPr>
+      </w:pPr>
     </w:p>
     <w:p>
       <w:pPr>
@@ -2842,7 +1836,7 @@
           <w:ilvl w:val="0"/>
           <w:numId w:val="35"/>
         </w:numPr>
-        <w:spacing w:before="240" w:beforeAutospacing="0" w:after="240" w:afterAutospacing="0" w:line="360" w:lineRule="auto"/>
+        <w:spacing w:before="0" w:beforeAutospacing="0" w:after="0" w:afterAutospacing="0" w:line="360" w:lineRule="auto"/>
         <w:rPr>
           <w:b/>
           <w:i/>
@@ -2984,6 +1978,7 @@
         <w:ind w:firstLine="720"/>
       </w:pPr>
       <w:r>
+        <w:lastRenderedPageBreak/>
         <w:t xml:space="preserve">The resulting donor pool </w:t>
       </w:r>
       <w:r>
@@ -3174,14 +2169,7 @@
         <w:rPr>
           <w:rFonts w:ascii="Times New Roman" w:eastAsiaTheme="minorEastAsia" w:hAnsi="Times New Roman" w:cs="Times New Roman"/>
         </w:rPr>
-        <w:t xml:space="preserve">which was expected due to the </w:t>
-      </w:r>
-      <w:r>
-        <w:rPr>
-          <w:rFonts w:ascii="Times New Roman" w:eastAsiaTheme="minorEastAsia" w:hAnsi="Times New Roman" w:cs="Times New Roman"/>
-        </w:rPr>
-        <w:lastRenderedPageBreak/>
-        <w:t>macroeconomic convergence in the region</w:t>
+        <w:t>which was expected due to the macroeconomic convergence in the region</w:t>
       </w:r>
       <w:r>
         <w:rPr>
@@ -3417,311 +2405,41 @@
     <w:p>
       <w:pPr>
         <w:spacing w:line="360" w:lineRule="auto"/>
-        <w:rPr>
-          <w:rFonts w:ascii="Times New Roman" w:hAnsi="Times New Roman" w:cs="Times New Roman"/>
-        </w:rPr>
-      </w:pPr>
-      <w:r>
-        <w:rPr>
-          <w:rFonts w:ascii="Times New Roman" w:hAnsi="Times New Roman" w:cs="Times New Roman"/>
-        </w:rPr>
-        <w:t>In comparable perspective for the closest design to ours</w:t>
-      </w:r>
-      <w:r>
-        <w:rPr>
-          <w:rFonts w:ascii="Times New Roman" w:hAnsi="Times New Roman" w:cs="Times New Roman"/>
-        </w:rPr>
-        <w:t xml:space="preserve"> </w:t>
-      </w:r>
-      <w:r>
-        <w:rPr>
-          <w:rFonts w:ascii="Times New Roman" w:hAnsi="Times New Roman" w:cs="Times New Roman"/>
-        </w:rPr>
-        <w:t>–</w:t>
-      </w:r>
-      <w:r>
-        <w:rPr>
-          <w:rFonts w:ascii="Times New Roman" w:hAnsi="Times New Roman" w:cs="Times New Roman"/>
-        </w:rPr>
-        <w:t xml:space="preserve"> </w:t>
-      </w:r>
-      <w:r>
-        <w:rPr>
-          <w:rFonts w:ascii="Times New Roman" w:hAnsi="Times New Roman" w:cs="Times New Roman"/>
-        </w:rPr>
-        <w:t xml:space="preserve">Sá </w:t>
-      </w:r>
-      <w:r>
-        <w:rPr>
-          <w:rFonts w:ascii="Times New Roman" w:hAnsi="Times New Roman" w:cs="Times New Roman"/>
-        </w:rPr>
-        <w:t>(2019)</w:t>
-      </w:r>
-      <w:r>
-        <w:rPr>
-          <w:rFonts w:ascii="Times New Roman" w:hAnsi="Times New Roman" w:cs="Times New Roman"/>
-        </w:rPr>
-        <w:t xml:space="preserve"> –</w:t>
-      </w:r>
-      <w:r>
-        <w:rPr>
-          <w:rFonts w:ascii="Times New Roman" w:hAnsi="Times New Roman" w:cs="Times New Roman"/>
-        </w:rPr>
-        <w:t xml:space="preserve"> </w:t>
-      </w:r>
-      <w:r>
-        <w:rPr>
-          <w:rFonts w:ascii="Times New Roman" w:hAnsi="Times New Roman" w:cs="Times New Roman"/>
-        </w:rPr>
-        <w:t>exploits within-country, across-time variation in fees</w:t>
-      </w:r>
-      <w:r>
-        <w:rPr>
-          <w:rFonts w:ascii="Times New Roman" w:hAnsi="Times New Roman" w:cs="Times New Roman"/>
-        </w:rPr>
-        <w:t xml:space="preserve">. This essentially represents the </w:t>
-      </w:r>
-      <w:r>
-        <w:rPr>
-          <w:rFonts w:ascii="Times New Roman" w:hAnsi="Times New Roman" w:cs="Times New Roman"/>
-        </w:rPr>
-        <w:t>same students facing different prices at different points in time, across two UK nations. The treatment is binary and uniform</w:t>
-      </w:r>
-      <w:r>
-        <w:rPr>
-          <w:rFonts w:ascii="Times New Roman" w:hAnsi="Times New Roman" w:cs="Times New Roman"/>
-        </w:rPr>
-        <w:t xml:space="preserve"> as </w:t>
-      </w:r>
-      <w:r>
-        <w:rPr>
-          <w:rFonts w:ascii="Times New Roman" w:hAnsi="Times New Roman" w:cs="Times New Roman"/>
-        </w:rPr>
-        <w:t>Scottish students either pay or don't, English students face one fee level then another. There is no cross-sectional variation in the size of the price shock.</w:t>
-      </w:r>
-      <w:r>
-        <w:rPr>
-          <w:rFonts w:ascii="Times New Roman" w:hAnsi="Times New Roman" w:cs="Times New Roman"/>
-        </w:rPr>
-        <w:t xml:space="preserve"> </w:t>
-      </w:r>
-      <w:r>
-        <w:rPr>
-          <w:rFonts w:ascii="Times New Roman" w:hAnsi="Times New Roman" w:cs="Times New Roman"/>
-        </w:rPr>
-        <w:t>In this paper we</w:t>
-      </w:r>
-      <w:r>
-        <w:rPr>
-          <w:rFonts w:ascii="Times New Roman" w:hAnsi="Times New Roman" w:cs="Times New Roman"/>
-        </w:rPr>
-        <w:t xml:space="preserve"> </w:t>
-      </w:r>
-      <w:r>
-        <w:rPr>
-          <w:rFonts w:ascii="Times New Roman" w:hAnsi="Times New Roman" w:cs="Times New Roman"/>
-        </w:rPr>
-        <w:t>exploit</w:t>
-      </w:r>
-      <w:r>
-        <w:rPr>
-          <w:rFonts w:ascii="Times New Roman" w:hAnsi="Times New Roman" w:cs="Times New Roman"/>
-        </w:rPr>
-        <w:t xml:space="preserve"> cross-country, across-time variation where the price shock itself is </w:t>
-      </w:r>
-      <w:r>
-        <w:rPr>
-          <w:rFonts w:ascii="Times New Roman" w:hAnsi="Times New Roman" w:cs="Times New Roman"/>
-        </w:rPr>
-        <w:t>heterogeneous kᵢ</w:t>
-      </w:r>
-      <w:r>
-        <w:rPr>
-          <w:rFonts w:ascii="Times New Roman" w:hAnsi="Times New Roman" w:cs="Times New Roman"/>
-        </w:rPr>
-        <w:t xml:space="preserve"> </w:t>
-      </w:r>
-      <w:r>
-        <w:rPr>
-          <w:rFonts w:ascii="Times New Roman" w:hAnsi="Times New Roman" w:cs="Times New Roman"/>
-        </w:rPr>
-        <w:t xml:space="preserve">that </w:t>
-      </w:r>
-      <w:r>
-        <w:rPr>
-          <w:rFonts w:ascii="Times New Roman" w:hAnsi="Times New Roman" w:cs="Times New Roman"/>
-        </w:rPr>
-        <w:t>differs by country because the present value of the foregone loan differs by average wage. This means the identifying variation has two dimensions simultaneously</w:t>
-      </w:r>
-      <w:r>
-        <w:rPr>
-          <w:rFonts w:ascii="Times New Roman" w:hAnsi="Times New Roman" w:cs="Times New Roman"/>
-        </w:rPr>
-        <w:t xml:space="preserve"> –</w:t>
-      </w:r>
-      <w:r>
-        <w:rPr>
-          <w:rFonts w:ascii="Times New Roman" w:hAnsi="Times New Roman" w:cs="Times New Roman"/>
-        </w:rPr>
-        <w:t xml:space="preserve"> whether you are treated (EU vs. non-EU) and how intensely you are treated (which EU country you are from). Sá</w:t>
-      </w:r>
-      <w:r>
-        <w:rPr>
-          <w:rFonts w:ascii="Times New Roman" w:hAnsi="Times New Roman" w:cs="Times New Roman"/>
-        </w:rPr>
-        <w:t xml:space="preserve"> (2019)</w:t>
-      </w:r>
-      <w:r>
-        <w:rPr>
-          <w:rFonts w:ascii="Times New Roman" w:hAnsi="Times New Roman" w:cs="Times New Roman"/>
-        </w:rPr>
-        <w:t xml:space="preserve"> design cannot separately identify these because all treated students face the same fee change.</w:t>
-      </w:r>
-      <w:r>
-        <w:rPr>
-          <w:rFonts w:ascii="Times New Roman" w:hAnsi="Times New Roman" w:cs="Times New Roman"/>
-        </w:rPr>
-        <w:t xml:space="preserve"> Another aspect of Sa’s design is that </w:t>
-      </w:r>
-      <w:r>
-        <w:rPr>
-          <w:rFonts w:ascii="Times New Roman" w:hAnsi="Times New Roman" w:cs="Times New Roman"/>
-        </w:rPr>
-        <w:t xml:space="preserve">her unit of observation is country × </w:t>
-      </w:r>
+        <w:ind w:firstLine="720"/>
+        <w:rPr>
+          <w:rFonts w:ascii="Times New Roman" w:hAnsi="Times New Roman" w:cs="Times New Roman"/>
+        </w:rPr>
+      </w:pPr>
       <w:r>
         <w:rPr>
           <w:rFonts w:ascii="Times New Roman" w:hAnsi="Times New Roman" w:cs="Times New Roman"/>
         </w:rPr>
         <w:lastRenderedPageBreak/>
-        <w:t>institution × subject × gender × age group × year</w:t>
-      </w:r>
-      <w:r>
-        <w:rPr>
-          <w:rStyle w:val="FootnoteReference"/>
-          <w:rFonts w:ascii="Times New Roman" w:hAnsi="Times New Roman" w:cs="Times New Roman"/>
-        </w:rPr>
-        <w:footnoteReference w:id="2"/>
-      </w:r>
-      <w:r>
-        <w:rPr>
-          <w:rFonts w:ascii="Times New Roman" w:hAnsi="Times New Roman" w:cs="Times New Roman"/>
-        </w:rPr>
-        <w:t>. She has 156 universities, 16 subject categories, 2 genders, 4 age groups, 2 domicile countries, across roughly 7–10 years</w:t>
-      </w:r>
-      <w:r>
-        <w:rPr>
-          <w:rFonts w:ascii="Times New Roman" w:hAnsi="Times New Roman" w:cs="Times New Roman"/>
-        </w:rPr>
-        <w:t>.</w:t>
-      </w:r>
-      <w:r>
-        <w:rPr>
-          <w:rFonts w:ascii="Times New Roman" w:hAnsi="Times New Roman" w:cs="Times New Roman"/>
-        </w:rPr>
-        <w:t xml:space="preserve"> </w:t>
-      </w:r>
-      <w:r>
-        <w:rPr>
-          <w:rFonts w:ascii="Times New Roman" w:hAnsi="Times New Roman" w:cs="Times New Roman"/>
-        </w:rPr>
-        <w:t>T</w:t>
-      </w:r>
-      <w:r>
-        <w:rPr>
-          <w:rFonts w:ascii="Times New Roman" w:hAnsi="Times New Roman" w:cs="Times New Roman"/>
-        </w:rPr>
-        <w:t xml:space="preserve">hat combination explodes the panel into tens of thousands of rows even though the treatment variable itself only switches once at the country-year level. </w:t>
-      </w:r>
-      <w:r>
-        <w:rPr>
-          <w:rFonts w:ascii="Times New Roman" w:hAnsi="Times New Roman" w:cs="Times New Roman"/>
-        </w:rPr>
-        <w:t>For comparison, in</w:t>
-      </w:r>
-      <w:r>
-        <w:rPr>
-          <w:rFonts w:ascii="Times New Roman" w:hAnsi="Times New Roman" w:cs="Times New Roman"/>
-        </w:rPr>
-        <w:t xml:space="preserve"> this design we</w:t>
-      </w:r>
-      <w:r>
-        <w:rPr>
-          <w:rFonts w:ascii="Times New Roman" w:hAnsi="Times New Roman" w:cs="Times New Roman"/>
-        </w:rPr>
-        <w:t xml:space="preserve"> ha</w:t>
-      </w:r>
-      <w:r>
-        <w:rPr>
-          <w:rFonts w:ascii="Times New Roman" w:hAnsi="Times New Roman" w:cs="Times New Roman"/>
-        </w:rPr>
-        <w:t>ve</w:t>
-      </w:r>
-      <w:r>
-        <w:rPr>
-          <w:rFonts w:ascii="Times New Roman" w:hAnsi="Times New Roman" w:cs="Times New Roman"/>
-        </w:rPr>
-        <w:t xml:space="preserve"> 52 countries × 10 years = 520 observations because the unit is just country-of-origin × year with no within-country disaggregation. </w:t>
-      </w:r>
-      <w:r>
-        <w:rPr>
-          <w:rFonts w:ascii="Times New Roman" w:hAnsi="Times New Roman" w:cs="Times New Roman"/>
-        </w:rPr>
-        <w:t xml:space="preserve">The interesting part is that </w:t>
-      </w:r>
-      <w:r>
-        <w:rPr>
-          <w:rFonts w:ascii="Times New Roman" w:hAnsi="Times New Roman" w:cs="Times New Roman"/>
-        </w:rPr>
-        <w:t xml:space="preserve">Sá's identification still comes from only 2 countries and 1 treatment switch </w:t>
-      </w:r>
-      <w:r>
-        <w:rPr>
-          <w:rFonts w:ascii="Times New Roman" w:hAnsi="Times New Roman" w:cs="Times New Roman"/>
-        </w:rPr>
-        <w:t>giving her smaller number of</w:t>
-      </w:r>
-      <w:r>
-        <w:rPr>
-          <w:rFonts w:ascii="Times New Roman" w:hAnsi="Times New Roman" w:cs="Times New Roman"/>
-        </w:rPr>
-        <w:t xml:space="preserve"> </w:t>
-      </w:r>
-      <w:r>
-        <w:rPr>
-          <w:rFonts w:ascii="Times New Roman" w:hAnsi="Times New Roman" w:cs="Times New Roman"/>
-        </w:rPr>
-        <w:t xml:space="preserve">effective </w:t>
-      </w:r>
-      <w:r>
-        <w:rPr>
-          <w:rFonts w:ascii="Times New Roman" w:hAnsi="Times New Roman" w:cs="Times New Roman"/>
-        </w:rPr>
-        <w:t xml:space="preserve">independent treatment clusters </w:t>
-      </w:r>
-      <w:r>
-        <w:rPr>
-          <w:rFonts w:ascii="Times New Roman" w:hAnsi="Times New Roman" w:cs="Times New Roman"/>
-        </w:rPr>
-        <w:t xml:space="preserve">(a total of </w:t>
-      </w:r>
-      <w:r>
-        <w:rPr>
-          <w:rFonts w:ascii="Times New Roman" w:hAnsi="Times New Roman" w:cs="Times New Roman"/>
-        </w:rPr>
-        <w:t>2</w:t>
-      </w:r>
-      <w:r>
-        <w:rPr>
-          <w:rFonts w:ascii="Times New Roman" w:hAnsi="Times New Roman" w:cs="Times New Roman"/>
-        </w:rPr>
-        <w:t>)</w:t>
-      </w:r>
-      <w:r>
-        <w:rPr>
-          <w:rFonts w:ascii="Times New Roman" w:hAnsi="Times New Roman" w:cs="Times New Roman"/>
-        </w:rPr>
-        <w:t>, which is why she flags the small-cluster problem explicitly in the footnotes.</w:t>
+        <w:t>In a comparable perspective, the closest design to ours – Sá (201</w:t>
+      </w:r>
+      <w:r>
+        <w:rPr>
+          <w:rFonts w:ascii="Times New Roman" w:hAnsi="Times New Roman" w:cs="Times New Roman"/>
+        </w:rPr>
+        <w:t>4</w:t>
+      </w:r>
+      <w:r>
+        <w:rPr>
+          <w:rFonts w:ascii="Times New Roman" w:hAnsi="Times New Roman" w:cs="Times New Roman"/>
+        </w:rPr>
+        <w:t>) – exploits within-country, across-time variation in fees. The treatment in her case is binary and uniform: Scottish students either pay or don't, and English students face one fee level, then another. There is no cross-sectional variation in the size of the price shock. In this paper, however, we exploit cross-country, across-time variation, where the price shock itself, kᵢ, differs across countries because the present value of the foregone loan differs with the average wage. This means the identifying variation has two dimensions simultaneously – whether you are treated (EU vs. non-EU) and how intensely you are treated (which EU country you are from).  This corrects an internal limitation in Sá's (201</w:t>
+      </w:r>
+      <w:r>
+        <w:rPr>
+          <w:rFonts w:ascii="Times New Roman" w:hAnsi="Times New Roman" w:cs="Times New Roman"/>
+        </w:rPr>
+        <w:t>4</w:t>
+      </w:r>
+      <w:r>
+        <w:rPr>
+          <w:rFonts w:ascii="Times New Roman" w:hAnsi="Times New Roman" w:cs="Times New Roman"/>
+        </w:rPr>
+        <w:t>) design, which cannot separately identify these because all treated students face the same fee change. This resonates with the fact that Sá's identification still relies on only 2 countries and 1 treatment switch, resulting in fewer effective independent treatment clusters.</w:t>
       </w:r>
     </w:p>
     <w:p>
@@ -3736,13 +2454,7 @@
         <w:rPr>
           <w:rFonts w:ascii="Times New Roman" w:hAnsi="Times New Roman" w:cs="Times New Roman"/>
         </w:rPr>
-        <w:t>Following the mentioned design choices, w</w:t>
-      </w:r>
-      <w:r>
-        <w:rPr>
-          <w:rFonts w:ascii="Times New Roman" w:hAnsi="Times New Roman" w:cs="Times New Roman"/>
-        </w:rPr>
-        <w:t>e estimate a dynamic difference-in-differences specification to trace the evolution of applications around the Brexit tuition reform:</w:t>
+        <w:t>Following these design choices, we estimate a dynamic difference-in-differences specification. This traces the evolution of applications around the Brexit tuition reform:</w:t>
       </w:r>
     </w:p>
     <w:tbl>
@@ -4465,7 +3177,6 @@
           <w:iCs/>
           <w:sz w:val="20"/>
         </w:rPr>
-        <w:lastRenderedPageBreak/>
         <w:t xml:space="preserve">Note: </w:t>
       </w:r>
       <w:r>
@@ -4474,7 +3185,16 @@
           <w:iCs/>
           <w:sz w:val="20"/>
         </w:rPr>
-        <w:t>The figure plots coefficients from a difference-in-differences event-study comparing EU applicants to a synthetic control group of non-EU countries. The horizontal axis shows years relative to 2020, the last pre-treatment year. Points represent estimated differences in log applications and bars denote 95% confidence intervals clustered at the country level. The dashed vertical line marks the final pre-treatment year. Pre-treatment coefficients are small and close to zero, while a sharp decline in EU applications emerges beginning in 2021 after the tuition reform took effect. A joint Wald test cannot reject the null that the pre-treatment coefficients are jointly zero (p = 0.</w:t>
+        <w:t>The figure plots coefficients from a difference-in-differences event-study comparing EU applicants to a synthetic control group of non-EU countries. The horizontal axis shows years relative to 2020, the last pre-</w:t>
+      </w:r>
+      <w:r>
+        <w:rPr>
+          <w:rFonts w:ascii="Times New Roman" w:hAnsi="Times New Roman" w:cs="Times New Roman"/>
+          <w:iCs/>
+          <w:sz w:val="20"/>
+        </w:rPr>
+        <w:lastRenderedPageBreak/>
+        <w:t>treatment year. Points represent estimated differences in log applications and bars denote 95% confidence intervals clustered at the country level. The dashed vertical line marks the final pre-treatment year. Pre-treatment coefficients are small and close to zero, while a sharp decline in EU applications emerges beginning in 2021 after the tuition reform took effect. A joint Wald test cannot reject the null that the pre-treatment coefficients are jointly zero (p = 0.</w:t>
       </w:r>
       <w:r>
         <w:rPr>
@@ -4771,7 +3491,7 @@
           <w:iCs/>
           <w:sz w:val="20"/>
         </w:rPr>
-        <w:t xml:space="preserve">The figure plots coefficients from a leads-only specification testing whether EU applications diverged from the synthetic control group prior to the Brexit tuition reform. The horizontal axis shows years relative to </w:t>
+        <w:t xml:space="preserve">The figure plots coefficients from a leads-only specification testing whether EU applications diverged from the synthetic control group prior to the Brexit tuition reform. The horizontal axis shows years relative to 2020, the last pre-treatment year. Points represent estimated differences in log applications and bars denote 95% confidence intervals clustered at the country level. The dashed vertical line marks the final pre-treatment year. </w:t>
       </w:r>
       <w:r>
         <w:rPr>
@@ -4780,7 +3500,7 @@
           <w:sz w:val="20"/>
         </w:rPr>
         <w:lastRenderedPageBreak/>
-        <w:t>2020, the last pre-treatment year. Points represent estimated differences in log applications and bars denote 95% confidence intervals clustered at the country level. The dashed vertical line marks the final pre-treatment year. The estimates display no systematic pre-treatment pattern, and a joint Wald test fails to reject the null that the early leads are jointly zero (p = 0.</w:t>
+        <w:t>The estimates display no systematic pre-treatment pattern, and a joint Wald test fails to reject the null that the early leads are jointly zero (p = 0.</w:t>
       </w:r>
       <w:r>
         <w:rPr>
@@ -5195,16 +3915,7 @@
           <w:iCs/>
           <w:sz w:val="20"/>
         </w:rPr>
-        <w:t xml:space="preserve">Each panel reports country-specific dynamic treatment effects from the saturated difference-in-differences specification comparing EU countries with the pooled control group. Coefficients represent log differences in </w:t>
-      </w:r>
-      <w:r>
-        <w:rPr>
-          <w:rFonts w:ascii="Times New Roman" w:hAnsi="Times New Roman" w:cs="Times New Roman"/>
-          <w:iCs/>
-          <w:sz w:val="20"/>
-        </w:rPr>
-        <w:lastRenderedPageBreak/>
-        <w:t>applications relative to the baseline year (2020). Error bars denote 95% confidence intervals.</w:t>
+        <w:t>Each panel reports country-specific dynamic treatment effects from the saturated difference-in-differences specification comparing EU countries with the pooled control group. Coefficients represent log differences in applications relative to the baseline year (2020). Error bars denote 95% confidence intervals.</w:t>
       </w:r>
       <w:r>
         <w:rPr>
@@ -5235,6 +3946,7 @@
           <w:i/>
           <w:iCs/>
         </w:rPr>
+        <w:lastRenderedPageBreak/>
         <w:t xml:space="preserve">Baseline </w:t>
       </w:r>
       <w:r>
@@ -5581,16 +4293,7 @@
                             <w:lang w:eastAsia="en-GB"/>
                             <w14:ligatures w14:val="none"/>
                           </w:rPr>
-                          <m:t>j</m:t>
-                        </m:r>
-                        <m:r>
-                          <w:rPr>
-                            <w:rFonts w:ascii="Cambria Math" w:eastAsia="Times New Roman" w:hAnsi="Cambria Math" w:cs="Times New Roman"/>
-                            <w:kern w:val="0"/>
-                            <w:lang w:eastAsia="en-GB"/>
-                            <w14:ligatures w14:val="none"/>
-                          </w:rPr>
-                          <m:t>∈</m:t>
+                          <m:t>j∈</m:t>
                         </m:r>
                         <m:r>
                           <m:rPr>
@@ -5738,16 +4441,7 @@
                                 <w:lang w:eastAsia="en-GB"/>
                                 <w14:ligatures w14:val="none"/>
                               </w:rPr>
-                              <m:t>i=</m:t>
-                            </m:r>
-                            <m:r>
-                              <w:rPr>
-                                <w:rFonts w:ascii="Cambria Math" w:eastAsia="Times New Roman" w:hAnsi="Cambria Math" w:cs="Times New Roman"/>
-                                <w:kern w:val="0"/>
-                                <w:lang w:eastAsia="en-GB"/>
-                                <w14:ligatures w14:val="none"/>
-                              </w:rPr>
-                              <m:t>j</m:t>
+                              <m:t>i=j</m:t>
                             </m:r>
                           </m:e>
                         </m:d>
@@ -5994,13 +4688,7 @@
           <w:rPr>
             <w:rFonts w:ascii="Cambria Math" w:hAnsi="Cambria Math"/>
           </w:rPr>
-          <m:t>i</m:t>
-        </m:r>
-        <m:r>
-          <w:rPr>
-            <w:rFonts w:ascii="Cambria Math" w:hAnsi="Cambria Math"/>
-          </w:rPr>
-          <m:t>∈</m:t>
+          <m:t>i∈</m:t>
         </m:r>
         <m:r>
           <m:rPr>
@@ -6075,13 +4763,7 @@
               <w:rPr>
                 <w:rFonts w:ascii="Cambria Math" w:hAnsi="Cambria Math"/>
               </w:rPr>
-              <m:t>i=</m:t>
-            </m:r>
-            <m:r>
-              <w:rPr>
-                <w:rFonts w:ascii="Cambria Math" w:hAnsi="Cambria Math"/>
-              </w:rPr>
-              <m:t>j</m:t>
+              <m:t>i=j</m:t>
             </m:r>
           </m:e>
         </m:d>
@@ -6158,12 +4840,7 @@
         <w:t>) captures the</w:t>
       </w:r>
       <w:r>
-        <w:t xml:space="preserve"> magnitude of the collapse in Applicati</w:t>
-      </w:r>
-      <w:bookmarkStart w:id="2" w:name="_GoBack"/>
-      <w:bookmarkEnd w:id="2"/>
-      <w:r>
-        <w:t>ons under non-heterogeneous markets</w:t>
+        <w:t xml:space="preserve"> magnitude of the collapse in Applications under non-heterogeneous markets</w:t>
       </w:r>
       <w:r>
         <w:t xml:space="preserve"> relative to the</w:t>
@@ -6483,16 +5160,7 @@
                                   <w:lang w:eastAsia="en-GB"/>
                                   <w14:ligatures w14:val="none"/>
                                 </w:rPr>
-                                <m:t>j</m:t>
-                              </m:r>
-                              <m:r>
-                                <w:rPr>
-                                  <w:rFonts w:ascii="Cambria Math" w:eastAsia="Times New Roman" w:hAnsi="Cambria Math" w:cs="Times New Roman"/>
-                                  <w:kern w:val="0"/>
-                                  <w:lang w:eastAsia="en-GB"/>
-                                  <w14:ligatures w14:val="none"/>
-                                </w:rPr>
-                                <m:t>∈</m:t>
+                                <m:t>j∈</m:t>
                               </m:r>
                               <m:r>
                                 <m:rPr>
@@ -6639,16 +5307,7 @@
                                       <w:lang w:eastAsia="en-GB"/>
                                       <w14:ligatures w14:val="none"/>
                                     </w:rPr>
-                                    <m:t>i=</m:t>
-                                  </m:r>
-                                  <m:r>
-                                    <w:rPr>
-                                      <w:rFonts w:ascii="Cambria Math" w:eastAsia="Times New Roman" w:hAnsi="Cambria Math" w:cs="Times New Roman"/>
-                                      <w:kern w:val="0"/>
-                                      <w:lang w:eastAsia="en-GB"/>
-                                      <w14:ligatures w14:val="none"/>
-                                    </w:rPr>
-                                    <m:t>j</m:t>
+                                    <m:t>i=j</m:t>
                                   </m:r>
                                 </m:e>
                               </m:d>
@@ -6978,16 +5637,7 @@
                                       <w:lang w:eastAsia="en-GB"/>
                                       <w14:ligatures w14:val="none"/>
                                     </w:rPr>
-                                    <m:t>i=</m:t>
-                                  </m:r>
-                                  <m:r>
-                                    <w:rPr>
-                                      <w:rFonts w:ascii="Cambria Math" w:eastAsia="Times New Roman" w:hAnsi="Cambria Math" w:cs="Times New Roman"/>
-                                      <w:kern w:val="0"/>
-                                      <w:lang w:eastAsia="en-GB"/>
-                                      <w14:ligatures w14:val="none"/>
-                                    </w:rPr>
-                                    <m:t>j</m:t>
+                                    <m:t>i=j</m:t>
                                   </m:r>
                                 </m:e>
                               </m:d>
@@ -7827,16 +6477,7 @@
             <w:lang w:eastAsia="en-GB"/>
             <w14:ligatures w14:val="none"/>
           </w:rPr>
-          <m:t>j</m:t>
-        </m:r>
-        <m:r>
-          <w:rPr>
-            <w:rFonts w:ascii="Cambria Math" w:eastAsia="Times New Roman" w:hAnsi="Cambria Math" w:cs="Times New Roman"/>
-            <w:kern w:val="0"/>
-            <w:lang w:eastAsia="en-GB"/>
-            <w14:ligatures w14:val="none"/>
-          </w:rPr>
-          <m:t>∈</m:t>
+          <m:t>j∈</m:t>
         </m:r>
         <m:r>
           <m:rPr>
@@ -7887,7 +6528,6 @@
         </w:rPr>
         <w:t xml:space="preserve"> (</w:t>
       </w:r>
-      <w:proofErr w:type="spellStart"/>
       <w:r>
         <w:rPr>
           <w:rFonts w:ascii="Times New Roman" w:eastAsia="Times New Roman" w:hAnsi="Times New Roman" w:cs="Times New Roman"/>
@@ -7895,9 +6535,8 @@
           <w:lang w:eastAsia="en-GB"/>
           <w14:ligatures w14:val="none"/>
         </w:rPr>
-        <w:t>Bresnian</w:t>
-      </w:r>
-      <w:proofErr w:type="spellEnd"/>
+        <w:t>Bresnahan (1982)</w:t>
+      </w:r>
       <w:r>
         <w:rPr>
           <w:rFonts w:ascii="Times New Roman" w:eastAsia="Times New Roman" w:hAnsi="Times New Roman" w:cs="Times New Roman"/>
@@ -7905,7 +6544,7 @@
           <w:lang w:eastAsia="en-GB"/>
           <w14:ligatures w14:val="none"/>
         </w:rPr>
-        <w:t xml:space="preserve"> 1987 style)</w:t>
+        <w:t xml:space="preserve"> style)</w:t>
       </w:r>
       <w:r>
         <w:rPr>
@@ -8090,40 +6729,81 @@
     </w:p>
     <w:p>
       <w:pPr>
-        <w:tabs>
-          <w:tab w:val="left" w:pos="916"/>
-          <w:tab w:val="left" w:pos="1832"/>
-          <w:tab w:val="left" w:pos="2748"/>
-          <w:tab w:val="left" w:pos="3664"/>
-          <w:tab w:val="left" w:pos="4580"/>
-          <w:tab w:val="left" w:pos="5496"/>
-          <w:tab w:val="left" w:pos="6412"/>
-          <w:tab w:val="left" w:pos="7328"/>
-          <w:tab w:val="left" w:pos="8244"/>
-          <w:tab w:val="left" w:pos="9160"/>
-          <w:tab w:val="left" w:pos="10076"/>
-          <w:tab w:val="left" w:pos="10992"/>
-          <w:tab w:val="left" w:pos="11908"/>
-          <w:tab w:val="left" w:pos="12824"/>
-          <w:tab w:val="left" w:pos="13740"/>
-          <w:tab w:val="left" w:pos="14656"/>
-        </w:tabs>
-        <w:spacing w:line="360" w:lineRule="auto"/>
+        <w:spacing w:before="100" w:beforeAutospacing="1" w:after="100" w:afterAutospacing="1" w:line="360" w:lineRule="auto"/>
+        <w:jc w:val="both"/>
         <w:rPr>
           <w:rFonts w:ascii="Times New Roman" w:eastAsia="Times New Roman" w:hAnsi="Times New Roman" w:cs="Times New Roman"/>
-          <w:kern w:val="0"/>
-          <w:lang w:eastAsia="en-GB"/>
-          <w14:ligatures w14:val="none"/>
         </w:rPr>
       </w:pPr>
       <w:r>
         <w:rPr>
           <w:rFonts w:ascii="Times New Roman" w:eastAsia="Times New Roman" w:hAnsi="Times New Roman" w:cs="Times New Roman"/>
-          <w:kern w:val="0"/>
-          <w:lang w:eastAsia="en-GB"/>
-          <w14:ligatures w14:val="none"/>
-        </w:rPr>
-        <w:t xml:space="preserve">where </w:t>
+        </w:rPr>
+        <w:t xml:space="preserve">To allow heterogenous </w:t>
+      </w:r>
+      <m:oMath>
+        <m:r>
+          <w:rPr>
+            <w:rFonts w:ascii="Cambria Math" w:eastAsia="Times New Roman" w:hAnsi="Cambria Math" w:cs="Times New Roman"/>
+          </w:rPr>
+          <m:t>k</m:t>
+        </m:r>
+      </m:oMath>
+      <w:r>
+        <w:rPr>
+          <w:rFonts w:ascii="Times New Roman" w:eastAsia="Times New Roman" w:hAnsi="Times New Roman" w:cs="Times New Roman"/>
+        </w:rPr>
+        <w:t>’s, u</w:t>
+      </w:r>
+      <w:proofErr w:type="spellStart"/>
+      <w:r>
+        <w:rPr>
+          <w:rFonts w:ascii="Times New Roman" w:eastAsia="Times New Roman" w:hAnsi="Times New Roman" w:cs="Times New Roman"/>
+        </w:rPr>
+        <w:t>nder</w:t>
+      </w:r>
+      <w:proofErr w:type="spellEnd"/>
+      <w:r>
+        <w:rPr>
+          <w:rFonts w:ascii="Times New Roman" w:eastAsia="Times New Roman" w:hAnsi="Times New Roman" w:cs="Times New Roman"/>
+        </w:rPr>
+        <w:t xml:space="preserve"> the</w:t>
+      </w:r>
+      <w:r>
+        <w:rPr>
+          <w:rFonts w:ascii="Times New Roman" w:eastAsia="Times New Roman" w:hAnsi="Times New Roman" w:cs="Times New Roman"/>
+        </w:rPr>
+        <w:t xml:space="preserve"> Plan 2</w:t>
+      </w:r>
+      <w:r>
+        <w:rPr>
+          <w:rFonts w:ascii="Times New Roman" w:eastAsia="Times New Roman" w:hAnsi="Times New Roman" w:cs="Times New Roman"/>
+        </w:rPr>
+        <w:t xml:space="preserve"> for the contingent student loan</w:t>
+      </w:r>
+      <w:r>
+        <w:rPr>
+          <w:rFonts w:ascii="Times New Roman" w:eastAsia="Times New Roman" w:hAnsi="Times New Roman" w:cs="Times New Roman"/>
+        </w:rPr>
+        <w:t xml:space="preserve">, graduates </w:t>
+      </w:r>
+      <w:r>
+        <w:rPr>
+          <w:rFonts w:ascii="Times New Roman" w:eastAsia="Times New Roman" w:hAnsi="Times New Roman" w:cs="Times New Roman"/>
+        </w:rPr>
+        <w:t xml:space="preserve">had to </w:t>
+      </w:r>
+      <w:r>
+        <w:rPr>
+          <w:rFonts w:ascii="Times New Roman" w:eastAsia="Times New Roman" w:hAnsi="Times New Roman" w:cs="Times New Roman"/>
+        </w:rPr>
+        <w:t>repay 9% of annual earnings above a statutory repayment threshold (UK Government, n.d.-a). For the relevant cohort, the repayment threshold is £27,295 per annum. Annual repayments are therefore defined as</w:t>
+      </w:r>
+      <w:r>
+        <w:rPr>
+          <w:rFonts w:ascii="Times New Roman" w:eastAsia="Times New Roman" w:hAnsi="Times New Roman" w:cs="Times New Roman"/>
+        </w:rPr>
+        <w:t xml:space="preserve"> </w:t>
       </w:r>
       <m:oMath>
         <m:sSub>
@@ -8132,9 +6812,6 @@
               <w:rPr>
                 <w:rFonts w:ascii="Cambria Math" w:eastAsia="Times New Roman" w:hAnsi="Cambria Math" w:cs="Times New Roman"/>
                 <w:i/>
-                <w:kern w:val="0"/>
-                <w:lang w:eastAsia="en-GB"/>
-                <w14:ligatures w14:val="none"/>
               </w:rPr>
             </m:ctrlPr>
           </m:sSubPr>
@@ -8142,34 +6819,500 @@
             <m:r>
               <w:rPr>
                 <w:rFonts w:ascii="Cambria Math" w:eastAsia="Times New Roman" w:hAnsi="Cambria Math" w:cs="Times New Roman"/>
-                <w:kern w:val="0"/>
-                <w:lang w:eastAsia="en-GB"/>
-                <w14:ligatures w14:val="none"/>
-              </w:rPr>
-              <m:t>k</m:t>
+              </w:rPr>
+              <m:t>R</m:t>
             </m:r>
           </m:e>
           <m:sub>
             <m:r>
               <w:rPr>
                 <w:rFonts w:ascii="Cambria Math" w:eastAsia="Times New Roman" w:hAnsi="Cambria Math" w:cs="Times New Roman"/>
-                <w:kern w:val="0"/>
-                <w:lang w:eastAsia="en-GB"/>
-                <w14:ligatures w14:val="none"/>
+              </w:rPr>
+              <m:t>t</m:t>
+            </m:r>
+          </m:sub>
+        </m:sSub>
+        <m:r>
+          <w:rPr>
+            <w:rFonts w:ascii="Cambria Math" w:eastAsia="Times New Roman" w:hAnsi="Cambria Math" w:cs="Times New Roman"/>
+          </w:rPr>
+          <m:t>=0.09⋅</m:t>
+        </m:r>
+        <m:func>
+          <m:funcPr>
+            <m:ctrlPr>
+              <w:rPr>
+                <w:rFonts w:ascii="Cambria Math" w:eastAsia="Times New Roman" w:hAnsi="Cambria Math" w:cs="Times New Roman"/>
+                <w:i/>
+              </w:rPr>
+            </m:ctrlPr>
+          </m:funcPr>
+          <m:fName>
+            <m:r>
+              <m:rPr>
+                <m:sty m:val="p"/>
+              </m:rPr>
+              <w:rPr>
+                <w:rFonts w:ascii="Cambria Math" w:eastAsia="Times New Roman" w:hAnsi="Cambria Math" w:cs="Times New Roman"/>
+              </w:rPr>
+              <m:t>max</m:t>
+            </m:r>
+          </m:fName>
+          <m:e>
+            <m:r>
+              <w:rPr>
+                <w:rFonts w:ascii="Cambria Math" w:eastAsia="Times New Roman" w:hAnsi="Cambria Math" w:cs="Times New Roman"/>
+              </w:rPr>
+              <m:t>{0,</m:t>
+            </m:r>
+            <m:sSub>
+              <m:sSubPr>
+                <m:ctrlPr>
+                  <w:rPr>
+                    <w:rFonts w:ascii="Cambria Math" w:eastAsia="Times New Roman" w:hAnsi="Cambria Math" w:cs="Times New Roman"/>
+                    <w:i/>
+                  </w:rPr>
+                </m:ctrlPr>
+              </m:sSubPr>
+              <m:e>
+                <m:r>
+                  <w:rPr>
+                    <w:rFonts w:ascii="Cambria Math" w:eastAsia="Times New Roman" w:hAnsi="Cambria Math" w:cs="Times New Roman"/>
+                  </w:rPr>
+                  <m:t>Y</m:t>
+                </m:r>
+              </m:e>
+              <m:sub>
+                <m:r>
+                  <w:rPr>
+                    <w:rFonts w:ascii="Cambria Math" w:eastAsia="Times New Roman" w:hAnsi="Cambria Math" w:cs="Times New Roman"/>
+                  </w:rPr>
+                  <m:t>t</m:t>
+                </m:r>
+              </m:sub>
+            </m:sSub>
+            <m:r>
+              <w:rPr>
+                <w:rFonts w:ascii="Cambria Math" w:eastAsia="Times New Roman" w:hAnsi="Cambria Math" w:cs="Times New Roman"/>
+              </w:rPr>
+              <m:t>-τ}</m:t>
+            </m:r>
+          </m:e>
+        </m:func>
+      </m:oMath>
+      <w:r>
+        <w:rPr>
+          <w:rFonts w:ascii="Times New Roman" w:eastAsia="Times New Roman" w:hAnsi="Times New Roman" w:cs="Times New Roman"/>
+        </w:rPr>
+        <w:t xml:space="preserve"> in which</w:t>
+      </w:r>
+      <w:r>
+        <w:rPr>
+          <w:rFonts w:ascii="Times New Roman" w:eastAsia="Times New Roman" w:hAnsi="Times New Roman" w:cs="Times New Roman"/>
+        </w:rPr>
+        <w:t xml:space="preserve"> τ denotes the repayment threshold and </w:t>
+      </w:r>
+      <w:proofErr w:type="spellStart"/>
+      <w:r>
+        <w:rPr>
+          <w:rFonts w:ascii="Times New Roman" w:eastAsia="Times New Roman" w:hAnsi="Times New Roman" w:cs="Times New Roman"/>
+          <w:i/>
+        </w:rPr>
+        <w:t>Y</w:t>
+      </w:r>
+      <w:r>
+        <w:rPr>
+          <w:rFonts w:ascii="Times New Roman" w:eastAsia="Times New Roman" w:hAnsi="Times New Roman" w:cs="Times New Roman"/>
+          <w:vertAlign w:val="subscript"/>
+        </w:rPr>
+        <w:t>t</w:t>
+      </w:r>
+      <w:proofErr w:type="spellEnd"/>
+      <w:r>
+        <w:rPr>
+          <w:rFonts w:ascii="Times New Roman" w:eastAsia="Times New Roman" w:hAnsi="Times New Roman" w:cs="Times New Roman"/>
+          <w:vertAlign w:val="subscript"/>
+        </w:rPr>
+        <w:t>​</w:t>
+      </w:r>
+      <w:r>
+        <w:rPr>
+          <w:rFonts w:ascii="Times New Roman" w:eastAsia="Times New Roman" w:hAnsi="Times New Roman" w:cs="Times New Roman"/>
+        </w:rPr>
+        <w:t xml:space="preserve"> follows a deterministic wage path with annual growth rate g</w:t>
+      </w:r>
+      <w:r>
+        <w:rPr>
+          <w:rFonts w:ascii="Times New Roman" w:eastAsia="Times New Roman" w:hAnsi="Times New Roman" w:cs="Times New Roman"/>
+        </w:rPr>
+        <w:t xml:space="preserve">. </w:t>
+      </w:r>
+      <w:r>
+        <w:rPr>
+          <w:rFonts w:ascii="Times New Roman" w:eastAsia="Times New Roman" w:hAnsi="Times New Roman" w:cs="Times New Roman"/>
+        </w:rPr>
+        <w:t xml:space="preserve">The loan is written off 30 </w:t>
+      </w:r>
+      <w:r>
+        <w:rPr>
+          <w:rFonts w:ascii="Times New Roman" w:eastAsia="Times New Roman" w:hAnsi="Times New Roman" w:cs="Times New Roman"/>
+        </w:rPr>
+        <w:lastRenderedPageBreak/>
+        <w:t>years after the April in which repayment becomes due (UK Government, n.d.-b), implying a finite repayment horizon T=30. Interest accrues at the Retail Price Index (RPI) plus up to three percentage points, depending on income (UK Government, n.d.-c). Rather than replicate the full income-dependent interest schedule, we model the economic burden of the loan as the present value of expected repayments and discount repayment flows at a constant rate δ. The present value of the loan is therefore defined as:</w:t>
+      </w:r>
+    </w:p>
+    <w:p>
+      <w:pPr>
+        <w:spacing w:before="100" w:beforeAutospacing="1" w:after="100" w:afterAutospacing="1" w:line="360" w:lineRule="auto"/>
+        <w:jc w:val="both"/>
+        <w:rPr>
+          <w:rFonts w:ascii="Times New Roman" w:eastAsia="Times New Roman" w:hAnsi="Times New Roman" w:cs="Times New Roman"/>
+        </w:rPr>
+      </w:pPr>
+      <m:oMathPara>
+        <m:oMathParaPr>
+          <m:jc m:val="left"/>
+        </m:oMathParaPr>
+        <m:oMath>
+          <m:r>
+            <w:rPr>
+              <w:rFonts w:ascii="Cambria Math" w:eastAsia="Times New Roman" w:hAnsi="Cambria Math" w:cs="Times New Roman"/>
+            </w:rPr>
+            <m:t>P</m:t>
+          </m:r>
+          <m:sSub>
+            <m:sSubPr>
+              <m:ctrlPr>
+                <w:rPr>
+                  <w:rFonts w:ascii="Cambria Math" w:eastAsia="Times New Roman" w:hAnsi="Cambria Math" w:cs="Times New Roman"/>
+                  <w:i/>
+                </w:rPr>
+              </m:ctrlPr>
+            </m:sSubPr>
+            <m:e>
+              <m:r>
+                <w:rPr>
+                  <w:rFonts w:ascii="Cambria Math" w:eastAsia="Times New Roman" w:hAnsi="Cambria Math" w:cs="Times New Roman"/>
+                </w:rPr>
+                <m:t>V</m:t>
+              </m:r>
+            </m:e>
+            <m:sub>
+              <m:r>
+                <w:rPr>
+                  <w:rFonts w:ascii="Cambria Math" w:eastAsia="Times New Roman" w:hAnsi="Cambria Math" w:cs="Times New Roman"/>
+                </w:rPr>
+                <m:t>loan</m:t>
+              </m:r>
+            </m:sub>
+          </m:sSub>
+          <m:d>
+            <m:dPr>
+              <m:ctrlPr>
+                <w:rPr>
+                  <w:rFonts w:ascii="Cambria Math" w:eastAsia="Times New Roman" w:hAnsi="Cambria Math" w:cs="Times New Roman"/>
+                  <w:i/>
+                </w:rPr>
+              </m:ctrlPr>
+            </m:dPr>
+            <m:e>
+              <m:sSub>
+                <m:sSubPr>
+                  <m:ctrlPr>
+                    <w:rPr>
+                      <w:rFonts w:ascii="Cambria Math" w:eastAsia="Times New Roman" w:hAnsi="Cambria Math" w:cs="Times New Roman"/>
+                      <w:i/>
+                    </w:rPr>
+                  </m:ctrlPr>
+                </m:sSubPr>
+                <m:e>
+                  <m:r>
+                    <w:rPr>
+                      <w:rFonts w:ascii="Cambria Math" w:eastAsia="Times New Roman" w:hAnsi="Cambria Math" w:cs="Times New Roman"/>
+                    </w:rPr>
+                    <m:t>w</m:t>
+                  </m:r>
+                </m:e>
+                <m:sub>
+                  <m:r>
+                    <w:rPr>
+                      <w:rFonts w:ascii="Cambria Math" w:eastAsia="Times New Roman" w:hAnsi="Cambria Math" w:cs="Times New Roman"/>
+                    </w:rPr>
+                    <m:t>i</m:t>
+                  </m:r>
+                </m:sub>
+              </m:sSub>
+            </m:e>
+          </m:d>
+          <m:r>
+            <w:rPr>
+              <w:rFonts w:ascii="Cambria Math" w:eastAsia="Times New Roman" w:hAnsi="Cambria Math" w:cs="Times New Roman"/>
+            </w:rPr>
+            <m:t>=</m:t>
+          </m:r>
+          <m:nary>
+            <m:naryPr>
+              <m:chr m:val="∑"/>
+              <m:limLoc m:val="undOvr"/>
+              <m:ctrlPr>
+                <w:rPr>
+                  <w:rFonts w:ascii="Cambria Math" w:eastAsia="Times New Roman" w:hAnsi="Cambria Math" w:cs="Times New Roman"/>
+                  <w:i/>
+                </w:rPr>
+              </m:ctrlPr>
+            </m:naryPr>
+            <m:sub>
+              <m:r>
+                <w:rPr>
+                  <w:rFonts w:ascii="Cambria Math" w:eastAsia="Times New Roman" w:hAnsi="Cambria Math" w:cs="Times New Roman"/>
+                </w:rPr>
+                <m:t>t=1</m:t>
+              </m:r>
+            </m:sub>
+            <m:sup>
+              <m:r>
+                <w:rPr>
+                  <w:rFonts w:ascii="Cambria Math" w:eastAsia="Times New Roman" w:hAnsi="Cambria Math" w:cs="Times New Roman"/>
+                </w:rPr>
+                <m:t>30</m:t>
+              </m:r>
+            </m:sup>
+            <m:e>
+              <m:f>
+                <m:fPr>
+                  <m:ctrlPr>
+                    <w:rPr>
+                      <w:rFonts w:ascii="Cambria Math" w:eastAsia="Times New Roman" w:hAnsi="Cambria Math" w:cs="Times New Roman"/>
+                      <w:i/>
+                    </w:rPr>
+                  </m:ctrlPr>
+                </m:fPr>
+                <m:num>
+                  <m:r>
+                    <w:rPr>
+                      <w:rFonts w:ascii="Cambria Math" w:eastAsia="Times New Roman" w:hAnsi="Cambria Math" w:cs="Times New Roman"/>
+                    </w:rPr>
+                    <m:t>0.09⋅</m:t>
+                  </m:r>
+                  <m:func>
+                    <m:funcPr>
+                      <m:ctrlPr>
+                        <w:rPr>
+                          <w:rFonts w:ascii="Cambria Math" w:eastAsia="Times New Roman" w:hAnsi="Cambria Math" w:cs="Times New Roman"/>
+                          <w:i/>
+                        </w:rPr>
+                      </m:ctrlPr>
+                    </m:funcPr>
+                    <m:fName>
+                      <m:r>
+                        <m:rPr>
+                          <m:sty m:val="p"/>
+                        </m:rPr>
+                        <w:rPr>
+                          <w:rFonts w:ascii="Cambria Math" w:eastAsia="Times New Roman" w:hAnsi="Cambria Math" w:cs="Times New Roman"/>
+                        </w:rPr>
+                        <m:t>max</m:t>
+                      </m:r>
+                    </m:fName>
+                    <m:e>
+                      <m:r>
+                        <w:rPr>
+                          <w:rFonts w:ascii="Cambria Math" w:eastAsia="Times New Roman" w:hAnsi="Cambria Math" w:cs="Times New Roman"/>
+                        </w:rPr>
+                        <m:t>{0,</m:t>
+                      </m:r>
+                      <m:sSub>
+                        <m:sSubPr>
+                          <m:ctrlPr>
+                            <w:rPr>
+                              <w:rFonts w:ascii="Cambria Math" w:eastAsia="Times New Roman" w:hAnsi="Cambria Math" w:cs="Times New Roman"/>
+                              <w:i/>
+                            </w:rPr>
+                          </m:ctrlPr>
+                        </m:sSubPr>
+                        <m:e>
+                          <m:r>
+                            <w:rPr>
+                              <w:rFonts w:ascii="Cambria Math" w:eastAsia="Times New Roman" w:hAnsi="Cambria Math" w:cs="Times New Roman"/>
+                            </w:rPr>
+                            <m:t>w</m:t>
+                          </m:r>
+                        </m:e>
+                        <m:sub>
+                          <m:r>
+                            <w:rPr>
+                              <w:rFonts w:ascii="Cambria Math" w:eastAsia="Times New Roman" w:hAnsi="Cambria Math" w:cs="Times New Roman"/>
+                            </w:rPr>
+                            <m:t>i</m:t>
+                          </m:r>
+                        </m:sub>
+                      </m:sSub>
+                      <m:sSup>
+                        <m:sSupPr>
+                          <m:ctrlPr>
+                            <w:rPr>
+                              <w:rFonts w:ascii="Cambria Math" w:eastAsia="Times New Roman" w:hAnsi="Cambria Math" w:cs="Times New Roman"/>
+                              <w:i/>
+                            </w:rPr>
+                          </m:ctrlPr>
+                        </m:sSupPr>
+                        <m:e>
+                          <m:d>
+                            <m:dPr>
+                              <m:ctrlPr>
+                                <w:rPr>
+                                  <w:rFonts w:ascii="Cambria Math" w:eastAsia="Times New Roman" w:hAnsi="Cambria Math" w:cs="Times New Roman"/>
+                                  <w:i/>
+                                </w:rPr>
+                              </m:ctrlPr>
+                            </m:dPr>
+                            <m:e>
+                              <m:r>
+                                <w:rPr>
+                                  <w:rFonts w:ascii="Cambria Math" w:eastAsia="Times New Roman" w:hAnsi="Cambria Math" w:cs="Times New Roman"/>
+                                </w:rPr>
+                                <m:t>1+g</m:t>
+                              </m:r>
+                            </m:e>
+                          </m:d>
+                        </m:e>
+                        <m:sup>
+                          <m:r>
+                            <w:rPr>
+                              <w:rFonts w:ascii="Cambria Math" w:eastAsia="Times New Roman" w:hAnsi="Cambria Math" w:cs="Times New Roman"/>
+                            </w:rPr>
+                            <m:t>t-1</m:t>
+                          </m:r>
+                        </m:sup>
+                      </m:sSup>
+                      <m:r>
+                        <w:rPr>
+                          <w:rFonts w:ascii="Cambria Math" w:eastAsia="Times New Roman" w:hAnsi="Cambria Math" w:cs="Times New Roman"/>
+                        </w:rPr>
+                        <m:t>-τ}</m:t>
+                      </m:r>
+                    </m:e>
+                  </m:func>
+                </m:num>
+                <m:den>
+                  <m:sSup>
+                    <m:sSupPr>
+                      <m:ctrlPr>
+                        <w:rPr>
+                          <w:rFonts w:ascii="Cambria Math" w:eastAsia="Times New Roman" w:hAnsi="Cambria Math" w:cs="Times New Roman"/>
+                          <w:i/>
+                        </w:rPr>
+                      </m:ctrlPr>
+                    </m:sSupPr>
+                    <m:e>
+                      <m:d>
+                        <m:dPr>
+                          <m:ctrlPr>
+                            <w:rPr>
+                              <w:rFonts w:ascii="Cambria Math" w:eastAsia="Times New Roman" w:hAnsi="Cambria Math" w:cs="Times New Roman"/>
+                              <w:i/>
+                            </w:rPr>
+                          </m:ctrlPr>
+                        </m:dPr>
+                        <m:e>
+                          <m:r>
+                            <w:rPr>
+                              <w:rFonts w:ascii="Cambria Math" w:eastAsia="Times New Roman" w:hAnsi="Cambria Math" w:cs="Times New Roman"/>
+                            </w:rPr>
+                            <m:t>1+δ</m:t>
+                          </m:r>
+                        </m:e>
+                      </m:d>
+                    </m:e>
+                    <m:sup>
+                      <m:r>
+                        <w:rPr>
+                          <w:rFonts w:ascii="Cambria Math" w:eastAsia="Times New Roman" w:hAnsi="Cambria Math" w:cs="Times New Roman"/>
+                        </w:rPr>
+                        <m:t>t</m:t>
+                      </m:r>
+                    </m:sup>
+                  </m:sSup>
+                </m:den>
+              </m:f>
+            </m:e>
+          </m:nary>
+        </m:oMath>
+      </m:oMathPara>
+    </w:p>
+    <w:p>
+      <w:pPr>
+        <w:spacing w:before="100" w:beforeAutospacing="1" w:after="100" w:afterAutospacing="1" w:line="360" w:lineRule="auto"/>
+        <w:jc w:val="both"/>
+        <w:rPr>
+          <w:rFonts w:ascii="Times New Roman" w:eastAsia="Times New Roman" w:hAnsi="Times New Roman" w:cs="Times New Roman"/>
+        </w:rPr>
+      </w:pPr>
+      <w:r>
+        <w:rPr>
+          <w:rFonts w:ascii="Times New Roman" w:eastAsia="Times New Roman" w:hAnsi="Times New Roman" w:cs="Times New Roman"/>
+        </w:rPr>
+        <w:t>In the baseline specification, we set δ=3%</w:t>
+      </w:r>
+      <w:r>
+        <w:rPr>
+          <w:rFonts w:ascii="Times New Roman" w:eastAsia="Times New Roman" w:hAnsi="Times New Roman" w:cs="Times New Roman"/>
+        </w:rPr>
+        <w:t>. We estimate the present value based on the average country specific wage (</w:t>
+      </w:r>
+      <m:oMath>
+        <m:sSub>
+          <m:sSubPr>
+            <m:ctrlPr>
+              <w:rPr>
+                <w:rFonts w:ascii="Cambria Math" w:eastAsia="Times New Roman" w:hAnsi="Cambria Math" w:cs="Times New Roman"/>
+                <w:i/>
+              </w:rPr>
+            </m:ctrlPr>
+          </m:sSubPr>
+          <m:e>
+            <m:r>
+              <w:rPr>
+                <w:rFonts w:ascii="Cambria Math" w:eastAsia="Times New Roman" w:hAnsi="Cambria Math" w:cs="Times New Roman"/>
+              </w:rPr>
+              <m:t>w</m:t>
+            </m:r>
+          </m:e>
+          <m:sub>
+            <m:r>
+              <w:rPr>
+                <w:rFonts w:ascii="Cambria Math" w:eastAsia="Times New Roman" w:hAnsi="Cambria Math" w:cs="Times New Roman"/>
               </w:rPr>
               <m:t>i</m:t>
             </m:r>
           </m:sub>
         </m:sSub>
+        <m:r>
+          <w:rPr>
+            <w:rFonts w:ascii="Cambria Math" w:eastAsia="Times New Roman" w:hAnsi="Cambria Math" w:cs="Times New Roman"/>
+          </w:rPr>
+          <m:t>)</m:t>
+        </m:r>
       </m:oMath>
       <w:r>
         <w:rPr>
           <w:rFonts w:ascii="Times New Roman" w:eastAsia="Times New Roman" w:hAnsi="Times New Roman" w:cs="Times New Roman"/>
-          <w:kern w:val="0"/>
-          <w:lang w:eastAsia="en-GB"/>
-          <w14:ligatures w14:val="none"/>
-        </w:rPr>
-        <w:t xml:space="preserve"> is defined as: </w:t>
+        </w:rPr>
+        <w:t xml:space="preserve"> and </w:t>
+      </w:r>
+      <m:oMath>
+        <m:r>
+          <w:rPr>
+            <w:rFonts w:ascii="Cambria Math" w:eastAsia="Times New Roman" w:hAnsi="Cambria Math" w:cs="Times New Roman"/>
+          </w:rPr>
+          <m:t>k</m:t>
+        </m:r>
+      </m:oMath>
+      <w:r>
+        <w:rPr>
+          <w:rFonts w:ascii="Times New Roman" w:eastAsia="Times New Roman" w:hAnsi="Times New Roman" w:cs="Times New Roman"/>
+        </w:rPr>
+        <w:t xml:space="preserve"> becomes a function of the average wage: </w:t>
       </w:r>
     </w:p>
     <w:p>
@@ -8460,7 +7603,6 @@
           <w:lang w:eastAsia="en-GB"/>
           <w14:ligatures w14:val="none"/>
         </w:rPr>
-        <w:lastRenderedPageBreak/>
         <w:t xml:space="preserve">in this formula </w:t>
       </w:r>
       <m:oMath>
@@ -8517,15 +7659,41 @@
           </w:rPr>
           <m:t>(</m:t>
         </m:r>
-        <m:r>
-          <w:rPr>
-            <w:rFonts w:ascii="Cambria Math" w:eastAsia="Times New Roman" w:hAnsi="Cambria Math" w:cs="Times New Roman"/>
-            <w:kern w:val="0"/>
-            <w:lang w:eastAsia="en-GB"/>
-            <w14:ligatures w14:val="none"/>
-          </w:rPr>
-          <m:t>j</m:t>
-        </m:r>
+        <m:sSub>
+          <m:sSubPr>
+            <m:ctrlPr>
+              <w:rPr>
+                <w:rFonts w:ascii="Cambria Math" w:eastAsia="Times New Roman" w:hAnsi="Cambria Math" w:cs="Times New Roman"/>
+                <w:i/>
+                <w:kern w:val="0"/>
+                <w:lang w:eastAsia="en-GB"/>
+                <w14:ligatures w14:val="none"/>
+              </w:rPr>
+            </m:ctrlPr>
+          </m:sSubPr>
+          <m:e>
+            <m:r>
+              <w:rPr>
+                <w:rFonts w:ascii="Cambria Math" w:eastAsia="Times New Roman" w:hAnsi="Cambria Math" w:cs="Times New Roman"/>
+                <w:kern w:val="0"/>
+                <w:lang w:eastAsia="en-GB"/>
+                <w14:ligatures w14:val="none"/>
+              </w:rPr>
+              <m:t>w</m:t>
+            </m:r>
+          </m:e>
+          <m:sub>
+            <m:r>
+              <w:rPr>
+                <w:rFonts w:ascii="Cambria Math" w:eastAsia="Times New Roman" w:hAnsi="Cambria Math" w:cs="Times New Roman"/>
+                <w:kern w:val="0"/>
+                <w:lang w:eastAsia="en-GB"/>
+                <w14:ligatures w14:val="none"/>
+              </w:rPr>
+              <m:t>j</m:t>
+            </m:r>
+          </m:sub>
+        </m:sSub>
         <m:r>
           <w:rPr>
             <w:rFonts w:ascii="Cambria Math" w:eastAsia="Times New Roman" w:hAnsi="Cambria Math" w:cs="Times New Roman"/>
@@ -8734,13 +7902,7 @@
         <w:rPr>
           <w:rFonts w:ascii="Times New Roman" w:hAnsi="Times New Roman" w:cs="Times New Roman"/>
         </w:rPr>
-        <w:t>that credit access leads to a 100 percent increase in immediate college enrollment and a 50 percent increase in the probability of ever enrollin</w:t>
-      </w:r>
-      <w:r>
-        <w:rPr>
-          <w:rFonts w:ascii="Times New Roman" w:hAnsi="Times New Roman" w:cs="Times New Roman"/>
-        </w:rPr>
-        <w:t>g (2017).</w:t>
+        <w:t>that credit access leads to a 100 percent increase in immediate college enrollment and a 50 percent increase in the probability of ever enrolling (2017).</w:t>
       </w:r>
     </w:p>
     <w:p>
@@ -9371,7 +8533,11 @@
         <w:ind w:firstLine="360"/>
       </w:pPr>
       <w:r>
-        <w:t>The GDP gradient documented in section 5 is not evidence of stable preference heterogeneity. We now show it is almost entirely a mechanical artifact of treating the loan removal as a uniform price shock when in fact it was not.</w:t>
+        <w:t xml:space="preserve">The GDP gradient documented in section 5 is not evidence of stable preference heterogeneity. We now show it is almost entirely a mechanical artifact of treating the loan </w:t>
+      </w:r>
+      <w:r>
+        <w:lastRenderedPageBreak/>
+        <w:t>removal as a uniform price shock when in fact it was not.</w:t>
       </w:r>
       <w:r>
         <w:t xml:space="preserve"> </w:t>
@@ -9400,7 +8566,6 @@
           <w:rFonts w:ascii="Times New Roman" w:hAnsi="Times New Roman" w:cs="Times New Roman"/>
           <w:b/>
         </w:rPr>
-        <w:lastRenderedPageBreak/>
         <w:t xml:space="preserve">Figure </w:t>
       </w:r>
       <w:r>
@@ -9712,11 +8877,11 @@
         <w:t xml:space="preserve">. </w:t>
       </w:r>
       <w:r>
-        <w:t xml:space="preserve">The strong positive relationship between GDP per capita and demand elasticity emerges only when elasticities are estimated using fixed effects specifications. This reflects the ability of the TWFE estimator to isolate the causal impact of the Brexit-induced tuition shock by removing both country-specific baseline differences and common time shocks. In contrast, pooled estimates conflate treatment effects with cross-country heterogeneity in </w:t>
+        <w:t xml:space="preserve">The strong positive relationship between GDP per capita and demand elasticity </w:t>
       </w:r>
       <w:r>
         <w:lastRenderedPageBreak/>
-        <w:t>levels and trends, obscuring the underlying relationship. As a result, the GDP gradient disappears when identification is not enforced.</w:t>
+        <w:t>emerges only when elasticities are estimated using fixed effects specifications. This reflects the ability of the TWFE estimator to isolate the causal impact of the Brexit-induced tuition shock by removing both country-specific baseline differences and common time shocks. In contrast, pooled estimates conflate treatment effects with cross-country heterogeneity in levels and trends, obscuring the underlying relationship. As a result, the GDP gradient disappears when identification is not enforced.</w:t>
       </w:r>
     </w:p>
     <w:p>
@@ -9832,7 +8997,7 @@
                 <w14:ligatures w14:val="none"/>
               </w:rPr>
             </w:pPr>
-            <w:bookmarkStart w:id="3" w:name="_Hlk224319154"/>
+            <w:bookmarkStart w:id="2" w:name="_Hlk224319154"/>
           </w:p>
         </w:tc>
         <w:tc>
@@ -9873,7 +9038,7 @@
                 <w:kern w:val="0"/>
                 <w14:ligatures w14:val="none"/>
               </w:rPr>
-              <w:footnoteReference w:id="3"/>
+              <w:footnoteReference w:id="1"/>
             </w:r>
           </w:p>
         </w:tc>
@@ -10453,7 +9618,7 @@
         </w:tc>
       </w:tr>
     </w:tbl>
-    <w:bookmarkEnd w:id="3"/>
+    <w:bookmarkEnd w:id="2"/>
     <w:p>
       <w:pPr>
         <w:pStyle w:val="NormalWeb"/>
@@ -10808,7 +9973,13 @@
         <w:rPr>
           <w:rFonts w:ascii="Times New Roman" w:hAnsi="Times New Roman" w:cs="Times New Roman"/>
         </w:rPr>
-        <w:t>dard errors are Driscoll-</w:t>
+        <w:t xml:space="preserve">dard errors are </w:t>
+      </w:r>
+      <w:r>
+        <w:rPr>
+          <w:rFonts w:ascii="Times New Roman" w:hAnsi="Times New Roman" w:cs="Times New Roman"/>
+        </w:rPr>
+        <w:t xml:space="preserve">Driscoll &amp; </w:t>
       </w:r>
       <w:proofErr w:type="spellStart"/>
       <w:r>
@@ -10822,7 +9993,13 @@
         <w:rPr>
           <w:rFonts w:ascii="Times New Roman" w:hAnsi="Times New Roman" w:cs="Times New Roman"/>
         </w:rPr>
-        <w:t xml:space="preserve"> (L=1)</w:t>
+        <w:t xml:space="preserve"> (1998) </w:t>
+      </w:r>
+      <w:r>
+        <w:rPr>
+          <w:rFonts w:ascii="Times New Roman" w:hAnsi="Times New Roman" w:cs="Times New Roman"/>
+        </w:rPr>
+        <w:t>(L=1)</w:t>
       </w:r>
     </w:p>
     <w:tbl>
@@ -11946,6 +11123,7 @@
                   <w:rPr>
                     <w:rFonts w:ascii="Cambria Math" w:hAnsi="Cambria Math" w:cs="Times New Roman"/>
                   </w:rPr>
+                  <w:lastRenderedPageBreak/>
                   <m:t>YU</m:t>
                 </m:r>
               </m:oMath>
@@ -15873,7 +15051,7 @@
           <w:color w:val="000000" w:themeColor="text1"/>
         </w:rPr>
       </w:pPr>
-      <w:bookmarkStart w:id="4" w:name="_Hlk229007810"/>
+      <w:bookmarkStart w:id="3" w:name="_Hlk229007810"/>
       <w:r>
         <w:rPr>
           <w:rFonts w:ascii="Times New Roman" w:hAnsi="Times New Roman" w:cs="Times New Roman"/>
@@ -15922,7 +15100,7 @@
         <w:t>tratified cluster bootstrap distribution of the Brexit treatment effect.</w:t>
       </w:r>
     </w:p>
-    <w:bookmarkEnd w:id="4"/>
+    <w:bookmarkEnd w:id="3"/>
     <w:p>
       <w:pPr>
         <w:keepNext/>
@@ -23134,24 +22312,18 @@
         <w:ind w:left="720" w:hanging="720"/>
       </w:pPr>
       <w:r>
-        <w:rPr>
-          <w:b/>
-          <w:bCs/>
-        </w:rPr>
-        <w:t>Brown, R.</w:t>
-      </w:r>
-      <w:r>
-        <w:t xml:space="preserve"> (2011). </w:t>
-      </w:r>
-      <w:r>
-        <w:rPr>
-          <w:rStyle w:val="Emphasis"/>
-          <w:rFonts w:eastAsiaTheme="majorEastAsia"/>
-        </w:rPr>
-        <w:t>After Browne: The new competitive regime for English higher education</w:t>
-      </w:r>
-      <w:r>
-        <w:t xml:space="preserve">. </w:t>
+        <w:t xml:space="preserve">Bresnahan, T. F. (1982). The oligopoly solution concept is identified. Economics Letters, 10(1–2), 87–92. </w:t>
+      </w:r>
+      <w:hyperlink r:id="rId22" w:history="1">
+        <w:r>
+          <w:rPr>
+            <w:rStyle w:val="Hyperlink"/>
+          </w:rPr>
+          <w:t>https://doi.org/10.1016/0165-1765(82)90121-5</w:t>
+        </w:r>
+      </w:hyperlink>
+      <w:r>
+        <w:t xml:space="preserve"> </w:t>
       </w:r>
     </w:p>
     <w:p>
@@ -23165,35 +22337,20 @@
           <w:b/>
           <w:bCs/>
         </w:rPr>
-        <w:t>Calhoun, C.</w:t>
-      </w:r>
-      <w:r>
-        <w:t xml:space="preserve"> (2017). Populism, nationalism and Brexit. In W. Outhwaite (Ed.), </w:t>
+        <w:t>Brown, R.</w:t>
+      </w:r>
+      <w:r>
+        <w:t xml:space="preserve"> (2011). </w:t>
       </w:r>
       <w:r>
         <w:rPr>
           <w:rStyle w:val="Emphasis"/>
           <w:rFonts w:eastAsiaTheme="majorEastAsia"/>
         </w:rPr>
-        <w:t>Brexit: Sociological responses</w:t>
-      </w:r>
-      <w:r>
-        <w:t xml:space="preserve"> (pp. 57–76). Anthem Press.</w:t>
-      </w:r>
-    </w:p>
-    <w:p>
-      <w:pPr>
-        <w:spacing w:line="360" w:lineRule="auto"/>
-        <w:ind w:left="709" w:hanging="709"/>
-        <w:rPr>
-          <w:rFonts w:ascii="Times New Roman" w:hAnsi="Times New Roman" w:cs="Times New Roman"/>
-        </w:rPr>
-      </w:pPr>
-      <w:r>
-        <w:rPr>
-          <w:rFonts w:ascii="Times New Roman" w:hAnsi="Times New Roman" w:cs="Times New Roman"/>
-        </w:rPr>
-        <w:t>Campbell, R., and B. Siegel. “The Demand for Higher Education in the United States 1919-1964.” American Economic Review, 57 (1967), 482-94.</w:t>
+        <w:t>After Browne: The new competitive regime for English higher education</w:t>
+      </w:r>
+      <w:r>
+        <w:t xml:space="preserve">. </w:t>
       </w:r>
     </w:p>
     <w:p>
@@ -23207,35 +22364,20 @@
           <w:b/>
           <w:bCs/>
         </w:rPr>
-        <w:t>Clifton-</w:t>
-      </w:r>
-      <w:proofErr w:type="spellStart"/>
-      <w:r>
-        <w:rPr>
-          <w:b/>
-          <w:bCs/>
-        </w:rPr>
-        <w:t>Sprigg</w:t>
-      </w:r>
-      <w:proofErr w:type="spellEnd"/>
-      <w:r>
-        <w:rPr>
-          <w:b/>
-          <w:bCs/>
-        </w:rPr>
-        <w:t>, J., Homburg, I., Huyghe, A., &amp; Vujić, S.</w:t>
-      </w:r>
-      <w:r>
-        <w:t xml:space="preserve"> (2025). </w:t>
+        <w:t>Calhoun, C.</w:t>
+      </w:r>
+      <w:r>
+        <w:t xml:space="preserve"> (2017). Populism, nationalism and Brexit. In W. Outhwaite (Ed.), </w:t>
       </w:r>
       <w:r>
         <w:rPr>
           <w:rStyle w:val="Emphasis"/>
-        </w:rPr>
-        <w:t>International student migration: Did Brexit close the door to EU students?</w:t>
-      </w:r>
-      <w:r>
-        <w:t xml:space="preserve"> (IZA Discussion Paper No. 18178). IZA Institute of Labor Economics.</w:t>
+          <w:rFonts w:eastAsiaTheme="majorEastAsia"/>
+        </w:rPr>
+        <w:t>Brexit: Sociological responses</w:t>
+      </w:r>
+      <w:r>
+        <w:t xml:space="preserve"> (pp. 57–76). Anthem Press.</w:t>
       </w:r>
     </w:p>
     <w:p>
@@ -23244,21 +22386,107 @@
         <w:spacing w:before="0" w:beforeAutospacing="0" w:after="0" w:afterAutospacing="0" w:line="360" w:lineRule="auto"/>
         <w:ind w:left="720" w:hanging="720"/>
       </w:pPr>
+      <w:r>
+        <w:t xml:space="preserve">Callaway, B., &amp; </w:t>
+      </w:r>
       <w:proofErr w:type="spellStart"/>
+      <w:r>
+        <w:t>Sant'Anna</w:t>
+      </w:r>
+      <w:proofErr w:type="spellEnd"/>
+      <w:r>
+        <w:t xml:space="preserve">, P. H. C. (2021). Difference-in-differences with multiple time periods. Journal of Econometrics, 225(2), 200–230. </w:t>
+      </w:r>
+      <w:hyperlink r:id="rId23" w:history="1">
+        <w:r>
+          <w:rPr>
+            <w:rStyle w:val="Hyperlink"/>
+          </w:rPr>
+          <w:t>https://doi.org/10.1016/j.jeconom.2020.12.001</w:t>
+        </w:r>
+      </w:hyperlink>
+      <w:r>
+        <w:t xml:space="preserve">  </w:t>
+      </w:r>
+    </w:p>
+    <w:p>
+      <w:pPr>
+        <w:spacing w:line="360" w:lineRule="auto"/>
+        <w:ind w:left="709" w:hanging="709"/>
+        <w:rPr>
+          <w:rFonts w:ascii="Times New Roman" w:hAnsi="Times New Roman" w:cs="Times New Roman"/>
+        </w:rPr>
+      </w:pPr>
+      <w:r>
+        <w:rPr>
+          <w:rFonts w:ascii="Times New Roman" w:hAnsi="Times New Roman" w:cs="Times New Roman"/>
+        </w:rPr>
+        <w:lastRenderedPageBreak/>
+        <w:t>Campbell, R., and B. Siegel. “The Demand for Higher Education in the United States 1919-1964.” American Economic Review, 57 (1967), 482-94.</w:t>
+      </w:r>
+    </w:p>
+    <w:p>
+      <w:pPr>
+        <w:pStyle w:val="NormalWeb"/>
+        <w:spacing w:before="0" w:beforeAutospacing="0" w:after="0" w:afterAutospacing="0" w:line="360" w:lineRule="auto"/>
+        <w:ind w:left="720" w:hanging="720"/>
+      </w:pPr>
       <w:r>
         <w:rPr>
           <w:b/>
           <w:bCs/>
         </w:rPr>
-        <w:lastRenderedPageBreak/>
-        <w:t>Cuibus</w:t>
-      </w:r>
-      <w:proofErr w:type="spellEnd"/>
+        <w:t>Clifton-</w:t>
+      </w:r>
+      <w:proofErr w:type="spellStart"/>
       <w:r>
         <w:rPr>
           <w:b/>
           <w:bCs/>
         </w:rPr>
+        <w:t>Sprigg</w:t>
+      </w:r>
+      <w:proofErr w:type="spellEnd"/>
+      <w:r>
+        <w:rPr>
+          <w:b/>
+          <w:bCs/>
+        </w:rPr>
+        <w:t>, J., Homburg, I., Huyghe, A., &amp; Vujić, S.</w:t>
+      </w:r>
+      <w:r>
+        <w:t xml:space="preserve"> (2025). </w:t>
+      </w:r>
+      <w:r>
+        <w:rPr>
+          <w:rStyle w:val="Emphasis"/>
+        </w:rPr>
+        <w:t>International student migration: Did Brexit close the door to EU students?</w:t>
+      </w:r>
+      <w:r>
+        <w:t xml:space="preserve"> (IZA Discussion Paper No. 18178). IZA Institute of Labor Economics.</w:t>
+      </w:r>
+    </w:p>
+    <w:p>
+      <w:pPr>
+        <w:pStyle w:val="NormalWeb"/>
+        <w:spacing w:before="0" w:beforeAutospacing="0" w:after="0" w:afterAutospacing="0" w:line="360" w:lineRule="auto"/>
+        <w:ind w:left="720" w:hanging="720"/>
+      </w:pPr>
+      <w:proofErr w:type="spellStart"/>
+      <w:r>
+        <w:rPr>
+          <w:b/>
+          <w:bCs/>
+        </w:rPr>
+        <w:t>Cuibus</w:t>
+      </w:r>
+      <w:proofErr w:type="spellEnd"/>
+      <w:r>
+        <w:rPr>
+          <w:b/>
+          <w:bCs/>
+        </w:rPr>
         <w:t>, M., &amp; Walsh, P. W.</w:t>
       </w:r>
       <w:r>
@@ -23274,7 +22502,7 @@
       <w:r>
         <w:t xml:space="preserve">. Retrieved from </w:t>
       </w:r>
-      <w:hyperlink r:id="rId22" w:tgtFrame="_new" w:history="1">
+      <w:hyperlink r:id="rId24" w:tgtFrame="_new" w:history="1">
         <w:r>
           <w:rPr>
             <w:rStyle w:val="Hyperlink"/>
@@ -23312,7 +22540,7 @@
       <w:r>
         <w:t xml:space="preserve"> (1998), ‘Consistent covariance matrix estimation with spatially dependent panel data’, Review of Economics and Statistics, Vol. 80, No. 4, pp. 549–560. </w:t>
       </w:r>
-      <w:hyperlink r:id="rId23" w:history="1">
+      <w:hyperlink r:id="rId25" w:history="1">
         <w:r>
           <w:rPr>
             <w:rStyle w:val="Hyperlink"/>
@@ -23374,7 +22602,7 @@
         </w:rPr>
         <w:t xml:space="preserve">, K. (2012). Do tuition fees affect the mobility of university applicants? Evidence from a natural experiment. Economics of Education Review, 31(1), 155–167. </w:t>
       </w:r>
-      <w:hyperlink r:id="rId24" w:history="1">
+      <w:hyperlink r:id="rId26" w:history="1">
         <w:r>
           <w:rPr>
             <w:rStyle w:val="Hyperlink"/>
@@ -23432,7 +22660,7 @@
       <w:r>
         <w:t xml:space="preserve">(4), 291–318. </w:t>
       </w:r>
-      <w:hyperlink r:id="rId25" w:tgtFrame="_new" w:history="1">
+      <w:hyperlink r:id="rId27" w:tgtFrame="_new" w:history="1">
         <w:r>
           <w:rPr>
             <w:rStyle w:val="Hyperlink"/>
@@ -23526,23 +22754,6 @@
     </w:p>
     <w:p>
       <w:pPr>
-        <w:spacing w:line="360" w:lineRule="auto"/>
-        <w:ind w:left="709" w:hanging="709"/>
-      </w:pPr>
-      <w:proofErr w:type="spellStart"/>
-      <w:r>
-        <w:t>Hoxby</w:t>
-      </w:r>
-      <w:proofErr w:type="spellEnd"/>
-      <w:r>
-        <w:t>, C. M. (1997). How the changing market structure of U.S. higher education explains college tuition. NBER Working Paper No. 6323.</w:t>
-      </w:r>
-      <w:r>
-        <w:t xml:space="preserve"> </w:t>
-      </w:r>
-    </w:p>
-    <w:p>
-      <w:pPr>
         <w:pStyle w:val="NormalWeb"/>
         <w:spacing w:before="0" w:beforeAutospacing="0" w:after="0" w:afterAutospacing="0" w:line="360" w:lineRule="auto"/>
         <w:ind w:left="720" w:hanging="720"/>
@@ -23584,7 +22795,7 @@
       <w:r>
         <w:t xml:space="preserve">(4), 149–169. </w:t>
       </w:r>
-      <w:hyperlink r:id="rId26" w:tgtFrame="_new" w:history="1">
+      <w:hyperlink r:id="rId28" w:tgtFrame="_new" w:history="1">
         <w:r>
           <w:rPr>
             <w:rStyle w:val="Hyperlink"/>
@@ -23619,7 +22830,7 @@
       <w:r>
         <w:t xml:space="preserve">(3), 329–347. </w:t>
       </w:r>
-      <w:hyperlink r:id="rId27" w:tgtFrame="_new" w:history="1">
+      <w:hyperlink r:id="rId29" w:tgtFrame="_new" w:history="1">
         <w:r>
           <w:rPr>
             <w:rStyle w:val="Hyperlink"/>
@@ -23635,6 +22846,28 @@
         <w:ind w:left="720" w:hanging="720"/>
       </w:pPr>
       <w:r>
+        <w:lastRenderedPageBreak/>
+        <w:t xml:space="preserve">Leslie, L. L., &amp; Brinkman, P. T. (1987). Student price response in higher education: The student demand studies. Journal of Higher Education, 58(2), 181–204. </w:t>
+      </w:r>
+      <w:hyperlink r:id="rId30" w:history="1">
+        <w:r>
+          <w:rPr>
+            <w:rStyle w:val="Hyperlink"/>
+          </w:rPr>
+          <w:t>https://doi.org/10.1080/00221546.1987.11778239</w:t>
+        </w:r>
+      </w:hyperlink>
+      <w:r>
+        <w:t xml:space="preserve"> </w:t>
+      </w:r>
+    </w:p>
+    <w:p>
+      <w:pPr>
+        <w:pStyle w:val="NormalWeb"/>
+        <w:spacing w:before="0" w:beforeAutospacing="0" w:after="0" w:afterAutospacing="0" w:line="360" w:lineRule="auto"/>
+        <w:ind w:left="720" w:hanging="720"/>
+      </w:pPr>
+      <w:r>
         <w:rPr>
           <w:b/>
           <w:bCs/>
@@ -23654,7 +22887,7 @@
       <w:r>
         <w:t xml:space="preserve"> (Vol. 21). Springer, Singapore. </w:t>
       </w:r>
-      <w:hyperlink r:id="rId28" w:tgtFrame="_new" w:history="1">
+      <w:hyperlink r:id="rId31" w:tgtFrame="_new" w:history="1">
         <w:r>
           <w:rPr>
             <w:rStyle w:val="Hyperlink"/>
@@ -23674,13 +22907,12 @@
           <w:b/>
           <w:bCs/>
         </w:rPr>
-        <w:lastRenderedPageBreak/>
         <w:t>Luthra, R. R.</w:t>
       </w:r>
       <w:r>
         <w:t xml:space="preserve"> (2020). Mitigating the hostile environment: The role of the workplace in EU migrant experience of Brexit. Journal of Ethnic and Migration Studies, 47(1), 190–207. </w:t>
       </w:r>
-      <w:hyperlink r:id="rId29" w:history="1">
+      <w:hyperlink r:id="rId32" w:history="1">
         <w:r>
           <w:rPr>
             <w:rStyle w:val="Hyperlink"/>
@@ -23718,7 +22950,7 @@
       <w:r>
         <w:t xml:space="preserve">(2), 249–258. </w:t>
       </w:r>
-      <w:hyperlink r:id="rId30" w:tgtFrame="_new" w:history="1">
+      <w:hyperlink r:id="rId33" w:tgtFrame="_new" w:history="1">
         <w:r>
           <w:rPr>
             <w:rStyle w:val="Hyperlink"/>
@@ -23737,26 +22969,35 @@
         <w:rPr>
           <w:b/>
           <w:bCs/>
+          <w:highlight w:val="red"/>
         </w:rPr>
         <w:t>Mayhew, K.</w:t>
       </w:r>
       <w:r>
+        <w:rPr>
+          <w:highlight w:val="red"/>
+        </w:rPr>
         <w:t xml:space="preserve"> (2022). Brexit and UK higher education. </w:t>
       </w:r>
       <w:r>
         <w:rPr>
           <w:rStyle w:val="Emphasis"/>
           <w:rFonts w:eastAsiaTheme="majorEastAsia"/>
+          <w:highlight w:val="red"/>
         </w:rPr>
         <w:t>Oxford Review of Economic Policy, 38</w:t>
       </w:r>
       <w:r>
+        <w:rPr>
+          <w:highlight w:val="red"/>
+        </w:rPr>
         <w:t xml:space="preserve">(1), 179–187. </w:t>
       </w:r>
-      <w:hyperlink r:id="rId31" w:tgtFrame="_new" w:history="1">
+      <w:hyperlink r:id="rId34" w:tgtFrame="_new" w:history="1">
         <w:r>
           <w:rPr>
             <w:rStyle w:val="Hyperlink"/>
+            <w:highlight w:val="red"/>
           </w:rPr>
           <w:t>https://doi.org/10.1093/oxrep/grab0</w:t>
         </w:r>
@@ -23772,28 +23013,42 @@
         <w:rPr>
           <w:b/>
           <w:bCs/>
+          <w:highlight w:val="red"/>
         </w:rPr>
         <w:t>McFadden, D.</w:t>
       </w:r>
       <w:r>
+        <w:rPr>
+          <w:highlight w:val="red"/>
+        </w:rPr>
         <w:t xml:space="preserve"> (1974). Conditional logit analysis of qualitative choice behavior. In P. </w:t>
       </w:r>
       <w:proofErr w:type="spellStart"/>
       <w:r>
+        <w:rPr>
+          <w:highlight w:val="red"/>
+        </w:rPr>
         <w:t>Zarembka</w:t>
       </w:r>
       <w:proofErr w:type="spellEnd"/>
       <w:r>
+        <w:rPr>
+          <w:highlight w:val="red"/>
+        </w:rPr>
         <w:t xml:space="preserve"> (Ed.), </w:t>
       </w:r>
       <w:r>
         <w:rPr>
           <w:i/>
           <w:iCs/>
+          <w:highlight w:val="red"/>
         </w:rPr>
         <w:t>Frontiers in Econometrics</w:t>
       </w:r>
       <w:r>
+        <w:rPr>
+          <w:highlight w:val="red"/>
+        </w:rPr>
         <w:t>. Academic Press.</w:t>
       </w:r>
     </w:p>
@@ -23853,11 +23108,59 @@
           <w:color w:val="181817"/>
           <w:shd w:val="clear" w:color="auto" w:fill="FFFFFF"/>
         </w:rPr>
-        <w:t xml:space="preserve">, e45. doi:10.1017/dap.2024.42 </w:t>
+        <w:t>, e45. doi:10.1017/dap.2024.42</w:t>
+      </w:r>
+      <w:r>
+        <w:rPr>
+          <w:color w:val="181817"/>
+          <w:shd w:val="clear" w:color="auto" w:fill="FFFFFF"/>
+        </w:rPr>
+        <w:t xml:space="preserve"> </w:t>
       </w:r>
     </w:p>
     <w:p>
       <w:pPr>
+        <w:pStyle w:val="NormalWeb"/>
+        <w:spacing w:before="0" w:beforeAutospacing="0" w:after="0" w:afterAutospacing="0" w:line="360" w:lineRule="auto"/>
+        <w:ind w:left="720" w:hanging="720"/>
+        <w:rPr>
+          <w:color w:val="181817"/>
+          <w:shd w:val="clear" w:color="auto" w:fill="FFFFFF"/>
+        </w:rPr>
+      </w:pPr>
+      <w:r>
+        <w:rPr>
+          <w:color w:val="181817"/>
+          <w:shd w:val="clear" w:color="auto" w:fill="FFFFFF"/>
+        </w:rPr>
+        <w:t>Sá, F. (2014). The effect of tuition fees on university applications and attendance: Evidence from the UK (IZA Discussion Paper No. 8364). Institute for the Study of Labor (IZA).</w:t>
+      </w:r>
+      <w:r>
+        <w:rPr>
+          <w:color w:val="181817"/>
+          <w:shd w:val="clear" w:color="auto" w:fill="FFFFFF"/>
+        </w:rPr>
+        <w:t xml:space="preserve"> </w:t>
+      </w:r>
+      <w:hyperlink r:id="rId35" w:history="1">
+        <w:r>
+          <w:rPr>
+            <w:rStyle w:val="Hyperlink"/>
+            <w:shd w:val="clear" w:color="auto" w:fill="FFFFFF"/>
+          </w:rPr>
+          <w:t>https://ftp.iza.org/dp8364.pdf</w:t>
+        </w:r>
+      </w:hyperlink>
+      <w:r>
+        <w:rPr>
+          <w:color w:val="181817"/>
+          <w:shd w:val="clear" w:color="auto" w:fill="FFFFFF"/>
+        </w:rPr>
+        <w:t xml:space="preserve"> </w:t>
+      </w:r>
+    </w:p>
+    <w:p>
+      <w:pPr>
         <w:spacing w:line="360" w:lineRule="auto"/>
         <w:ind w:left="709" w:hanging="709"/>
         <w:rPr>
@@ -23886,18 +23189,12 @@
         </w:rPr>
         <w:t xml:space="preserve">. </w:t>
       </w:r>
-      <w:hyperlink r:id="rId32" w:history="1">
+      <w:hyperlink r:id="rId36" w:history="1">
         <w:r>
           <w:rPr>
             <w:rStyle w:val="Hyperlink"/>
           </w:rPr>
-          <w:t>https://doi.org/10.1</w:t>
-        </w:r>
-        <w:r>
-          <w:rPr>
-            <w:rStyle w:val="Hyperlink"/>
-          </w:rPr>
-          <w:t>016/0272-7757(90)90040-C</w:t>
+          <w:t>https://doi.org/10.1016/0272-7757(90)90040-C</w:t>
         </w:r>
       </w:hyperlink>
     </w:p>
@@ -23915,20 +23212,13 @@
         </w:rPr>
         <w:t xml:space="preserve">Solís, A. (2017). Credit access and college enrollment. Journal of Political Economy, 125(2). </w:t>
       </w:r>
-      <w:hyperlink r:id="rId33" w:history="1">
+      <w:hyperlink r:id="rId37" w:history="1">
         <w:r>
           <w:rPr>
             <w:rStyle w:val="Hyperlink"/>
             <w:rFonts w:ascii="Times New Roman" w:hAnsi="Times New Roman" w:cs="Times New Roman"/>
           </w:rPr>
-          <w:t>https://doi.org/10.1086/690</w:t>
-        </w:r>
-        <w:r>
-          <w:rPr>
-            <w:rStyle w:val="Hyperlink"/>
-            <w:rFonts w:ascii="Times New Roman" w:hAnsi="Times New Roman" w:cs="Times New Roman"/>
-          </w:rPr>
-          <w:t>829</w:t>
+          <w:t>https://doi.org/10.1086/690829</w:t>
         </w:r>
       </w:hyperlink>
       <w:r>
@@ -23967,7 +23257,7 @@
         </w:rPr>
         <w:t>. </w:t>
       </w:r>
-      <w:hyperlink r:id="rId34" w:tgtFrame="_new" w:history="1">
+      <w:hyperlink r:id="rId38" w:tgtFrame="_new" w:history="1">
         <w:r>
           <w:rPr>
             <w:rStyle w:val="Hyperlink"/>
@@ -24001,7 +23291,7 @@
       <w:r>
         <w:t xml:space="preserve">. GOV.UK. </w:t>
       </w:r>
-      <w:hyperlink r:id="rId35" w:tgtFrame="_new" w:history="1">
+      <w:hyperlink r:id="rId39" w:tgtFrame="_new" w:history="1">
         <w:r>
           <w:rPr>
             <w:rStyle w:val="Hyperlink"/>
@@ -24020,6 +23310,7 @@
         <w:rPr>
           <w:b/>
         </w:rPr>
+        <w:lastRenderedPageBreak/>
         <w:t>UK Government.</w:t>
       </w:r>
       <w:r>
@@ -24034,7 +23325,7 @@
       <w:r>
         <w:t xml:space="preserve">. GOV.UK. </w:t>
       </w:r>
-      <w:hyperlink r:id="rId36" w:history="1">
+      <w:hyperlink r:id="rId40" w:history="1">
         <w:r>
           <w:rPr>
             <w:rStyle w:val="Hyperlink"/>
@@ -24051,6 +23342,9 @@
         <w:pStyle w:val="NormalWeb"/>
         <w:spacing w:before="0" w:beforeAutospacing="0" w:after="0" w:afterAutospacing="0" w:line="360" w:lineRule="auto"/>
         <w:ind w:left="709" w:hanging="709"/>
+        <w:rPr>
+          <w:rStyle w:val="Hyperlink"/>
+        </w:rPr>
       </w:pPr>
       <w:r>
         <w:rPr>
@@ -24070,7 +23364,7 @@
       <w:r>
         <w:t xml:space="preserve">. GOV.UK. </w:t>
       </w:r>
-      <w:hyperlink r:id="rId37" w:tgtFrame="_new" w:history="1">
+      <w:hyperlink r:id="rId41" w:tgtFrame="_new" w:history="1">
         <w:r>
           <w:rPr>
             <w:rStyle w:val="Hyperlink"/>
@@ -24078,6 +23372,24 @@
           <w:t>https://www.gov.uk/guidance/how-interest-is-calculated-plan-2</w:t>
         </w:r>
       </w:hyperlink>
+    </w:p>
+    <w:p>
+      <w:pPr>
+        <w:pStyle w:val="NormalWeb"/>
+        <w:spacing w:before="0" w:beforeAutospacing="0" w:after="0" w:afterAutospacing="0" w:line="360" w:lineRule="auto"/>
+        <w:ind w:left="709" w:hanging="709"/>
+        <w:rPr>
+          <w:b/>
+        </w:rPr>
+      </w:pPr>
+      <w:r>
+        <w:rPr>
+          <w:b/>
+        </w:rPr>
+        <w:t>Cinelli and Hazlett (2020)</w:t>
+      </w:r>
+      <w:bookmarkStart w:id="4" w:name="_GoBack"/>
+      <w:bookmarkEnd w:id="4"/>
     </w:p>
     <w:sectPr>
       <w:pgSz w:w="11906" w:h="16838"/>
@@ -24125,175 +23437,6 @@
     </w:p>
   </w:footnote>
   <w:footnote w:id="1">
-    <w:p>
-      <w:pPr>
-        <w:pStyle w:val="FootnoteText"/>
-      </w:pPr>
-      <w:r>
-        <w:rPr>
-          <w:rStyle w:val="FootnoteReference"/>
-        </w:rPr>
-        <w:footnoteRef/>
-      </w:r>
-      <w:r>
-        <w:t xml:space="preserve"> Since </w:t>
-      </w:r>
-      <m:oMath>
-        <m:r>
-          <w:rPr>
-            <w:rFonts w:ascii="Cambria Math" w:hAnsi="Cambria Math"/>
-          </w:rPr>
-          <m:t>e=</m:t>
-        </m:r>
-        <m:f>
-          <m:fPr>
-            <m:ctrlPr>
-              <w:rPr>
-                <w:rFonts w:ascii="Cambria Math" w:hAnsi="Cambria Math"/>
-                <w:i/>
-              </w:rPr>
-            </m:ctrlPr>
-          </m:fPr>
-          <m:num>
-            <m:r>
-              <m:rPr>
-                <m:sty m:val="p"/>
-              </m:rPr>
-              <w:rPr>
-                <w:rFonts w:ascii="Cambria Math" w:hAnsi="Cambria Math"/>
-              </w:rPr>
-              <m:t>Δ</m:t>
-            </m:r>
-            <m:r>
-              <w:rPr>
-                <w:rFonts w:ascii="Cambria Math" w:hAnsi="Cambria Math"/>
-              </w:rPr>
-              <m:t>Erollment</m:t>
-            </m:r>
-          </m:num>
-          <m:den>
-            <m:r>
-              <m:rPr>
-                <m:sty m:val="p"/>
-              </m:rPr>
-              <w:rPr>
-                <w:rFonts w:ascii="Cambria Math" w:hAnsi="Cambria Math"/>
-              </w:rPr>
-              <m:t>Δ</m:t>
-            </m:r>
-            <m:r>
-              <w:rPr>
-                <w:rFonts w:ascii="Cambria Math" w:hAnsi="Cambria Math"/>
-              </w:rPr>
-              <m:t>Price</m:t>
-            </m:r>
-          </m:den>
-        </m:f>
-        <m:r>
-          <w:rPr>
-            <w:rFonts w:ascii="Cambria Math" w:hAnsi="Cambria Math"/>
-          </w:rPr>
-          <m:t>=</m:t>
-        </m:r>
-        <m:f>
-          <m:fPr>
-            <m:ctrlPr>
-              <w:rPr>
-                <w:rFonts w:ascii="Cambria Math" w:hAnsi="Cambria Math"/>
-                <w:i/>
-              </w:rPr>
-            </m:ctrlPr>
-          </m:fPr>
-          <m:num>
-            <m:r>
-              <w:rPr>
-                <w:rFonts w:ascii="Cambria Math" w:hAnsi="Cambria Math"/>
-              </w:rPr>
-              <m:t>-2.1%</m:t>
-            </m:r>
-          </m:num>
-          <m:den>
-            <m:d>
-              <m:dPr>
-                <m:ctrlPr>
-                  <w:rPr>
-                    <w:rFonts w:ascii="Cambria Math" w:hAnsi="Cambria Math"/>
-                    <w:i/>
-                  </w:rPr>
-                </m:ctrlPr>
-              </m:dPr>
-              <m:e>
-                <m:f>
-                  <m:fPr>
-                    <m:ctrlPr>
-                      <w:rPr>
-                        <w:rFonts w:ascii="Cambria Math" w:hAnsi="Cambria Math"/>
-                        <w:i/>
-                      </w:rPr>
-                    </m:ctrlPr>
-                  </m:fPr>
-                  <m:num>
-                    <m:r>
-                      <w:rPr>
-                        <w:rFonts w:ascii="Cambria Math" w:hAnsi="Cambria Math"/>
-                      </w:rPr>
-                      <m:t>100</m:t>
-                    </m:r>
-                  </m:num>
-                  <m:den>
-                    <m:r>
-                      <w:rPr>
-                        <w:rFonts w:ascii="Cambria Math" w:hAnsi="Cambria Math"/>
-                      </w:rPr>
-                      <m:t>3420</m:t>
-                    </m:r>
-                  </m:den>
-                </m:f>
-              </m:e>
-            </m:d>
-          </m:den>
-        </m:f>
-        <m:r>
-          <w:rPr>
-            <w:rFonts w:ascii="Cambria Math" w:hAnsi="Cambria Math"/>
-          </w:rPr>
-          <m:t>≈-0.73</m:t>
-        </m:r>
-      </m:oMath>
-    </w:p>
-  </w:footnote>
-  <w:footnote w:id="2">
-    <w:p>
-      <w:pPr>
-        <w:pStyle w:val="FootnoteText"/>
-      </w:pPr>
-      <w:r>
-        <w:rPr>
-          <w:rStyle w:val="FootnoteReference"/>
-        </w:rPr>
-        <w:footnoteRef/>
-      </w:r>
-      <w:r>
-        <w:t xml:space="preserve"> She explicitly states that a “</w:t>
-      </w:r>
-      <w:r>
-        <w:t>practical limitation of inference in my study is the small number of clusters: with two countries and six years</w:t>
-      </w:r>
-      <w:r>
-        <w:t xml:space="preserve"> </w:t>
-      </w:r>
-      <w:r>
-        <w:t>of data, there are only 12 clusters when clustering by country</w:t>
-      </w:r>
-      <w:r>
-        <w:t>year and two clusters when clustering by country.</w:t>
-      </w:r>
-      <w:r>
-        <w:t>”</w:t>
-      </w:r>
-    </w:p>
-  </w:footnote>
-  <w:footnote w:id="3">
     <w:p>
       <w:pPr>
         <w:pStyle w:val="FootnoteText"/>
@@ -27786,6 +26929,92 @@
     </w:lvl>
   </w:abstractNum>
   <w:abstractNum w:abstractNumId="28" w15:restartNumberingAfterBreak="0">
+    <w:nsid w:val="67C81DE7"/>
+    <w:multiLevelType w:val="hybridMultilevel"/>
+    <w:tmpl w:val="9AB4988E"/>
+    <w:lvl w:ilvl="0" w:tplc="0409000F">
+      <w:start w:val="1"/>
+      <w:numFmt w:val="decimal"/>
+      <w:lvlText w:val="%1."/>
+      <w:lvlJc w:val="left"/>
+      <w:pPr>
+        <w:ind w:left="720" w:hanging="360"/>
+      </w:pPr>
+    </w:lvl>
+    <w:lvl w:ilvl="1" w:tplc="04090019" w:tentative="1">
+      <w:start w:val="1"/>
+      <w:numFmt w:val="lowerLetter"/>
+      <w:lvlText w:val="%2."/>
+      <w:lvlJc w:val="left"/>
+      <w:pPr>
+        <w:ind w:left="1440" w:hanging="360"/>
+      </w:pPr>
+    </w:lvl>
+    <w:lvl w:ilvl="2" w:tplc="0409001B" w:tentative="1">
+      <w:start w:val="1"/>
+      <w:numFmt w:val="lowerRoman"/>
+      <w:lvlText w:val="%3."/>
+      <w:lvlJc w:val="right"/>
+      <w:pPr>
+        <w:ind w:left="2160" w:hanging="180"/>
+      </w:pPr>
+    </w:lvl>
+    <w:lvl w:ilvl="3" w:tplc="0409000F" w:tentative="1">
+      <w:start w:val="1"/>
+      <w:numFmt w:val="decimal"/>
+      <w:lvlText w:val="%4."/>
+      <w:lvlJc w:val="left"/>
+      <w:pPr>
+        <w:ind w:left="2880" w:hanging="360"/>
+      </w:pPr>
+    </w:lvl>
+    <w:lvl w:ilvl="4" w:tplc="04090019" w:tentative="1">
+      <w:start w:val="1"/>
+      <w:numFmt w:val="lowerLetter"/>
+      <w:lvlText w:val="%5."/>
+      <w:lvlJc w:val="left"/>
+      <w:pPr>
+        <w:ind w:left="3600" w:hanging="360"/>
+      </w:pPr>
+    </w:lvl>
+    <w:lvl w:ilvl="5" w:tplc="0409001B" w:tentative="1">
+      <w:start w:val="1"/>
+      <w:numFmt w:val="lowerRoman"/>
+      <w:lvlText w:val="%6."/>
+      <w:lvlJc w:val="right"/>
+      <w:pPr>
+        <w:ind w:left="4320" w:hanging="180"/>
+      </w:pPr>
+    </w:lvl>
+    <w:lvl w:ilvl="6" w:tplc="0409000F" w:tentative="1">
+      <w:start w:val="1"/>
+      <w:numFmt w:val="decimal"/>
+      <w:lvlText w:val="%7."/>
+      <w:lvlJc w:val="left"/>
+      <w:pPr>
+        <w:ind w:left="5040" w:hanging="360"/>
+      </w:pPr>
+    </w:lvl>
+    <w:lvl w:ilvl="7" w:tplc="04090019" w:tentative="1">
+      <w:start w:val="1"/>
+      <w:numFmt w:val="lowerLetter"/>
+      <w:lvlText w:val="%8."/>
+      <w:lvlJc w:val="left"/>
+      <w:pPr>
+        <w:ind w:left="5760" w:hanging="360"/>
+      </w:pPr>
+    </w:lvl>
+    <w:lvl w:ilvl="8" w:tplc="0409001B" w:tentative="1">
+      <w:start w:val="1"/>
+      <w:numFmt w:val="lowerRoman"/>
+      <w:lvlText w:val="%9."/>
+      <w:lvlJc w:val="right"/>
+      <w:pPr>
+        <w:ind w:left="6480" w:hanging="180"/>
+      </w:pPr>
+    </w:lvl>
+  </w:abstractNum>
+  <w:abstractNum w:abstractNumId="29" w15:restartNumberingAfterBreak="0">
     <w:nsid w:val="69151738"/>
     <w:multiLevelType w:val="hybridMultilevel"/>
     <w:tmpl w:val="56D8262C"/>
@@ -27875,7 +27104,7 @@
       </w:pPr>
     </w:lvl>
   </w:abstractNum>
-  <w:abstractNum w:abstractNumId="29" w15:restartNumberingAfterBreak="0">
+  <w:abstractNum w:abstractNumId="30" w15:restartNumberingAfterBreak="0">
     <w:nsid w:val="6BB41CE6"/>
     <w:multiLevelType w:val="hybridMultilevel"/>
     <w:tmpl w:val="93EEB9BE"/>
@@ -27961,7 +27190,7 @@
       </w:pPr>
     </w:lvl>
   </w:abstractNum>
-  <w:abstractNum w:abstractNumId="30" w15:restartNumberingAfterBreak="0">
+  <w:abstractNum w:abstractNumId="31" w15:restartNumberingAfterBreak="0">
     <w:nsid w:val="6D7566FC"/>
     <w:multiLevelType w:val="hybridMultilevel"/>
     <w:tmpl w:val="9A86817C"/>
@@ -28074,7 +27303,7 @@
       </w:rPr>
     </w:lvl>
   </w:abstractNum>
-  <w:abstractNum w:abstractNumId="31" w15:restartNumberingAfterBreak="0">
+  <w:abstractNum w:abstractNumId="32" w15:restartNumberingAfterBreak="0">
     <w:nsid w:val="7A056C9A"/>
     <w:multiLevelType w:val="multilevel"/>
     <w:tmpl w:val="A46A1416"/>
@@ -28192,7 +27421,7 @@
       </w:rPr>
     </w:lvl>
   </w:abstractNum>
-  <w:abstractNum w:abstractNumId="32" w15:restartNumberingAfterBreak="0">
+  <w:abstractNum w:abstractNumId="33" w15:restartNumberingAfterBreak="0">
     <w:nsid w:val="7BD72D95"/>
     <w:multiLevelType w:val="multilevel"/>
     <w:tmpl w:val="F58EDA7E"/>
@@ -28337,7 +27566,7 @@
       </w:rPr>
     </w:lvl>
   </w:abstractNum>
-  <w:abstractNum w:abstractNumId="33" w15:restartNumberingAfterBreak="0">
+  <w:abstractNum w:abstractNumId="34" w15:restartNumberingAfterBreak="0">
     <w:nsid w:val="7D853127"/>
     <w:multiLevelType w:val="multilevel"/>
     <w:tmpl w:val="FFFFFFFF"/>
@@ -28486,7 +27715,7 @@
       </w:rPr>
     </w:lvl>
   </w:abstractNum>
-  <w:abstractNum w:abstractNumId="34" w15:restartNumberingAfterBreak="0">
+  <w:abstractNum w:abstractNumId="35" w15:restartNumberingAfterBreak="0">
     <w:nsid w:val="7EB4188E"/>
     <w:multiLevelType w:val="multilevel"/>
     <w:tmpl w:val="8C867178"/>
@@ -28635,7 +27864,7 @@
       </w:rPr>
     </w:lvl>
   </w:abstractNum>
-  <w:abstractNum w:abstractNumId="35" w15:restartNumberingAfterBreak="0">
+  <w:abstractNum w:abstractNumId="36" w15:restartNumberingAfterBreak="0">
     <w:nsid w:val="7EF25E06"/>
     <w:multiLevelType w:val="multilevel"/>
     <w:tmpl w:val="AFF84DC6"/>
@@ -28809,19 +28038,19 @@
     <w:abstractNumId w:val="21"/>
   </w:num>
   <w:num w:numId="9">
-    <w:abstractNumId w:val="35"/>
+    <w:abstractNumId w:val="36"/>
   </w:num>
   <w:num w:numId="10">
     <w:abstractNumId w:val="24"/>
   </w:num>
   <w:num w:numId="11">
-    <w:abstractNumId w:val="31"/>
+    <w:abstractNumId w:val="32"/>
   </w:num>
   <w:num w:numId="12">
     <w:abstractNumId w:val="2"/>
   </w:num>
   <w:num w:numId="13">
-    <w:abstractNumId w:val="30"/>
+    <w:abstractNumId w:val="31"/>
   </w:num>
   <w:num w:numId="14">
     <w:abstractNumId w:val="7"/>
@@ -28830,7 +28059,7 @@
     <w:abstractNumId w:val="17"/>
   </w:num>
   <w:num w:numId="16">
-    <w:abstractNumId w:val="29"/>
+    <w:abstractNumId w:val="30"/>
   </w:num>
   <w:num w:numId="17">
     <w:abstractNumId w:val="10"/>
@@ -28839,10 +28068,10 @@
     <w:abstractNumId w:val="6"/>
   </w:num>
   <w:num w:numId="19">
-    <w:abstractNumId w:val="28"/>
+    <w:abstractNumId w:val="29"/>
   </w:num>
   <w:num w:numId="20">
-    <w:abstractNumId w:val="33"/>
+    <w:abstractNumId w:val="34"/>
   </w:num>
   <w:num w:numId="21">
     <w:abstractNumId w:val="13"/>
@@ -28863,7 +28092,7 @@
     <w:abstractNumId w:val="8"/>
   </w:num>
   <w:num w:numId="27">
-    <w:abstractNumId w:val="32"/>
+    <w:abstractNumId w:val="33"/>
   </w:num>
   <w:num w:numId="28">
     <w:abstractNumId w:val="23"/>
@@ -28890,7 +28119,10 @@
     <w:abstractNumId w:val="9"/>
   </w:num>
   <w:num w:numId="36">
-    <w:abstractNumId w:val="34"/>
+    <w:abstractNumId w:val="35"/>
+  </w:num>
+  <w:num w:numId="37">
+    <w:abstractNumId w:val="28"/>
   </w:num>
 </w:numbering>
 </file>
@@ -30280,7 +29512,7 @@
 </file>
 
 <file path=customXml/itemProps1.xml><?xml version="1.0" encoding="utf-8"?>
-<ds:datastoreItem xmlns:ds="http://schemas.openxmlformats.org/officeDocument/2006/customXml" ds:itemID="{6C3229DD-3F43-4E71-AA35-3BD78306C963}">
+<ds:datastoreItem xmlns:ds="http://schemas.openxmlformats.org/officeDocument/2006/customXml" ds:itemID="{7B4D1AB1-7D49-46B9-9C97-E09B90F55D4A}">
   <ds:schemaRefs>
     <ds:schemaRef ds:uri="http://schemas.openxmlformats.org/officeDocument/2006/bibliography"/>
   </ds:schemaRefs>

</xml_diff>